<commit_message>
feat(model): publish synthetic classifier and calibration
Train exclusively from the accepted synthetic benchmark, bind calibration to the exact public model hash, integrate the synthetic consistency signal, and reconcile tests, documentation, security evidence, and release records.
</commit_message>
<xml_diff>
--- a/docs/NewsLens_AI_Setup_and_Run_Guide.docx
+++ b/docs/NewsLens_AI_Setup_and_Run_Guide.docx
@@ -4,606 +4,59 @@
   <w:body>
     <w:p>
       <w:pPr>
-        <w:spacing w:after="160"/>
+        <w:pStyle w:val="Subtitle"/>
+        <w:jc w:val="center"/>
+      </w:pPr>
+      <w:r>
+        <w:t>NEWSLENS AI</w:t>
+      </w:r>
+    </w:p>
+    <w:p/>
+    <w:p>
+      <w:pPr>
+        <w:pStyle w:val="Title"/>
+        <w:jc w:val="center"/>
+      </w:pPr>
+      <w:r>
+        <w:t>NewsLens AI Setup and Run Guide</w:t>
+      </w:r>
+    </w:p>
+    <w:p>
+      <w:pPr>
         <w:jc w:val="center"/>
       </w:pPr>
       <w:r>
         <w:rPr>
-          <w:rFonts w:ascii="Calibri" w:hAnsi="Calibri"/>
-          <w:b/>
-          <w:color w:val="2A241F"/>
-          <w:sz w:val="24"/>
+          <w:color w:val="496454"/>
+          <w:sz w:val="28"/>
         </w:rPr>
-        <w:t>NEWSLENS AI</w:t>
+        <w:t>Python 3.12 local setup, validation and Streamlit deployment</w:t>
       </w:r>
     </w:p>
+    <w:p/>
     <w:p>
       <w:pPr>
-        <w:spacing w:before="80" w:after="80"/>
-        <w:ind w:left="3456" w:right="3456"/>
-        <w:jc w:val="center"/>
-        <w:pBdr>
-          <w:top w:val="single" w:sz="8" w:space="6" w:color="9AA9BC"/>
-          <w:left w:val="single" w:sz="8" w:space="6" w:color="9AA9BC"/>
-          <w:bottom w:val="single" w:sz="8" w:space="6" w:color="9AA9BC"/>
-          <w:right w:val="single" w:sz="8" w:space="6" w:color="9AA9BC"/>
-        </w:pBdr>
-        <w:shd w:fill="EAE4D8"/>
-      </w:pPr>
-      <w:r>
-        <w:rPr>
-          <w:rFonts w:ascii="Calibri" w:hAnsi="Calibri"/>
-          <w:b/>
-          <w:color w:val="6F685F"/>
-          <w:sz w:val="16"/>
-        </w:rPr>
-        <w:t>PUBLIC DOCUMENTATION</w:t>
-      </w:r>
-    </w:p>
-    <w:p>
-      <w:pPr>
-        <w:spacing w:after="0"/>
-      </w:pPr>
-    </w:p>
-    <w:p>
-      <w:pPr>
-        <w:spacing w:after="200"/>
         <w:jc w:val="center"/>
       </w:pPr>
       <w:r>
         <w:rPr>
-          <w:rFonts w:ascii="Calibri" w:hAnsi="Calibri"/>
-          <w:b/>
-          <w:color w:val="496454"/>
-          <w:sz w:val="22"/>
+          <w:i/>
+          <w:color w:val="77736C"/>
         </w:rPr>
-        <w:t>PRACTICAL GUIDE</w:t>
+        <w:t>All classifier training articles and entities are synthetic. This report documents a bounded ledger-consistency demonstration, not unrestricted real-world fact verification.</w:t>
       </w:r>
     </w:p>
+    <w:p/>
     <w:p>
       <w:pPr>
-        <w:spacing w:after="200"/>
         <w:jc w:val="center"/>
       </w:pPr>
       <w:r>
-        <w:rPr>
-          <w:rFonts w:ascii="Calibri" w:hAnsi="Calibri"/>
-          <w:b/>
-          <w:color w:val="2A241F"/>
-          <w:sz w:val="48"/>
-        </w:rPr>
-        <w:t>NewsLens AI</w:t>
+        <w:t>Prepared by</w:t>
         <w:br/>
-        <w:t>Setup and Run Guide</w:t>
-      </w:r>
-    </w:p>
-    <w:p>
-      <w:pPr>
-        <w:spacing w:after="320"/>
-        <w:jc w:val="center"/>
-      </w:pPr>
-      <w:r>
-        <w:rPr>
-          <w:rFonts w:ascii="Calibri" w:hAnsi="Calibri"/>
-          <w:i/>
-          <w:color w:val="6D5947"/>
-          <w:sz w:val="23"/>
-        </w:rPr>
-        <w:t>Beginner-friendly installation, first run, retraining, testing and troubleshooting</w:t>
-      </w:r>
-    </w:p>
-    <w:tbl>
-      <w:tblPr>
-        <w:tblStyle w:val="TableGrid"/>
-        <w:tblW w:type="dxa" w:w="9360"/>
-        <w:jc w:val="left"/>
-        <w:tblLayout w:type="fixed"/>
-        <w:tblLook w:firstColumn="1" w:firstRow="1" w:lastColumn="0" w:lastRow="0" w:noHBand="0" w:noVBand="1" w:val="04A0"/>
-        <w:tblInd w:type="dxa" w:w="120"/>
-        <w:tblCellMar>
-          <w:top w:w="80" w:type="dxa"/>
-          <w:left w:w="120" w:type="dxa"/>
-          <w:bottom w:w="80" w:type="dxa"/>
-          <w:right w:w="120" w:type="dxa"/>
-        </w:tblCellMar>
-      </w:tblPr>
-      <w:tblGrid>
-        <w:gridCol w:w="3240"/>
-        <w:gridCol w:w="6120"/>
-      </w:tblGrid>
-      <w:tr>
-        <w:trPr>
-          <w:tblHeader w:val="true"/>
-        </w:trPr>
-        <w:tc>
-          <w:tcPr>
-            <w:tcW w:type="dxa" w:w="3240"/>
-            <w:vAlign w:val="center"/>
-            <w:shd w:fill="F3F0E8"/>
-          </w:tcPr>
-          <w:p>
-            <w:pPr>
-              <w:spacing w:before="0" w:after="0" w:line="252" w:lineRule="auto"/>
-              <w:jc w:val="center"/>
-            </w:pPr>
-            <w:r>
-              <w:rPr>
-                <w:rFonts w:ascii="Calibri" w:hAnsi="Calibri"/>
-                <w:b/>
-                <w:sz w:val="16"/>
-              </w:rPr>
-            </w:r>
-            <w:r>
-              <w:rPr>
-                <w:rFonts w:ascii="Calibri" w:hAnsi="Calibri"/>
-                <w:b/>
-                <w:color w:val="2A241F"/>
-                <w:sz w:val="16"/>
-              </w:rPr>
-              <w:t>Field</w:t>
-            </w:r>
-          </w:p>
-        </w:tc>
-        <w:tc>
-          <w:tcPr>
-            <w:tcW w:type="dxa" w:w="6120"/>
-            <w:vAlign w:val="center"/>
-            <w:shd w:fill="F3F0E8"/>
-          </w:tcPr>
-          <w:p>
-            <w:pPr>
-              <w:spacing w:before="0" w:after="0" w:line="252" w:lineRule="auto"/>
-              <w:jc w:val="center"/>
-            </w:pPr>
-            <w:r>
-              <w:rPr>
-                <w:rFonts w:ascii="Calibri" w:hAnsi="Calibri"/>
-                <w:b/>
-                <w:sz w:val="16"/>
-              </w:rPr>
-            </w:r>
-            <w:r>
-              <w:rPr>
-                <w:rFonts w:ascii="Calibri" w:hAnsi="Calibri"/>
-                <w:b/>
-                <w:color w:val="2A241F"/>
-                <w:sz w:val="16"/>
-              </w:rPr>
-              <w:t>Value</w:t>
-            </w:r>
-          </w:p>
-        </w:tc>
-      </w:tr>
-      <w:tr>
-        <w:tc>
-          <w:tcPr>
-            <w:tcW w:type="dxa" w:w="3240"/>
-            <w:vAlign w:val="center"/>
-          </w:tcPr>
-          <w:p>
-            <w:pPr>
-              <w:spacing w:before="0" w:after="0" w:line="252" w:lineRule="auto"/>
-              <w:jc w:val="left"/>
-            </w:pPr>
-            <w:r>
-              <w:rPr>
-                <w:rFonts w:ascii="Calibri" w:hAnsi="Calibri"/>
-                <w:sz w:val="16"/>
-              </w:rPr>
-            </w:r>
-            <w:r>
-              <w:rPr>
-                <w:rFonts w:ascii="Calibri" w:hAnsi="Calibri"/>
-                <w:b w:val="0"/>
-                <w:color w:val="1A1917"/>
-                <w:sz w:val="16"/>
-              </w:rPr>
-              <w:t>Product</w:t>
-            </w:r>
-          </w:p>
-        </w:tc>
-        <w:tc>
-          <w:tcPr>
-            <w:tcW w:type="dxa" w:w="6120"/>
-            <w:vAlign w:val="center"/>
-          </w:tcPr>
-          <w:p>
-            <w:pPr>
-              <w:spacing w:before="0" w:after="0" w:line="252" w:lineRule="auto"/>
-              <w:jc w:val="left"/>
-            </w:pPr>
-            <w:r>
-              <w:rPr>
-                <w:rFonts w:ascii="Calibri" w:hAnsi="Calibri"/>
-                <w:sz w:val="16"/>
-              </w:rPr>
-            </w:r>
-            <w:r>
-              <w:rPr>
-                <w:rFonts w:ascii="Calibri" w:hAnsi="Calibri"/>
-                <w:b w:val="0"/>
-                <w:color w:val="1A1917"/>
-                <w:sz w:val="16"/>
-              </w:rPr>
-              <w:t>NewsLens AI</w:t>
-            </w:r>
-          </w:p>
-        </w:tc>
-      </w:tr>
-      <w:tr>
-        <w:tc>
-          <w:tcPr>
-            <w:tcW w:type="dxa" w:w="3240"/>
-            <w:vAlign w:val="center"/>
-            <w:shd w:fill="FAFCFF"/>
-          </w:tcPr>
-          <w:p>
-            <w:pPr>
-              <w:spacing w:before="0" w:after="0" w:line="252" w:lineRule="auto"/>
-              <w:jc w:val="left"/>
-            </w:pPr>
-            <w:r>
-              <w:rPr>
-                <w:rFonts w:ascii="Calibri" w:hAnsi="Calibri"/>
-                <w:sz w:val="16"/>
-              </w:rPr>
-            </w:r>
-            <w:r>
-              <w:rPr>
-                <w:rFonts w:ascii="Calibri" w:hAnsi="Calibri"/>
-                <w:b w:val="0"/>
-                <w:color w:val="1A1917"/>
-                <w:sz w:val="16"/>
-              </w:rPr>
-              <w:t>Document status</w:t>
-            </w:r>
-          </w:p>
-        </w:tc>
-        <w:tc>
-          <w:tcPr>
-            <w:tcW w:type="dxa" w:w="6120"/>
-            <w:vAlign w:val="center"/>
-            <w:shd w:fill="FAFCFF"/>
-          </w:tcPr>
-          <w:p>
-            <w:pPr>
-              <w:spacing w:before="0" w:after="0"/>
-            </w:pPr>
-            <w:r>
-              <w:rPr>
-                <w:rFonts w:ascii="Calibri" w:hAnsi="Calibri"/>
-                <w:sz w:val="16"/>
-              </w:rPr>
-              <w:t>Public GitHub repository active; Streamlit and Vercel blocked pending a legally redistributable public model</w:t>
-            </w:r>
-          </w:p>
-        </w:tc>
-      </w:tr>
-      <w:tr>
-        <w:tc>
-          <w:tcPr>
-            <w:tcW w:type="dxa" w:w="3240"/>
-            <w:vAlign w:val="center"/>
-          </w:tcPr>
-          <w:p>
-            <w:pPr>
-              <w:spacing w:before="0" w:after="0" w:line="252" w:lineRule="auto"/>
-              <w:jc w:val="left"/>
-            </w:pPr>
-            <w:r>
-              <w:rPr>
-                <w:rFonts w:ascii="Calibri" w:hAnsi="Calibri"/>
-                <w:sz w:val="16"/>
-              </w:rPr>
-            </w:r>
-            <w:r>
-              <w:rPr>
-                <w:rFonts w:ascii="Calibri" w:hAnsi="Calibri"/>
-                <w:b w:val="0"/>
-                <w:color w:val="1A1917"/>
-                <w:sz w:val="16"/>
-              </w:rPr>
-              <w:t>Author and developer</w:t>
-            </w:r>
-          </w:p>
-        </w:tc>
-        <w:tc>
-          <w:tcPr>
-            <w:tcW w:type="dxa" w:w="6120"/>
-            <w:vAlign w:val="center"/>
-          </w:tcPr>
-          <w:p>
-            <w:pPr>
-              <w:spacing w:before="0" w:after="0"/>
-            </w:pPr>
-            <w:r>
-              <w:rPr>
-                <w:rFonts w:ascii="Calibri" w:hAnsi="Calibri"/>
-                <w:sz w:val="16"/>
-              </w:rPr>
-              <w:t>Deven Gaikwad</w:t>
-            </w:r>
-          </w:p>
-        </w:tc>
-      </w:tr>
-      <w:tr>
-        <w:tc>
-          <w:tcPr>
-            <w:tcW w:type="dxa" w:w="3240"/>
-            <w:vAlign w:val="center"/>
-            <w:shd w:fill="FAFCFF"/>
-          </w:tcPr>
-          <w:p>
-            <w:pPr>
-              <w:spacing w:before="0" w:after="0" w:line="252" w:lineRule="auto"/>
-              <w:jc w:val="left"/>
-            </w:pPr>
-            <w:r>
-              <w:rPr>
-                <w:rFonts w:ascii="Calibri" w:hAnsi="Calibri"/>
-                <w:sz w:val="16"/>
-              </w:rPr>
-            </w:r>
-            <w:r>
-              <w:rPr>
-                <w:rFonts w:ascii="Calibri" w:hAnsi="Calibri"/>
-                <w:b w:val="0"/>
-                <w:color w:val="1A1917"/>
-                <w:sz w:val="16"/>
-              </w:rPr>
-              <w:t>Copyright</w:t>
-            </w:r>
-          </w:p>
-        </w:tc>
-        <w:tc>
-          <w:tcPr>
-            <w:tcW w:type="dxa" w:w="6120"/>
-            <w:vAlign w:val="center"/>
-            <w:shd w:fill="FAFCFF"/>
-          </w:tcPr>
-          <w:p>
-            <w:pPr>
-              <w:spacing w:before="0" w:after="0"/>
-            </w:pPr>
-            <w:r>
-              <w:rPr>
-                <w:rFonts w:ascii="Calibri" w:hAnsi="Calibri"/>
-                <w:sz w:val="16"/>
-              </w:rPr>
-              <w:t>© 2026 Deven Gaikwad. All rights reserved.</w:t>
-            </w:r>
-          </w:p>
-        </w:tc>
-      </w:tr>
-      <w:tr>
-        <w:tc>
-          <w:tcPr>
-            <w:tcW w:type="dxa" w:w="3240"/>
-            <w:vAlign w:val="center"/>
-          </w:tcPr>
-          <w:p>
-            <w:pPr>
-              <w:spacing w:before="0" w:after="0" w:line="252" w:lineRule="auto"/>
-              <w:jc w:val="left"/>
-            </w:pPr>
-            <w:r>
-              <w:rPr>
-                <w:rFonts w:ascii="Calibri" w:hAnsi="Calibri"/>
-                <w:sz w:val="16"/>
-              </w:rPr>
-            </w:r>
-            <w:r>
-              <w:rPr>
-                <w:rFonts w:ascii="Calibri" w:hAnsi="Calibri"/>
-                <w:b w:val="0"/>
-                <w:color w:val="1A1917"/>
-                <w:sz w:val="16"/>
-              </w:rPr>
-              <w:t>Runtime</w:t>
-            </w:r>
-          </w:p>
-        </w:tc>
-        <w:tc>
-          <w:tcPr>
-            <w:tcW w:type="dxa" w:w="6120"/>
-            <w:vAlign w:val="center"/>
-          </w:tcPr>
-          <w:p>
-            <w:pPr>
-              <w:spacing w:before="0" w:after="0" w:line="252" w:lineRule="auto"/>
-              <w:jc w:val="left"/>
-            </w:pPr>
-            <w:r>
-              <w:rPr>
-                <w:rFonts w:ascii="Calibri" w:hAnsi="Calibri"/>
-                <w:sz w:val="16"/>
-              </w:rPr>
-            </w:r>
-            <w:r>
-              <w:rPr>
-                <w:rFonts w:ascii="Calibri" w:hAnsi="Calibri"/>
-                <w:b w:val="0"/>
-                <w:color w:val="1A1917"/>
-                <w:sz w:val="16"/>
-              </w:rPr>
-              <w:t>Streamlit · Python 3.12 · app.py</w:t>
-            </w:r>
-          </w:p>
-        </w:tc>
-      </w:tr>
-      <w:tr>
-        <w:tc>
-          <w:tcPr>
-            <w:tcW w:type="dxa" w:w="3240"/>
-            <w:vAlign w:val="center"/>
-            <w:shd w:fill="FAFCFF"/>
-          </w:tcPr>
-          <w:p>
-            <w:pPr>
-              <w:spacing w:before="0" w:after="0" w:line="252" w:lineRule="auto"/>
-              <w:jc w:val="left"/>
-            </w:pPr>
-            <w:r>
-              <w:rPr>
-                <w:rFonts w:ascii="Calibri" w:hAnsi="Calibri"/>
-                <w:sz w:val="16"/>
-              </w:rPr>
-            </w:r>
-            <w:r>
-              <w:rPr>
-                <w:rFonts w:ascii="Calibri" w:hAnsi="Calibri"/>
-                <w:b w:val="0"/>
-                <w:color w:val="1A1917"/>
-                <w:sz w:val="16"/>
-              </w:rPr>
-              <w:t>Model boundary</w:t>
-            </w:r>
-          </w:p>
-        </w:tc>
-        <w:tc>
-          <w:tcPr>
-            <w:tcW w:type="dxa" w:w="6120"/>
-            <w:vAlign w:val="center"/>
-            <w:shd w:fill="FAFCFF"/>
-          </w:tcPr>
-          <w:p>
-            <w:pPr>
-              <w:spacing w:before="0" w:after="0" w:line="252" w:lineRule="auto"/>
-              <w:jc w:val="left"/>
-            </w:pPr>
-            <w:r>
-              <w:rPr>
-                <w:rFonts w:ascii="Calibri" w:hAnsi="Calibri"/>
-                <w:sz w:val="16"/>
-              </w:rPr>
-            </w:r>
-            <w:r>
-              <w:rPr>
-                <w:rFonts w:ascii="Calibri" w:hAnsi="Calibri"/>
-                <w:b w:val="0"/>
-                <w:color w:val="1A1917"/>
-                <w:sz w:val="16"/>
-              </w:rPr>
-              <w:t>Linguistic credibility-risk estimate; not a verified fact-check</w:t>
-            </w:r>
-          </w:p>
-        </w:tc>
-      </w:tr>
-      <w:tr>
-        <w:tc>
-          <w:tcPr>
-            <w:tcW w:type="dxa" w:w="3240"/>
-            <w:vAlign w:val="center"/>
-          </w:tcPr>
-          <w:p>
-            <w:pPr>
-              <w:spacing w:before="0" w:after="0" w:line="252" w:lineRule="auto"/>
-              <w:jc w:val="left"/>
-            </w:pPr>
-            <w:r>
-              <w:rPr>
-                <w:rFonts w:ascii="Calibri" w:hAnsi="Calibri"/>
-                <w:sz w:val="16"/>
-              </w:rPr>
-            </w:r>
-            <w:r>
-              <w:rPr>
-                <w:rFonts w:ascii="Calibri" w:hAnsi="Calibri"/>
-                <w:b w:val="0"/>
-                <w:color w:val="1A1917"/>
-                <w:sz w:val="16"/>
-              </w:rPr>
-              <w:t>Repository</w:t>
-            </w:r>
-          </w:p>
-        </w:tc>
-        <w:tc>
-          <w:tcPr>
-            <w:tcW w:type="dxa" w:w="6120"/>
-            <w:vAlign w:val="center"/>
-          </w:tcPr>
-          <w:p>
-            <w:pPr>
-              <w:spacing w:before="0" w:after="0"/>
-            </w:pPr>
-            <w:r>
-              <w:rPr>
-                <w:rFonts w:ascii="Calibri" w:hAnsi="Calibri"/>
-                <w:sz w:val="16"/>
-              </w:rPr>
-              <w:t>Canonical public repository: https://github.com/DevenGaikwad/NewsLens-AI (active)</w:t>
-            </w:r>
-          </w:p>
-        </w:tc>
-      </w:tr>
-      <w:tr>
-        <w:tc>
-          <w:tcPr>
-            <w:tcW w:type="dxa" w:w="3240"/>
-            <w:vAlign w:val="center"/>
-            <w:shd w:fill="FAFCFF"/>
-          </w:tcPr>
-          <w:p>
-            <w:pPr>
-              <w:spacing w:before="0" w:after="0" w:line="252" w:lineRule="auto"/>
-              <w:jc w:val="left"/>
-            </w:pPr>
-            <w:r>
-              <w:rPr>
-                <w:rFonts w:ascii="Calibri" w:hAnsi="Calibri"/>
-                <w:sz w:val="16"/>
-              </w:rPr>
-            </w:r>
-            <w:r>
-              <w:rPr>
-                <w:rFonts w:ascii="Calibri" w:hAnsi="Calibri"/>
-                <w:b w:val="0"/>
-                <w:color w:val="1A1917"/>
-                <w:sz w:val="16"/>
-              </w:rPr>
-              <w:t>Document updated</w:t>
-            </w:r>
-          </w:p>
-        </w:tc>
-        <w:tc>
-          <w:tcPr>
-            <w:tcW w:type="dxa" w:w="6120"/>
-            <w:vAlign w:val="center"/>
-            <w:shd w:fill="FAFCFF"/>
-          </w:tcPr>
-          <w:p>
-            <w:pPr>
-              <w:spacing w:before="0" w:after="0"/>
-            </w:pPr>
-            <w:r>
-              <w:rPr>
-                <w:rFonts w:ascii="Calibri" w:hAnsi="Calibri"/>
-                <w:sz w:val="16"/>
-              </w:rPr>
-              <w:t>13 September 2026</w:t>
-            </w:r>
-          </w:p>
-        </w:tc>
-      </w:tr>
-    </w:tbl>
-    <w:p>
-      <w:pPr>
-        <w:spacing w:after="20"/>
-      </w:pPr>
-    </w:p>
-    <w:p>
-      <w:pPr>
-        <w:spacing w:before="200"/>
-        <w:jc w:val="center"/>
-      </w:pPr>
-      <w:r>
-        <w:rPr>
-          <w:rFonts w:ascii="Calibri" w:hAnsi="Calibri"/>
-          <w:b/>
-          <w:color w:val="6F685F"/>
-          <w:sz w:val="19"/>
-        </w:rPr>
-        <w:t>CODE · METHODS · EVIDENCE · RESPONSIBLE USE</w:t>
+        <w:t>Deven Sachin Gaikwad</w:t>
+        <w:br/>
+        <w:t>26 September 2026</w:t>
       </w:r>
     </w:p>
     <w:p>
@@ -614,90 +67,51 @@
     <w:p>
       <w:pPr>
         <w:pStyle w:val="Heading1"/>
-        <w:keepNext/>
       </w:pPr>
       <w:r>
-        <w:t>Table of Contents</w:t>
+        <w:t>Document control</w:t>
       </w:r>
     </w:p>
     <w:tbl>
       <w:tblPr>
         <w:tblStyle w:val="TableGrid"/>
-        <w:tblW w:type="dxa" w:w="9360"/>
-        <w:jc w:val="left"/>
-        <w:tblLayout w:type="fixed"/>
+        <w:tblW w:type="auto" w:w="0"/>
         <w:tblLook w:firstColumn="1" w:firstRow="1" w:lastColumn="0" w:lastRow="0" w:noHBand="0" w:noVBand="1" w:val="04A0"/>
-        <w:tblInd w:type="dxa" w:w="120"/>
-        <w:tblCellMar>
-          <w:top w:w="80" w:type="dxa"/>
-          <w:left w:w="120" w:type="dxa"/>
-          <w:bottom w:w="80" w:type="dxa"/>
-          <w:right w:w="120" w:type="dxa"/>
-        </w:tblCellMar>
       </w:tblPr>
       <w:tblGrid>
-        <w:gridCol w:w="8208"/>
-        <w:gridCol w:w="1152"/>
+        <w:gridCol w:w="5040"/>
+        <w:gridCol w:w="5040"/>
       </w:tblGrid>
       <w:tr>
-        <w:trPr>
-          <w:tblHeader w:val="true"/>
-        </w:trPr>
         <w:tc>
           <w:tcPr>
-            <w:tcW w:type="dxa" w:w="8208"/>
-            <w:vAlign w:val="center"/>
-            <w:shd w:fill="E8EEE8"/>
+            <w:tcW w:type="dxa" w:w="5040"/>
+            <w:shd w:fill="EAE4D8"/>
           </w:tcPr>
           <w:p>
-            <w:pPr>
-              <w:spacing w:before="0" w:after="0" w:line="252" w:lineRule="auto"/>
-              <w:jc w:val="center"/>
-            </w:pPr>
             <w:r>
               <w:rPr>
                 <w:rFonts w:ascii="Calibri" w:hAnsi="Calibri"/>
                 <w:b/>
-                <w:sz w:val="16"/>
+                <w:sz w:val="17"/>
               </w:rPr>
-            </w:r>
-            <w:r>
-              <w:rPr>
-                <w:rFonts w:ascii="Calibri" w:hAnsi="Calibri"/>
-                <w:b/>
-                <w:color w:val="2A241F"/>
-                <w:sz w:val="16"/>
-              </w:rPr>
-              <w:t>Section</w:t>
+              <w:t>Field</w:t>
             </w:r>
           </w:p>
         </w:tc>
         <w:tc>
           <w:tcPr>
-            <w:tcW w:type="dxa" w:w="1152"/>
-            <w:vAlign w:val="center"/>
-            <w:shd w:fill="E8EEE8"/>
+            <w:tcW w:type="dxa" w:w="5040"/>
+            <w:shd w:fill="EAE4D8"/>
           </w:tcPr>
           <w:p>
-            <w:pPr>
-              <w:spacing w:before="0" w:after="0" w:line="252" w:lineRule="auto"/>
-              <w:jc w:val="center"/>
-            </w:pPr>
             <w:r>
               <w:rPr>
                 <w:rFonts w:ascii="Calibri" w:hAnsi="Calibri"/>
                 <w:b/>
-                <w:sz w:val="16"/>
+                <w:sz w:val="17"/>
               </w:rPr>
-            </w:r>
-            <w:r>
-              <w:rPr>
-                <w:rFonts w:ascii="Calibri" w:hAnsi="Calibri"/>
-                <w:b/>
-                <w:color w:val="2A241F"/>
-                <w:sz w:val="16"/>
-              </w:rPr>
-              <w:t>Rendered page</w:t>
+              <w:t>Value</w:t>
             </w:r>
           </w:p>
         </w:tc>
@@ -705,46 +119,29 @@
       <w:tr>
         <w:tc>
           <w:tcPr>
-            <w:tcW w:type="dxa" w:w="8208"/>
-            <w:vAlign w:val="center"/>
+            <w:tcW w:type="dxa" w:w="5040"/>
           </w:tcPr>
           <w:p>
-            <w:pPr>
-              <w:spacing w:before="0" w:after="0" w:line="252" w:lineRule="auto"/>
-              <w:jc w:val="left"/>
-            </w:pPr>
             <w:r>
               <w:rPr>
                 <w:rFonts w:ascii="Calibri" w:hAnsi="Calibri"/>
-                <w:sz w:val="16"/>
+                <w:sz w:val="17"/>
               </w:rPr>
-            </w:r>
-            <w:r>
-              <w:rPr>
-                <w:rFonts w:ascii="Calibri" w:hAnsi="Calibri"/>
-                <w:b w:val="0"/>
-                <w:color w:val="1A1917"/>
-                <w:sz w:val="16"/>
-              </w:rPr>
-              <w:t>1-3. Prerequisites, Python and VS Code</w:t>
+              <w:t>Project</w:t>
             </w:r>
           </w:p>
         </w:tc>
         <w:tc>
           <w:tcPr>
-            <w:tcW w:type="dxa" w:w="1152"/>
-            <w:vAlign w:val="center"/>
+            <w:tcW w:type="dxa" w:w="5040"/>
           </w:tcPr>
           <w:p>
-            <w:pPr>
-              <w:spacing w:before="0" w:after="0"/>
-            </w:pPr>
             <w:r>
               <w:rPr>
                 <w:rFonts w:ascii="Calibri" w:hAnsi="Calibri"/>
-                <w:sz w:val="16"/>
+                <w:sz w:val="17"/>
               </w:rPr>
-              <w:t>3</w:t>
+              <w:t>NewsLens AI</w:t>
             </w:r>
           </w:p>
         </w:tc>
@@ -752,48 +149,29 @@
       <w:tr>
         <w:tc>
           <w:tcPr>
-            <w:tcW w:type="dxa" w:w="8208"/>
-            <w:vAlign w:val="center"/>
-            <w:shd w:fill="FAFCFF"/>
+            <w:tcW w:type="dxa" w:w="5040"/>
           </w:tcPr>
           <w:p>
-            <w:pPr>
-              <w:spacing w:before="0" w:after="0" w:line="252" w:lineRule="auto"/>
-              <w:jc w:val="left"/>
-            </w:pPr>
             <w:r>
               <w:rPr>
                 <w:rFonts w:ascii="Calibri" w:hAnsi="Calibri"/>
-                <w:sz w:val="16"/>
+                <w:sz w:val="17"/>
               </w:rPr>
-            </w:r>
-            <w:r>
-              <w:rPr>
-                <w:rFonts w:ascii="Calibri" w:hAnsi="Calibri"/>
-                <w:b w:val="0"/>
-                <w:color w:val="1A1917"/>
-                <w:sz w:val="16"/>
-              </w:rPr>
-              <w:t>4-6. Extract, virtual environment and interpreter</w:t>
+              <w:t>Phase</w:t>
             </w:r>
           </w:p>
         </w:tc>
         <w:tc>
           <w:tcPr>
-            <w:tcW w:type="dxa" w:w="1152"/>
-            <w:vAlign w:val="center"/>
-            <w:shd w:fill="FAFCFF"/>
+            <w:tcW w:type="dxa" w:w="5040"/>
           </w:tcPr>
           <w:p>
-            <w:pPr>
-              <w:spacing w:before="0" w:after="0"/>
-            </w:pPr>
             <w:r>
               <w:rPr>
                 <w:rFonts w:ascii="Calibri" w:hAnsi="Calibri"/>
-                <w:sz w:val="16"/>
+                <w:sz w:val="17"/>
               </w:rPr>
-              <w:t>4</w:t>
+              <w:t>5S — synthetic dataset, model and deployment</w:t>
             </w:r>
           </w:p>
         </w:tc>
@@ -801,46 +179,29 @@
       <w:tr>
         <w:tc>
           <w:tcPr>
-            <w:tcW w:type="dxa" w:w="8208"/>
-            <w:vAlign w:val="center"/>
+            <w:tcW w:type="dxa" w:w="5040"/>
           </w:tcPr>
           <w:p>
-            <w:pPr>
-              <w:spacing w:before="0" w:after="0" w:line="252" w:lineRule="auto"/>
-              <w:jc w:val="left"/>
-            </w:pPr>
             <w:r>
               <w:rPr>
                 <w:rFonts w:ascii="Calibri" w:hAnsi="Calibri"/>
-                <w:sz w:val="16"/>
+                <w:sz w:val="17"/>
               </w:rPr>
-            </w:r>
-            <w:r>
-              <w:rPr>
-                <w:rFonts w:ascii="Calibri" w:hAnsi="Calibri"/>
-                <w:b w:val="0"/>
-                <w:color w:val="1A1917"/>
-                <w:sz w:val="16"/>
-              </w:rPr>
-              <w:t>7-9. Dependencies and Streamlit startup</w:t>
+              <w:t>Author</w:t>
             </w:r>
           </w:p>
         </w:tc>
         <w:tc>
           <w:tcPr>
-            <w:tcW w:type="dxa" w:w="1152"/>
-            <w:vAlign w:val="center"/>
+            <w:tcW w:type="dxa" w:w="5040"/>
           </w:tcPr>
           <w:p>
-            <w:pPr>
-              <w:spacing w:before="0" w:after="0"/>
-            </w:pPr>
             <w:r>
               <w:rPr>
                 <w:rFonts w:ascii="Calibri" w:hAnsi="Calibri"/>
-                <w:sz w:val="16"/>
+                <w:sz w:val="17"/>
               </w:rPr>
-              <w:t>5</w:t>
+              <w:t>Deven Sachin Gaikwad</w:t>
             </w:r>
           </w:p>
         </w:tc>
@@ -848,48 +209,200 @@
       <w:tr>
         <w:tc>
           <w:tcPr>
-            <w:tcW w:type="dxa" w:w="8208"/>
-            <w:vAlign w:val="center"/>
-            <w:shd w:fill="FAFCFF"/>
+            <w:tcW w:type="dxa" w:w="5040"/>
           </w:tcPr>
           <w:p>
-            <w:pPr>
-              <w:spacing w:before="0" w:after="0" w:line="252" w:lineRule="auto"/>
-              <w:jc w:val="left"/>
-            </w:pPr>
             <w:r>
               <w:rPr>
                 <w:rFonts w:ascii="Calibri" w:hAnsi="Calibri"/>
-                <w:sz w:val="16"/>
+                <w:sz w:val="17"/>
               </w:rPr>
-            </w:r>
-            <w:r>
-              <w:rPr>
-                <w:rFonts w:ascii="Calibri" w:hAnsi="Calibri"/>
-                <w:b w:val="0"/>
-                <w:color w:val="1A1917"/>
-                <w:sz w:val="16"/>
-              </w:rPr>
-              <w:t>10. First sample analysis</w:t>
+              <w:t>Status</w:t>
             </w:r>
           </w:p>
         </w:tc>
         <w:tc>
           <w:tcPr>
-            <w:tcW w:type="dxa" w:w="1152"/>
-            <w:vAlign w:val="center"/>
-            <w:shd w:fill="FAFCFF"/>
+            <w:tcW w:type="dxa" w:w="5040"/>
           </w:tcPr>
           <w:p>
-            <w:pPr>
-              <w:spacing w:before="0" w:after="0"/>
-            </w:pPr>
             <w:r>
               <w:rPr>
                 <w:rFonts w:ascii="Calibri" w:hAnsi="Calibri"/>
-                <w:sz w:val="16"/>
+                <w:sz w:val="17"/>
               </w:rPr>
-              <w:t>6</w:t>
+              <w:t>PR B evidence package; external deployment values recorded after protected merge</w:t>
+            </w:r>
+          </w:p>
+        </w:tc>
+      </w:tr>
+    </w:tbl>
+    <w:p/>
+    <w:p>
+      <w:pPr>
+        <w:pStyle w:val="Heading1"/>
+      </w:pPr>
+      <w:r>
+        <w:t>NewsLens AI</w:t>
+      </w:r>
+    </w:p>
+    <w:p>
+      <w:r>
+        <w:t xml:space="preserve">NewsLens AI is a noncommercial student and placement-portfolio demonstration built by </w:t>
+      </w:r>
+      <w:r>
+        <w:rPr>
+          <w:b/>
+        </w:rPr>
+        <w:t>Deven Sachin Gaikwad</w:t>
+      </w:r>
+      <w:r>
+        <w:t>. It combines deterministic extractive summarisation with an explainable classifier trained exclusively on an independently created synthetic benchmark.</w:t>
+      </w:r>
+    </w:p>
+    <w:p>
+      <w:r>
+        <w:t xml:space="preserve">The classifier has a deliberately narrow purpose: compare the visible </w:t>
+      </w:r>
+      <w:r>
+        <w:rPr>
+          <w:rFonts w:ascii="Consolas" w:hAnsi="Consolas"/>
+          <w:sz w:val="17"/>
+        </w:rPr>
+        <w:t>Reference note</w:t>
+      </w:r>
+      <w:r>
+        <w:t xml:space="preserve"> and </w:t>
+      </w:r>
+      <w:r>
+        <w:rPr>
+          <w:rFonts w:ascii="Consolas" w:hAnsi="Consolas"/>
+          <w:sz w:val="17"/>
+        </w:rPr>
+        <w:t>Article account</w:t>
+      </w:r>
+      <w:r>
+        <w:t xml:space="preserve"> fields in the supported fictional format and indicate whether their ledgers are consistent or contradicting. It is </w:t>
+      </w:r>
+      <w:r>
+        <w:rPr>
+          <w:b/>
+        </w:rPr>
+        <w:t>not</w:t>
+      </w:r>
+      <w:r>
+        <w:t xml:space="preserve"> a general fake-news detector and does not establish real-world truth.</w:t>
+      </w:r>
+    </w:p>
+    <w:p>
+      <w:pPr>
+        <w:pStyle w:val="Heading2"/>
+      </w:pPr>
+      <w:r>
+        <w:t>What is public</w:t>
+      </w:r>
+    </w:p>
+    <w:p>
+      <w:pPr>
+        <w:pStyle w:val="ListBullet"/>
+      </w:pPr>
+      <w:r>
+        <w:t>24,000 original synthetic articles representing 12,000 fictional paired events.</w:t>
+      </w:r>
+    </w:p>
+    <w:p>
+      <w:pPr>
+        <w:pStyle w:val="ListBullet"/>
+      </w:pPr>
+      <w:r>
+        <w:t>Deterministic generator, manifest, audit evidence, and reproducibility tests.</w:t>
+      </w:r>
+    </w:p>
+    <w:p>
+      <w:pPr>
+        <w:pStyle w:val="ListBullet"/>
+      </w:pPr>
+      <w:r>
+        <w:t>TF-IDF bigram + Logistic Regression public model.</w:t>
+      </w:r>
+    </w:p>
+    <w:p>
+      <w:pPr>
+        <w:pStyle w:val="ListBullet"/>
+      </w:pPr>
+      <w:r>
+        <w:t>Platt calibration cryptographically bound to the exact model SHA-256.</w:t>
+      </w:r>
+    </w:p>
+    <w:p>
+      <w:pPr>
+        <w:pStyle w:val="ListBullet"/>
+      </w:pPr>
+      <w:r>
+        <w:t>Group-safe training, validation, calibration, abstention-policy, and locked-test partitions.</w:t>
+      </w:r>
+    </w:p>
+    <w:p>
+      <w:pPr>
+        <w:pStyle w:val="ListBullet"/>
+      </w:pPr>
+      <w:r>
+        <w:t>Streamlit interface with summarisation, classification, abstention, explanations, exports, session-local review, and aggregate monitoring.</w:t>
+      </w:r>
+    </w:p>
+    <w:p>
+      <w:r>
+        <w:t>No ISOT row, copied phrase, close paraphrase, transformation, translation, summary, reconstruction, private ISOT model, private calibration artifact, or external copyrighted training dataset is included.</w:t>
+      </w:r>
+    </w:p>
+    <w:p>
+      <w:pPr>
+        <w:pStyle w:val="Heading2"/>
+      </w:pPr>
+      <w:r>
+        <w:t>Measured evidence</w:t>
+      </w:r>
+    </w:p>
+    <w:tbl>
+      <w:tblPr>
+        <w:tblStyle w:val="TableGrid"/>
+        <w:tblW w:type="auto" w:w="0"/>
+        <w:tblLook w:firstColumn="1" w:firstRow="1" w:lastColumn="0" w:lastRow="0" w:noHBand="0" w:noVBand="1" w:val="04A0"/>
+      </w:tblPr>
+      <w:tblGrid>
+        <w:gridCol w:w="5040"/>
+        <w:gridCol w:w="5040"/>
+      </w:tblGrid>
+      <w:tr>
+        <w:tc>
+          <w:tcPr>
+            <w:tcW w:type="dxa" w:w="5040"/>
+            <w:shd w:fill="EAE4D8"/>
+          </w:tcPr>
+          <w:p>
+            <w:r>
+              <w:rPr>
+                <w:rFonts w:ascii="Calibri" w:hAnsi="Calibri"/>
+                <w:b/>
+                <w:sz w:val="17"/>
+              </w:rPr>
+              <w:t>Measure</w:t>
+            </w:r>
+          </w:p>
+        </w:tc>
+        <w:tc>
+          <w:tcPr>
+            <w:tcW w:type="dxa" w:w="5040"/>
+            <w:shd w:fill="EAE4D8"/>
+          </w:tcPr>
+          <w:p>
+            <w:r>
+              <w:rPr>
+                <w:rFonts w:ascii="Calibri" w:hAnsi="Calibri"/>
+                <w:b/>
+                <w:sz w:val="17"/>
+              </w:rPr>
+              <w:t>Result</w:t>
             </w:r>
           </w:p>
         </w:tc>
@@ -897,46 +410,29 @@
       <w:tr>
         <w:tc>
           <w:tcPr>
-            <w:tcW w:type="dxa" w:w="8208"/>
-            <w:vAlign w:val="center"/>
+            <w:tcW w:type="dxa" w:w="5040"/>
           </w:tcPr>
           <w:p>
-            <w:pPr>
-              <w:spacing w:before="0" w:after="0" w:line="252" w:lineRule="auto"/>
-              <w:jc w:val="left"/>
-            </w:pPr>
             <w:r>
               <w:rPr>
                 <w:rFonts w:ascii="Calibri" w:hAnsi="Calibri"/>
-                <w:sz w:val="16"/>
+                <w:sz w:val="17"/>
               </w:rPr>
-            </w:r>
-            <w:r>
-              <w:rPr>
-                <w:rFonts w:ascii="Calibri" w:hAnsi="Calibri"/>
-                <w:b w:val="0"/>
-                <w:color w:val="1A1917"/>
-                <w:sz w:val="16"/>
-              </w:rPr>
-              <w:t>11-15. Operations, datasets and retraining</w:t>
+              <w:t>Locked final-test rows</w:t>
             </w:r>
           </w:p>
         </w:tc>
         <w:tc>
           <w:tcPr>
-            <w:tcW w:type="dxa" w:w="1152"/>
-            <w:vAlign w:val="center"/>
+            <w:tcW w:type="dxa" w:w="5040"/>
           </w:tcPr>
           <w:p>
-            <w:pPr>
-              <w:spacing w:before="0" w:after="0"/>
-            </w:pPr>
             <w:r>
               <w:rPr>
                 <w:rFonts w:ascii="Calibri" w:hAnsi="Calibri"/>
-                <w:sz w:val="16"/>
+                <w:sz w:val="17"/>
               </w:rPr>
-              <w:t>10</w:t>
+              <w:t>1,200</w:t>
             </w:r>
           </w:p>
         </w:tc>
@@ -944,48 +440,29 @@
       <w:tr>
         <w:tc>
           <w:tcPr>
-            <w:tcW w:type="dxa" w:w="8208"/>
-            <w:vAlign w:val="center"/>
-            <w:shd w:fill="FAFCFF"/>
+            <w:tcW w:type="dxa" w:w="5040"/>
           </w:tcPr>
           <w:p>
-            <w:pPr>
-              <w:spacing w:before="0" w:after="0" w:line="252" w:lineRule="auto"/>
-              <w:jc w:val="left"/>
-            </w:pPr>
             <w:r>
               <w:rPr>
                 <w:rFonts w:ascii="Calibri" w:hAnsi="Calibri"/>
-                <w:sz w:val="16"/>
+                <w:sz w:val="17"/>
               </w:rPr>
-            </w:r>
-            <w:r>
-              <w:rPr>
-                <w:rFonts w:ascii="Calibri" w:hAnsi="Calibri"/>
-                <w:b w:val="0"/>
-                <w:color w:val="1A1917"/>
-                <w:sz w:val="16"/>
-              </w:rPr>
-              <w:t>16-17. Tests and public deployment</w:t>
+              <w:t>Accuracy / balanced accuracy / macro F1</w:t>
             </w:r>
           </w:p>
         </w:tc>
         <w:tc>
           <w:tcPr>
-            <w:tcW w:type="dxa" w:w="1152"/>
-            <w:vAlign w:val="center"/>
-            <w:shd w:fill="FAFCFF"/>
+            <w:tcW w:type="dxa" w:w="5040"/>
           </w:tcPr>
           <w:p>
-            <w:pPr>
-              <w:spacing w:before="0" w:after="0"/>
-            </w:pPr>
             <w:r>
               <w:rPr>
                 <w:rFonts w:ascii="Calibri" w:hAnsi="Calibri"/>
-                <w:sz w:val="16"/>
+                <w:sz w:val="17"/>
               </w:rPr>
-              <w:t>12</w:t>
+              <w:t>1.000 / 1.000 / 1.000</w:t>
             </w:r>
           </w:p>
         </w:tc>
@@ -993,46 +470,29 @@
       <w:tr>
         <w:tc>
           <w:tcPr>
-            <w:tcW w:type="dxa" w:w="8208"/>
-            <w:vAlign w:val="center"/>
+            <w:tcW w:type="dxa" w:w="5040"/>
           </w:tcPr>
           <w:p>
-            <w:pPr>
-              <w:spacing w:before="0" w:after="0" w:line="252" w:lineRule="auto"/>
-              <w:jc w:val="left"/>
-            </w:pPr>
             <w:r>
               <w:rPr>
                 <w:rFonts w:ascii="Calibri" w:hAnsi="Calibri"/>
-                <w:sz w:val="16"/>
+                <w:sz w:val="17"/>
               </w:rPr>
-            </w:r>
-            <w:r>
-              <w:rPr>
-                <w:rFonts w:ascii="Calibri" w:hAnsi="Calibri"/>
-                <w:b w:val="0"/>
-                <w:color w:val="1A1917"/>
-                <w:sz w:val="16"/>
-              </w:rPr>
-              <w:t>18. Troubleshooting</w:t>
+              <w:t>Confusion matrix</w:t>
             </w:r>
           </w:p>
         </w:tc>
         <w:tc>
           <w:tcPr>
-            <w:tcW w:type="dxa" w:w="1152"/>
-            <w:vAlign w:val="center"/>
+            <w:tcW w:type="dxa" w:w="5040"/>
           </w:tcPr>
           <w:p>
-            <w:pPr>
-              <w:spacing w:before="0" w:after="0"/>
-            </w:pPr>
             <w:r>
               <w:rPr>
                 <w:rFonts w:ascii="Calibri" w:hAnsi="Calibri"/>
-                <w:sz w:val="16"/>
+                <w:sz w:val="17"/>
               </w:rPr>
-              <w:t>12</w:t>
+              <w:t>`[[600, 0], [0, 600]]`</w:t>
             </w:r>
           </w:p>
         </w:tc>
@@ -1040,120 +500,384 @@
       <w:tr>
         <w:tc>
           <w:tcPr>
-            <w:tcW w:type="dxa" w:w="8208"/>
-            <w:vAlign w:val="center"/>
-            <w:shd w:fill="FAFCFF"/>
+            <w:tcW w:type="dxa" w:w="5040"/>
           </w:tcPr>
           <w:p>
-            <w:pPr>
-              <w:spacing w:before="0" w:after="0" w:line="252" w:lineRule="auto"/>
-              <w:jc w:val="left"/>
-            </w:pPr>
             <w:r>
               <w:rPr>
                 <w:rFonts w:ascii="Calibri" w:hAnsi="Calibri"/>
-                <w:sz w:val="16"/>
+                <w:sz w:val="17"/>
               </w:rPr>
-            </w:r>
-            <w:r>
-              <w:rPr>
-                <w:rFonts w:ascii="Calibri" w:hAnsi="Calibri"/>
-                <w:b w:val="0"/>
-                <w:color w:val="1A1917"/>
-                <w:sz w:val="16"/>
-              </w:rPr>
-              <w:t>19-20. Demo checklist and commands</w:t>
+              <w:t>Platt Brier score</w:t>
             </w:r>
           </w:p>
         </w:tc>
         <w:tc>
           <w:tcPr>
-            <w:tcW w:type="dxa" w:w="1152"/>
-            <w:vAlign w:val="center"/>
-            <w:shd w:fill="FAFCFF"/>
+            <w:tcW w:type="dxa" w:w="5040"/>
           </w:tcPr>
           <w:p>
-            <w:pPr>
-              <w:spacing w:before="0" w:after="0"/>
-            </w:pPr>
             <w:r>
               <w:rPr>
                 <w:rFonts w:ascii="Calibri" w:hAnsi="Calibri"/>
-                <w:sz w:val="16"/>
+                <w:sz w:val="17"/>
               </w:rPr>
-              <w:t>14</w:t>
+              <w:t>0.000001497</w:t>
+            </w:r>
+          </w:p>
+        </w:tc>
+      </w:tr>
+      <w:tr>
+        <w:tc>
+          <w:tcPr>
+            <w:tcW w:type="dxa" w:w="5040"/>
+          </w:tcPr>
+          <w:p>
+            <w:r>
+              <w:rPr>
+                <w:rFonts w:ascii="Calibri" w:hAnsi="Calibri"/>
+                <w:sz w:val="17"/>
+              </w:rPr>
+              <w:t>Expected calibration error</w:t>
+            </w:r>
+          </w:p>
+        </w:tc>
+        <w:tc>
+          <w:tcPr>
+            <w:tcW w:type="dxa" w:w="5040"/>
+          </w:tcPr>
+          <w:p>
+            <w:r>
+              <w:rPr>
+                <w:rFonts w:ascii="Calibri" w:hAnsi="Calibri"/>
+                <w:sz w:val="17"/>
+              </w:rPr>
+              <w:t>0.000742</w:t>
+            </w:r>
+          </w:p>
+        </w:tc>
+      </w:tr>
+      <w:tr>
+        <w:tc>
+          <w:tcPr>
+            <w:tcW w:type="dxa" w:w="5040"/>
+          </w:tcPr>
+          <w:p>
+            <w:r>
+              <w:rPr>
+                <w:rFonts w:ascii="Calibri" w:hAnsi="Calibri"/>
+                <w:sz w:val="17"/>
+              </w:rPr>
+              <w:t>Counterfactual account-swap flip rate</w:t>
+            </w:r>
+          </w:p>
+        </w:tc>
+        <w:tc>
+          <w:tcPr>
+            <w:tcW w:type="dxa" w:w="5040"/>
+          </w:tcPr>
+          <w:p>
+            <w:r>
+              <w:rPr>
+                <w:rFonts w:ascii="Calibri" w:hAnsi="Calibri"/>
+                <w:sz w:val="17"/>
+              </w:rPr>
+              <w:t>100%</w:t>
+            </w:r>
+          </w:p>
+        </w:tc>
+      </w:tr>
+      <w:tr>
+        <w:tc>
+          <w:tcPr>
+            <w:tcW w:type="dxa" w:w="5040"/>
+          </w:tcPr>
+          <w:p>
+            <w:r>
+              <w:rPr>
+                <w:rFonts w:ascii="Calibri" w:hAnsi="Calibri"/>
+                <w:sz w:val="17"/>
+              </w:rPr>
+              <w:t>Surface-text-only balanced accuracy</w:t>
+            </w:r>
+          </w:p>
+        </w:tc>
+        <w:tc>
+          <w:tcPr>
+            <w:tcW w:type="dxa" w:w="5040"/>
+          </w:tcPr>
+          <w:p>
+            <w:r>
+              <w:rPr>
+                <w:rFonts w:ascii="Calibri" w:hAnsi="Calibri"/>
+                <w:sz w:val="17"/>
+              </w:rPr>
+              <w:t>0.500</w:t>
+            </w:r>
+          </w:p>
+        </w:tc>
+      </w:tr>
+      <w:tr>
+        <w:tc>
+          <w:tcPr>
+            <w:tcW w:type="dxa" w:w="5040"/>
+          </w:tcPr>
+          <w:p>
+            <w:r>
+              <w:rPr>
+                <w:rFonts w:ascii="Calibri" w:hAnsi="Calibri"/>
+                <w:sz w:val="17"/>
+              </w:rPr>
+              <w:t>Fact-block ablation balanced accuracy</w:t>
+            </w:r>
+          </w:p>
+        </w:tc>
+        <w:tc>
+          <w:tcPr>
+            <w:tcW w:type="dxa" w:w="5040"/>
+          </w:tcPr>
+          <w:p>
+            <w:r>
+              <w:rPr>
+                <w:rFonts w:ascii="Calibri" w:hAnsi="Calibri"/>
+                <w:sz w:val="17"/>
+              </w:rPr>
+              <w:t>0.498</w:t>
+            </w:r>
+          </w:p>
+        </w:tc>
+      </w:tr>
+      <w:tr>
+        <w:tc>
+          <w:tcPr>
+            <w:tcW w:type="dxa" w:w="5040"/>
+          </w:tcPr>
+          <w:p>
+            <w:r>
+              <w:rPr>
+                <w:rFonts w:ascii="Calibri" w:hAnsi="Calibri"/>
+                <w:sz w:val="17"/>
+              </w:rPr>
+              <w:t>Metadata-only balanced accuracy</w:t>
+            </w:r>
+          </w:p>
+        </w:tc>
+        <w:tc>
+          <w:tcPr>
+            <w:tcW w:type="dxa" w:w="5040"/>
+          </w:tcPr>
+          <w:p>
+            <w:r>
+              <w:rPr>
+                <w:rFonts w:ascii="Calibri" w:hAnsi="Calibri"/>
+                <w:sz w:val="17"/>
+              </w:rPr>
+              <w:t>0.521</w:t>
             </w:r>
           </w:p>
         </w:tc>
       </w:tr>
     </w:tbl>
+    <w:p/>
     <w:p>
-      <w:pPr>
-        <w:spacing w:after="20"/>
-      </w:pPr>
+      <w:r>
+        <w:t>Perfect in-distribution performance reflects a structured synthetic comparison task; it must not be interpreted as unrestricted news-veracity performance.</w:t>
+      </w:r>
     </w:p>
     <w:p>
       <w:pPr>
-        <w:spacing w:before="80"/>
+        <w:pStyle w:val="Heading2"/>
       </w:pPr>
       <w:r>
-        <w:rPr>
-          <w:rFonts w:ascii="Calibri" w:hAnsi="Calibri"/>
-          <w:i/>
-          <w:color w:val="6F685F"/>
-          <w:sz w:val="17"/>
-        </w:rPr>
-        <w:t>Page references match the packaged render; headings remain Word-native for navigation and future TOC updates.</w:t>
+        <w:t>Run locally</w:t>
       </w:r>
     </w:p>
     <w:p>
       <w:r>
-        <w:br w:type="page"/>
+        <w:t>Python 3.12 is the deployment target.</w:t>
       </w:r>
     </w:p>
     <w:p>
       <w:pPr>
-        <w:spacing w:before="80" w:after="140" w:line="259" w:lineRule="auto"/>
-        <w:ind w:left="173" w:right="173"/>
-        <w:shd w:fill="E8EEE8"/>
-        <w:pBdr>
-          <w:left w:val="single" w:sz="20" w:space="8" w:color="496454"/>
-          <w:top w:val="single" w:sz="4" w:space="5" w:color="D6CEC2"/>
-          <w:bottom w:val="single" w:sz="4" w:space="5" w:color="D6CEC2"/>
-          <w:right w:val="single" w:sz="4" w:space="5" w:color="D6CEC2"/>
-        </w:pBdr>
+        <w:ind w:left="360"/>
+        <w:shd w:fill="F0EEE9"/>
       </w:pPr>
       <w:r>
         <w:rPr>
-          <w:rFonts w:ascii="Calibri" w:hAnsi="Calibri"/>
-          <w:b/>
-          <w:color w:val="496454"/>
-          <w:sz w:val="19"/>
+          <w:rFonts w:ascii="Consolas" w:hAnsi="Consolas"/>
+          <w:sz w:val="16"/>
         </w:rPr>
-        <w:t xml:space="preserve">Recommended path: </w:t>
-      </w:r>
-      <w:r>
-        <w:rPr>
-          <w:rFonts w:ascii="Calibri" w:hAnsi="Calibri"/>
-          <w:color w:val="1A1917"/>
-          <w:sz w:val="19"/>
-        </w:rPr>
-        <w:t>Use the tested Python 3.12 runtime and requirements-lite.txt first. It runs the complete extractive summary, saved classifier, explanations, session-private history and exports without PyTorch.</w:t>
-      </w:r>
-    </w:p>
-    <w:p>
-      <w:pPr/>
-      <w:r>
-        <w:t>Maintenance reconciliation, 13 September 2026. Public validation: 144 tests pass; four private-model tests are deselected. The Next.js presentation build, CI, PR dependency review and both CodeQL analyses pass; CodeQL uses Action v4. This does not prove zero historical security alerts. Streamlit is the ML runtime; neither app is deployed. Hosting requires a resolved Streamlit URL and confirmed model-redistribution rights. August benchmarks and private-artifact/browser evidence remain historical and unchanged.</w:t>
+        <w:t>python -m venv .venv</w:t>
       </w:r>
     </w:p>
     <w:p>
       <w:pPr>
-        <w:pStyle w:val="Heading1"/>
-        <w:keepNext/>
+        <w:ind w:left="360"/>
+        <w:shd w:fill="F0EEE9"/>
       </w:pPr>
       <w:r>
-        <w:t>1. What you need</w:t>
+        <w:rPr>
+          <w:rFonts w:ascii="Consolas" w:hAnsi="Consolas"/>
+          <w:sz w:val="16"/>
+        </w:rPr>
+        <w:t>source .venv/bin/activate</w:t>
+      </w:r>
+    </w:p>
+    <w:p>
+      <w:pPr>
+        <w:ind w:left="360"/>
+        <w:shd w:fill="F0EEE9"/>
+      </w:pPr>
+      <w:r>
+        <w:rPr>
+          <w:rFonts w:ascii="Consolas" w:hAnsi="Consolas"/>
+          <w:sz w:val="16"/>
+        </w:rPr>
+        <w:t>python -m pip install -r requirements-lite.txt</w:t>
+      </w:r>
+    </w:p>
+    <w:p>
+      <w:pPr>
+        <w:ind w:left="360"/>
+        <w:shd w:fill="F0EEE9"/>
+      </w:pPr>
+      <w:r>
+        <w:rPr>
+          <w:rFonts w:ascii="Consolas" w:hAnsi="Consolas"/>
+          <w:sz w:val="16"/>
+        </w:rPr>
+        <w:t>python -m streamlit run app.py</w:t>
+      </w:r>
+    </w:p>
+    <w:p>
+      <w:r>
+        <w:t xml:space="preserve">On Windows PowerShell, activate with </w:t>
+      </w:r>
+      <w:r>
+        <w:rPr>
+          <w:rFonts w:ascii="Consolas" w:hAnsi="Consolas"/>
+          <w:sz w:val="17"/>
+        </w:rPr>
+        <w:t>.venv\Scripts\Activate.ps1</w:t>
+      </w:r>
+      <w:r>
+        <w:t>.</w:t>
+      </w:r>
+    </w:p>
+    <w:p>
+      <w:r>
+        <w:t xml:space="preserve">No API key or secret is required. The packaged model and calibration are loaded from </w:t>
+      </w:r>
+      <w:r>
+        <w:rPr>
+          <w:rFonts w:ascii="Consolas" w:hAnsi="Consolas"/>
+          <w:sz w:val="17"/>
+        </w:rPr>
+        <w:t>models/</w:t>
+      </w:r>
+      <w:r>
+        <w:t xml:space="preserve"> without runtime training.</w:t>
+      </w:r>
+    </w:p>
+    <w:p>
+      <w:pPr>
+        <w:pStyle w:val="Heading2"/>
+      </w:pPr>
+      <w:r>
+        <w:t>Reproduce the model package</w:t>
+      </w:r>
+    </w:p>
+    <w:p>
+      <w:r>
+        <w:t>The authoritative dataset archive is already versioned. The following command verifies its identity, trains on the authored training split, selects only on model validation, fits calibration, selects the abstention policy, and evaluates the locked final test once:</w:t>
+      </w:r>
+    </w:p>
+    <w:p>
+      <w:pPr>
+        <w:ind w:left="360"/>
+        <w:shd w:fill="F0EEE9"/>
+      </w:pPr>
+      <w:r>
+        <w:rPr>
+          <w:rFonts w:ascii="Consolas" w:hAnsi="Consolas"/>
+          <w:sz w:val="16"/>
+        </w:rPr>
+        <w:t>python training/train_synthetic_model.py</w:t>
+      </w:r>
+    </w:p>
+    <w:p>
+      <w:r>
+        <w:t xml:space="preserve">The accepted public artifacts are described in </w:t>
+      </w:r>
+      <w:r>
+        <w:rPr>
+          <w:rFonts w:ascii="Consolas" w:hAnsi="Consolas"/>
+          <w:sz w:val="17"/>
+        </w:rPr>
+        <w:t>models/public_artifact_manifest.json</w:t>
+      </w:r>
+      <w:r>
+        <w:t>. Re-running training in a materially different dependency environment can change serialized bytes; publication uses the recorded artifacts and hashes.</w:t>
+      </w:r>
+    </w:p>
+    <w:p>
+      <w:pPr>
+        <w:pStyle w:val="Heading2"/>
+      </w:pPr>
+      <w:r>
+        <w:t>Validate</w:t>
+      </w:r>
+    </w:p>
+    <w:p>
+      <w:pPr>
+        <w:ind w:left="360"/>
+        <w:shd w:fill="F0EEE9"/>
+      </w:pPr>
+      <w:r>
+        <w:rPr>
+          <w:rFonts w:ascii="Consolas" w:hAnsi="Consolas"/>
+          <w:sz w:val="16"/>
+        </w:rPr>
+        <w:t>python -m compileall -q app.py pages src ui tests scripts training synthetic_benchmark</w:t>
+      </w:r>
+    </w:p>
+    <w:p>
+      <w:pPr>
+        <w:ind w:left="360"/>
+        <w:shd w:fill="F0EEE9"/>
+      </w:pPr>
+      <w:r>
+        <w:rPr>
+          <w:rFonts w:ascii="Consolas" w:hAnsi="Consolas"/>
+          <w:sz w:val="16"/>
+        </w:rPr>
+        <w:t>python -m pytest -q --strict-markers</w:t>
+      </w:r>
+    </w:p>
+    <w:p>
+      <w:pPr>
+        <w:ind w:left="360"/>
+        <w:shd w:fill="F0EEE9"/>
+      </w:pPr>
+      <w:r>
+        <w:rPr>
+          <w:rFonts w:ascii="Consolas" w:hAnsi="Consolas"/>
+          <w:sz w:val="16"/>
+        </w:rPr>
+        <w:t>python scripts/audit_public_release.py --allow-publication-gates</w:t>
+      </w:r>
+    </w:p>
+    <w:p>
+      <w:r>
+        <w:t>The release scan verifies the dataset ZIP, public model, calibration binding, legal package, secrets, private artifact exclusions, navigation, and local links.</w:t>
+      </w:r>
+    </w:p>
+    <w:p>
+      <w:pPr>
+        <w:pStyle w:val="Heading2"/>
+      </w:pPr>
+      <w:r>
+        <w:t>Responsible use</w:t>
       </w:r>
     </w:p>
     <w:p>
@@ -1161,10 +885,16 @@
         <w:pStyle w:val="ListBullet"/>
       </w:pPr>
       <w:r>
+        <w:t xml:space="preserve">Inputs lacking both supported fact blocks are routed to </w:t>
+      </w:r>
+      <w:r>
         <w:rPr>
-          <w:rFonts w:ascii="Calibri" w:hAnsi="Calibri"/>
+          <w:b/>
         </w:rPr>
-        <w:t>A 64-bit Windows 10/11 computer (Linux/macOS also work).</w:t>
+        <w:t>Editorial review required</w:t>
+      </w:r>
+      <w:r>
+        <w:t>.</w:t>
       </w:r>
     </w:p>
     <w:p>
@@ -1172,10 +902,7 @@
         <w:pStyle w:val="ListBullet"/>
       </w:pPr>
       <w:r>
-        <w:rPr>
-          <w:rFonts w:ascii="Calibri" w:hAnsi="Calibri"/>
-        </w:rPr>
-        <w:t>At least 4 GB RAM for lightweight mode; 8 GB or more for DistilBART.</w:t>
+        <w:t>Confidence measures agreement with synthetic benchmark labels, not factual truth.</w:t>
       </w:r>
     </w:p>
     <w:p>
@@ -1183,10 +910,7 @@
         <w:pStyle w:val="ListBullet"/>
       </w:pPr>
       <w:r>
-        <w:rPr>
-          <w:rFonts w:ascii="Calibri" w:hAnsi="Calibri"/>
-        </w:rPr>
-        <w:t>About 1 GB free space for lightweight mode; several GB for datasets and transformer caches.</w:t>
+        <w:t>The app does not expose raw training rows.</w:t>
       </w:r>
     </w:p>
     <w:p>
@@ -1194,10 +918,7 @@
         <w:pStyle w:val="ListBullet"/>
       </w:pPr>
       <w:r>
-        <w:rPr>
-          <w:rFonts w:ascii="Calibri" w:hAnsi="Calibri"/>
-        </w:rPr>
-        <w:t>Internet for installation/downloads. Core analysis is local after installation.</w:t>
+        <w:t>Public history is isolated to a visitor session; full article text is not persisted.</w:t>
       </w:r>
     </w:p>
     <w:p>
@@ -1205,19 +926,196 @@
         <w:pStyle w:val="ListBullet"/>
       </w:pPr>
       <w:r>
+        <w:t>Human verification against independent primary sources remains necessary.</w:t>
+      </w:r>
+    </w:p>
+    <w:p>
+      <w:r>
+        <w:t xml:space="preserve">See </w:t>
+      </w:r>
+      <w:r>
         <w:rPr>
-          <w:rFonts w:ascii="Calibri" w:hAnsi="Calibri"/>
+          <w:rFonts w:ascii="Consolas" w:hAnsi="Consolas"/>
+          <w:sz w:val="17"/>
         </w:rPr>
-        <w:t>The core workflow requires no paid API; hosting, network, compute and third-party terms may still carry costs.</w:t>
+        <w:t>docs/DATASET_CARD.md</w:t>
+      </w:r>
+      <w:r>
+        <w:t xml:space="preserve">, </w:t>
+      </w:r>
+      <w:r>
+        <w:rPr>
+          <w:rFonts w:ascii="Consolas" w:hAnsi="Consolas"/>
+          <w:sz w:val="17"/>
+        </w:rPr>
+        <w:t>docs/MODEL_CARD.md</w:t>
+      </w:r>
+      <w:r>
+        <w:t xml:space="preserve">, </w:t>
+      </w:r>
+      <w:r>
+        <w:rPr>
+          <w:rFonts w:ascii="Consolas" w:hAnsi="Consolas"/>
+          <w:sz w:val="17"/>
+        </w:rPr>
+        <w:t>docs/TESTING.md</w:t>
+      </w:r>
+      <w:r>
+        <w:t xml:space="preserve">, and </w:t>
+      </w:r>
+      <w:r>
+        <w:rPr>
+          <w:rFonts w:ascii="Consolas" w:hAnsi="Consolas"/>
+          <w:sz w:val="17"/>
+        </w:rPr>
+        <w:t>docs/DEPLOYMENT.md</w:t>
+      </w:r>
+      <w:r>
+        <w:t xml:space="preserve"> for the full evidence trail.</w:t>
+      </w:r>
+    </w:p>
+    <w:p>
+      <w:r>
+        <w:t>© 2026 Deven Sachin Gaikwad. All Rights Reserved. The synthetic dataset has the separate license described in its dataset card.</w:t>
       </w:r>
     </w:p>
     <w:p>
       <w:pPr>
+        <w:sectPr>
+          <w:headerReference w:type="default" r:id="rId9"/>
+          <w:footerReference w:type="default" r:id="rId10"/>
+          <w:pgSz w:w="12240" w:h="15840"/>
+          <w:pgMar w:top="979" w:right="1037" w:bottom="936" w:left="1123" w:header="720" w:footer="720" w:gutter="0"/>
+          <w:cols w:space="720"/>
+          <w:docGrid w:linePitch="360"/>
+        </w:sectPr>
+      </w:pPr>
+    </w:p>
+    <w:p>
+      <w:pPr>
         <w:pStyle w:val="Heading1"/>
-        <w:keepNext/>
       </w:pPr>
       <w:r>
-        <w:t>2. Install Python</w:t>
+        <w:t>Streamlit Community Cloud Deployment</w:t>
+      </w:r>
+    </w:p>
+    <w:p>
+      <w:pPr>
+        <w:pStyle w:val="Heading2"/>
+      </w:pPr>
+      <w:r>
+        <w:t>Required configuration</w:t>
+      </w:r>
+    </w:p>
+    <w:p>
+      <w:pPr>
+        <w:pStyle w:val="ListBullet"/>
+      </w:pPr>
+      <w:r>
+        <w:t xml:space="preserve">Workspace: </w:t>
+      </w:r>
+      <w:r>
+        <w:rPr>
+          <w:rFonts w:ascii="Consolas" w:hAnsi="Consolas"/>
+          <w:sz w:val="17"/>
+        </w:rPr>
+        <w:t>devengaikwad</w:t>
+      </w:r>
+      <w:r/>
+    </w:p>
+    <w:p>
+      <w:pPr>
+        <w:pStyle w:val="ListBullet"/>
+      </w:pPr>
+      <w:r>
+        <w:t xml:space="preserve">Repository: </w:t>
+      </w:r>
+      <w:r>
+        <w:rPr>
+          <w:rFonts w:ascii="Consolas" w:hAnsi="Consolas"/>
+          <w:sz w:val="17"/>
+        </w:rPr>
+        <w:t>DevenGaikwad/NewsLens-AI</w:t>
+      </w:r>
+      <w:r/>
+    </w:p>
+    <w:p>
+      <w:pPr>
+        <w:pStyle w:val="ListBullet"/>
+      </w:pPr>
+      <w:r>
+        <w:t xml:space="preserve">Branch: </w:t>
+      </w:r>
+      <w:r>
+        <w:rPr>
+          <w:rFonts w:ascii="Consolas" w:hAnsi="Consolas"/>
+          <w:sz w:val="17"/>
+        </w:rPr>
+        <w:t>main</w:t>
+      </w:r>
+      <w:r/>
+    </w:p>
+    <w:p>
+      <w:pPr>
+        <w:pStyle w:val="ListBullet"/>
+      </w:pPr>
+      <w:r>
+        <w:t xml:space="preserve">Entry point: </w:t>
+      </w:r>
+      <w:r>
+        <w:rPr>
+          <w:rFonts w:ascii="Consolas" w:hAnsi="Consolas"/>
+          <w:sz w:val="17"/>
+        </w:rPr>
+        <w:t>app.py</w:t>
+      </w:r>
+      <w:r/>
+    </w:p>
+    <w:p>
+      <w:pPr>
+        <w:pStyle w:val="ListBullet"/>
+      </w:pPr>
+      <w:r>
+        <w:t>Python: 3.12</w:t>
+      </w:r>
+    </w:p>
+    <w:p>
+      <w:pPr>
+        <w:pStyle w:val="ListBullet"/>
+      </w:pPr>
+      <w:r>
+        <w:t>Secrets: empty</w:t>
+      </w:r>
+    </w:p>
+    <w:p>
+      <w:pPr>
+        <w:pStyle w:val="ListBullet"/>
+      </w:pPr>
+      <w:r>
+        <w:t>Plan: free / Community Cloud</w:t>
+      </w:r>
+    </w:p>
+    <w:p>
+      <w:r>
+        <w:t xml:space="preserve">The repository includes the public synthetic model and bound calibration, so deployment does not download a checkpoint or retrain. </w:t>
+      </w:r>
+      <w:r>
+        <w:rPr>
+          <w:rFonts w:ascii="Consolas" w:hAnsi="Consolas"/>
+          <w:sz w:val="17"/>
+        </w:rPr>
+        <w:t>requirements.txt</w:t>
+      </w:r>
+      <w:r>
+        <w:t xml:space="preserve"> delegates to the lightweight pinned runtime requirements and contains no external transformer stack.</w:t>
+      </w:r>
+    </w:p>
+    <w:p>
+      <w:pPr>
+        <w:pStyle w:val="Heading2"/>
+      </w:pPr>
+      <w:r>
+        <w:t>Procedure</w:t>
       </w:r>
     </w:p>
     <w:p>
@@ -1225,10 +1123,7 @@
         <w:pStyle w:val="ListNumber"/>
       </w:pPr>
       <w:r>
-        <w:rPr>
-          <w:rFonts w:ascii="Calibri" w:hAnsi="Calibri"/>
-        </w:rPr>
-        <w:t>Visit https://www.python.org/downloads/ and choose Python 3.12.x for Windows.</w:t>
+        <w:t>Confirm PR B is merged and exact-new-main checks pass.</w:t>
       </w:r>
     </w:p>
     <w:p>
@@ -1236,10 +1131,7 @@
         <w:pStyle w:val="ListNumber"/>
       </w:pPr>
       <w:r>
-        <w:rPr>
-          <w:rFonts w:ascii="Calibri" w:hAnsi="Calibri"/>
-        </w:rPr>
-        <w:t>Run the installer and tick 'Add python.exe to PATH'.</w:t>
+        <w:t>In Streamlit Community Cloud, create or update the app with the values above.</w:t>
       </w:r>
     </w:p>
     <w:p>
@@ -1247,10 +1139,7 @@
         <w:pStyle w:val="ListNumber"/>
       </w:pPr>
       <w:r>
-        <w:rPr>
-          <w:rFonts w:ascii="Calibri" w:hAnsi="Calibri"/>
-        </w:rPr>
-        <w:t>Choose Install Now.</w:t>
+        <w:t>Wait for dependency installation and startup to finish; inspect logs for model or calibration errors.</w:t>
       </w:r>
     </w:p>
     <w:p>
@@ -1258,50 +1147,17 @@
         <w:pStyle w:val="ListNumber"/>
       </w:pPr>
       <w:r>
-        <w:rPr>
-          <w:rFonts w:ascii="Calibri" w:hAnsi="Calibri"/>
-        </w:rPr>
-        <w:t>Open Command Prompt and run the verification command below.</w:t>
+        <w:t xml:space="preserve">Record the exact deployed main commit and final </w:t>
       </w:r>
-    </w:p>
-    <w:p>
-      <w:pPr>
-        <w:pStyle w:val="CodeBlock"/>
-        <w:keepLines/>
-        <w:shd w:fill="EEF3F8"/>
-      </w:pPr>
       <w:r>
         <w:rPr>
           <w:rFonts w:ascii="Consolas" w:hAnsi="Consolas"/>
-          <w:color w:val="2A241F"/>
           <w:sz w:val="17"/>
         </w:rPr>
-        <w:t>py -3.12 --version</w:t>
+        <w:t>https://…streamlit.app</w:t>
       </w:r>
-    </w:p>
-    <w:p>
-      <w:pPr>
-        <w:spacing w:before="80" w:after="140" w:line="259" w:lineRule="auto"/>
-        <w:ind w:left="173" w:right="173"/>
-        <w:shd w:fill="EEF5FF"/>
-        <w:pBdr>
-          <w:left w:val="single" w:sz="20" w:space="8" w:color="6D5947"/>
-          <w:top w:val="single" w:sz="4" w:space="5" w:color="D6CEC2"/>
-          <w:bottom w:val="single" w:sz="4" w:space="5" w:color="D6CEC2"/>
-          <w:right w:val="single" w:sz="4" w:space="5" w:color="D6CEC2"/>
-        </w:pBdr>
-      </w:pPr>
       <w:r>
-        <w:t>Expected: Python reports 3.12.x. Do not use a Microsoft Store alias if VS Code points to a different interpreter.</w:t>
-      </w:r>
-    </w:p>
-    <w:p>
-      <w:pPr>
-        <w:pStyle w:val="Heading1"/>
-        <w:keepNext/>
-      </w:pPr>
-      <w:r>
-        <w:t>3. Install VS Code and the Python extension</w:t>
+        <w:t xml:space="preserve"> URL.</w:t>
       </w:r>
     </w:p>
     <w:p>
@@ -1309,10 +1165,7 @@
         <w:pStyle w:val="ListNumber"/>
       </w:pPr>
       <w:r>
-        <w:rPr>
-          <w:rFonts w:ascii="Calibri" w:hAnsi="Calibri"/>
-        </w:rPr>
-        <w:t>Download Visual Studio Code from https://code.visualstudio.com/.</w:t>
+        <w:t>Test News Desk navigation, consistent, contradicting, and abstention samples, extractive summary, explanations, JSON/PDF/CSV exports, invalid input, session isolation, desktop/mobile layout, and public access.</w:t>
       </w:r>
     </w:p>
     <w:p>
@@ -1320,1405 +1173,56 @@
         <w:pStyle w:val="ListNumber"/>
       </w:pPr>
       <w:r>
-        <w:rPr>
-          <w:rFonts w:ascii="Calibri" w:hAnsi="Calibri"/>
-        </w:rPr>
-        <w:t>Install and open VS Code.</w:t>
-      </w:r>
-    </w:p>
-    <w:p>
-      <w:pPr>
-        <w:pStyle w:val="ListNumber"/>
-      </w:pPr>
-      <w:r>
-        <w:rPr>
-          <w:rFonts w:ascii="Calibri" w:hAnsi="Calibri"/>
-        </w:rPr>
-        <w:t>Open Extensions (Ctrl+Shift+X).</w:t>
-      </w:r>
-    </w:p>
-    <w:p>
-      <w:pPr>
-        <w:pStyle w:val="ListNumber"/>
-      </w:pPr>
-      <w:r>
-        <w:rPr>
-          <w:rFonts w:ascii="Calibri" w:hAnsi="Calibri"/>
-        </w:rPr>
-        <w:t>Install the Microsoft 'Python' extension.</w:t>
-      </w:r>
-    </w:p>
-    <w:p>
-      <w:pPr>
-        <w:pStyle w:val="ListNumber"/>
-      </w:pPr>
-      <w:r>
-        <w:rPr>
-          <w:rFonts w:ascii="Calibri" w:hAnsi="Calibri"/>
-        </w:rPr>
-        <w:t>Optionally install Jupyter to open the packaged notebooks.</w:t>
+        <w:t>Confirm the UI does not expose the dataset ZIP or raw training rows.</w:t>
       </w:r>
     </w:p>
     <w:p>
       <w:r>
-        <w:br w:type="page"/>
-      </w:r>
-    </w:p>
-    <w:p>
-      <w:pPr>
-        <w:pStyle w:val="Heading1"/>
-        <w:keepNext/>
-      </w:pPr>
-      <w:r>
-        <w:t>4. Extract and open the project</w:t>
-      </w:r>
-    </w:p>
-    <w:p>
-      <w:pPr>
-        <w:pStyle w:val="ListNumber"/>
-      </w:pPr>
-      <w:r>
-        <w:rPr>
-          <w:rFonts w:ascii="Calibri" w:hAnsi="Calibri"/>
-        </w:rPr>
-        <w:t>Clone the public NewsLens-AI repository or download its source archive.</w:t>
-      </w:r>
-    </w:p>
-    <w:p>
-      <w:pPr>
-        <w:pStyle w:val="ListNumber"/>
-      </w:pPr>
-      <w:r>
-        <w:rPr>
-          <w:rFonts w:ascii="Calibri" w:hAnsi="Calibri"/>
-        </w:rPr>
-        <w:t>Extract it to a short path such as C:\Projects when using a ZIP.</w:t>
-      </w:r>
-    </w:p>
-    <w:p>
-      <w:pPr>
-        <w:pStyle w:val="ListNumber"/>
-      </w:pPr>
-      <w:r>
-        <w:rPr>
-          <w:rFonts w:ascii="Calibri" w:hAnsi="Calibri"/>
-        </w:rPr>
-        <w:t>In VS Code select File &gt; Open Folder.</w:t>
-      </w:r>
-    </w:p>
-    <w:p>
-      <w:pPr>
-        <w:pStyle w:val="ListNumber"/>
-      </w:pPr>
-      <w:r>
-        <w:rPr>
-          <w:rFonts w:ascii="Calibri" w:hAnsi="Calibri"/>
-        </w:rPr>
-        <w:t>Open the NewsLens-AI folder that directly contains app.py.</w:t>
-      </w:r>
-    </w:p>
-    <w:p>
-      <w:pPr>
-        <w:pStyle w:val="ListNumber"/>
-      </w:pPr>
-      <w:r>
-        <w:rPr>
-          <w:rFonts w:ascii="Calibri" w:hAnsi="Calibri"/>
-        </w:rPr>
-        <w:t>Choose Terminal &gt; New Terminal.</w:t>
-      </w:r>
-    </w:p>
-    <w:p>
-      <w:pPr>
-        <w:spacing w:before="80" w:after="140" w:line="259" w:lineRule="auto"/>
-        <w:ind w:left="173" w:right="173"/>
-        <w:shd w:fill="F3EBDD"/>
-        <w:pBdr>
-          <w:left w:val="single" w:sz="20" w:space="8" w:color="8A693D"/>
-          <w:top w:val="single" w:sz="4" w:space="5" w:color="D6CEC2"/>
-          <w:bottom w:val="single" w:sz="4" w:space="5" w:color="D6CEC2"/>
-          <w:right w:val="single" w:sz="4" w:space="5" w:color="D6CEC2"/>
-        </w:pBdr>
-      </w:pPr>
-      <w:r>
-        <w:rPr>
-          <w:rFonts w:ascii="Calibri" w:hAnsi="Calibri"/>
-          <w:b/>
-          <w:color w:val="8A693D"/>
-          <w:sz w:val="19"/>
-        </w:rPr>
-        <w:t xml:space="preserve">Common folder mistake: </w:t>
-      </w:r>
-      <w:r>
-        <w:rPr>
-          <w:rFonts w:ascii="Calibri" w:hAnsi="Calibri"/>
-          <w:color w:val="1A1917"/>
-          <w:sz w:val="19"/>
-        </w:rPr>
-        <w:t>If the terminal cannot find app.py or requirements-lite.txt, you opened the parent extraction folder. Open the folder containing those files.</w:t>
-      </w:r>
-    </w:p>
-    <w:p>
-      <w:pPr>
-        <w:pStyle w:val="Heading1"/>
-        <w:keepNext/>
-      </w:pPr>
-      <w:r>
-        <w:t>5. Create and activate a virtual environment</w:t>
-      </w:r>
-    </w:p>
-    <w:p>
-      <w:pPr>
-        <w:pStyle w:val="CodeBlock"/>
-        <w:keepLines/>
-        <w:shd w:fill="EEF3F8"/>
-      </w:pPr>
-      <w:r>
-        <w:rPr>
-          <w:rFonts w:ascii="Consolas" w:hAnsi="Consolas"/>
-          <w:color w:val="2A241F"/>
-          <w:sz w:val="17"/>
-        </w:rPr>
-        <w:t>py -3.12 -m venv .venv</w:t>
+        <w:t>Vercel is not required and must not be created or modified for this deployment.</w:t>
       </w:r>
     </w:p>
     <w:p>
       <w:pPr>
         <w:pStyle w:val="Heading2"/>
-        <w:keepNext/>
       </w:pPr>
       <w:r>
-        <w:t>5.1 Windows PowerShell</w:t>
+        <w:t>Failure behavior</w:t>
+      </w:r>
+    </w:p>
+    <w:p>
+      <w:r>
+        <w:t>Missing model files raise an actionable startup error. A calibration/model hash mismatch fails closed and forces review rather than reporting unverified confidence. Inputs outside the paired-ledger format abstain.</w:t>
       </w:r>
     </w:p>
     <w:p>
       <w:pPr>
-        <w:pStyle w:val="CodeBlock"/>
-        <w:keepLines/>
-        <w:shd w:fill="EEF3F8"/>
+        <w:sectPr>
+          <w:pgSz w:w="12240" w:h="15840"/>
+          <w:pgMar w:top="979" w:right="1037" w:bottom="936" w:left="1123" w:header="720" w:footer="720" w:gutter="0"/>
+          <w:cols w:space="720"/>
+          <w:docGrid w:linePitch="360"/>
+        </w:sectPr>
+      </w:pPr>
+    </w:p>
+    <w:p>
+      <w:pPr>
+        <w:pStyle w:val="Heading1"/>
       </w:pPr>
       <w:r>
-        <w:rPr>
-          <w:rFonts w:ascii="Consolas" w:hAnsi="Consolas"/>
-          <w:color w:val="2A241F"/>
-          <w:sz w:val="17"/>
-        </w:rPr>
-        <w:t>.venv\Scripts\Activate.ps1</w:t>
+        <w:t>Phase 5S Deployment Checkpoint</w:t>
+      </w:r>
+    </w:p>
+    <w:p>
+      <w:r>
+        <w:t>Updated: 26 September 2026</w:t>
       </w:r>
     </w:p>
     <w:p>
       <w:pPr>
         <w:pStyle w:val="Heading2"/>
-        <w:keepNext/>
       </w:pPr>
       <w:r>
-        <w:t>5.2 Windows Command Prompt</w:t>
-      </w:r>
-    </w:p>
-    <w:p>
-      <w:pPr>
-        <w:pStyle w:val="CodeBlock"/>
-        <w:keepLines/>
-        <w:shd w:fill="EEF3F8"/>
-      </w:pPr>
-      <w:r>
-        <w:rPr>
-          <w:rFonts w:ascii="Consolas" w:hAnsi="Consolas"/>
-          <w:color w:val="2A241F"/>
-          <w:sz w:val="17"/>
-        </w:rPr>
-        <w:t>.venv\Scripts\activate.bat</w:t>
-      </w:r>
-    </w:p>
-    <w:p>
-      <w:pPr>
-        <w:pStyle w:val="Heading2"/>
-        <w:keepNext/>
-      </w:pPr>
-      <w:r>
-        <w:t>5.3 Linux or macOS</w:t>
-      </w:r>
-    </w:p>
-    <w:p>
-      <w:pPr>
-        <w:pStyle w:val="CodeBlock"/>
-        <w:keepLines/>
-        <w:shd w:fill="EEF3F8"/>
-      </w:pPr>
-      <w:r>
-        <w:t>python3.12 -m venv .venv</w:t>
-        <w:br/>
-        <w:t>source .venv/bin/activate</w:t>
-      </w:r>
-    </w:p>
-    <w:p>
-      <w:r>
-        <w:rPr>
-          <w:rFonts w:ascii="Calibri" w:hAnsi="Calibri"/>
-        </w:rPr>
-        <w:t>A successful activation normally shows (.venv) at the left of the terminal prompt.</w:t>
-      </w:r>
-    </w:p>
-    <w:p>
-      <w:pPr>
-        <w:pStyle w:val="Heading1"/>
-        <w:keepNext/>
-      </w:pPr>
-      <w:r>
-        <w:t>6. Select the VS Code interpreter</w:t>
-      </w:r>
-    </w:p>
-    <w:p>
-      <w:pPr>
-        <w:pStyle w:val="ListNumber"/>
-      </w:pPr>
-      <w:r>
-        <w:rPr>
-          <w:rFonts w:ascii="Calibri" w:hAnsi="Calibri"/>
-        </w:rPr>
-        <w:t>Press Ctrl+Shift+P.</w:t>
-      </w:r>
-    </w:p>
-    <w:p>
-      <w:pPr>
-        <w:pStyle w:val="ListNumber"/>
-      </w:pPr>
-      <w:r>
-        <w:rPr>
-          <w:rFonts w:ascii="Calibri" w:hAnsi="Calibri"/>
-        </w:rPr>
-        <w:t>Run 'Python: Select Interpreter'.</w:t>
-      </w:r>
-    </w:p>
-    <w:p>
-      <w:pPr>
-        <w:pStyle w:val="ListNumber"/>
-      </w:pPr>
-      <w:r>
-        <w:rPr>
-          <w:rFonts w:ascii="Calibri" w:hAnsi="Calibri"/>
-        </w:rPr>
-        <w:t>Choose the interpreter inside .venv.</w:t>
-      </w:r>
-    </w:p>
-    <w:p>
-      <w:pPr>
-        <w:pStyle w:val="ListNumber"/>
-      </w:pPr>
-      <w:r>
-        <w:rPr>
-          <w:rFonts w:ascii="Calibri" w:hAnsi="Calibri"/>
-        </w:rPr>
-        <w:t>Open a new terminal and confirm the path.</w:t>
-      </w:r>
-    </w:p>
-    <w:p>
-      <w:pPr>
-        <w:pStyle w:val="CodeBlock"/>
-        <w:keepLines/>
-        <w:shd w:fill="EEF3F8"/>
-      </w:pPr>
-      <w:r>
-        <w:rPr>
-          <w:rFonts w:ascii="Consolas" w:hAnsi="Consolas"/>
-          <w:color w:val="2A241F"/>
-          <w:sz w:val="17"/>
-        </w:rPr>
-        <w:t>python --version</w:t>
-        <w:br/>
-        <w:t>python -c "import sys; print(sys.executable)"</w:t>
-      </w:r>
-    </w:p>
-    <w:p>
-      <w:r>
-        <w:br w:type="page"/>
-      </w:r>
-    </w:p>
-    <w:p>
-      <w:pPr>
-        <w:pStyle w:val="Heading1"/>
-        <w:keepNext/>
-      </w:pPr>
-      <w:r>
-        <w:t>7. Upgrade pip and install dependencies</w:t>
-      </w:r>
-    </w:p>
-    <w:p>
-      <w:pPr>
-        <w:pStyle w:val="CodeBlock"/>
-        <w:keepLines/>
-        <w:shd w:fill="EEF3F8"/>
-      </w:pPr>
-      <w:r>
-        <w:rPr>
-          <w:rFonts w:ascii="Consolas" w:hAnsi="Consolas"/>
-          <w:color w:val="2A241F"/>
-          <w:sz w:val="17"/>
-        </w:rPr>
-        <w:t>python -m pip install --upgrade pip</w:t>
-        <w:br/>
-        <w:t>pip install -r requirements-lite.txt</w:t>
-      </w:r>
-    </w:p>
-    <w:p>
-      <w:r>
-        <w:rPr>
-          <w:rFonts w:ascii="Calibri" w:hAnsi="Calibri"/>
-        </w:rPr>
-        <w:t>The lightweight file installs Streamlit, pandas, NumPy, scikit-learn, Joblib, Plotly, Matplotlib, Seaborn, URL/PDF libraries, ReportLab and pytest. It excludes PyTorch and Transformers.</w:t>
-      </w:r>
-    </w:p>
-    <w:p>
-      <w:pPr>
-        <w:pStyle w:val="Heading1"/>
-        <w:keepNext/>
-      </w:pPr>
-      <w:r>
-        <w:t>8. Optional abstractive dependencies</w:t>
-      </w:r>
-    </w:p>
-    <w:p>
-      <w:pPr>
-        <w:pStyle w:val="CodeBlock"/>
-        <w:keepLines/>
-        <w:shd w:fill="EEF3F8"/>
-      </w:pPr>
-      <w:r>
-        <w:rPr>
-          <w:rFonts w:ascii="Consolas" w:hAnsi="Consolas"/>
-          <w:color w:val="2A241F"/>
-          <w:sz w:val="17"/>
-        </w:rPr>
-        <w:t>pip install -r requirements.txt</w:t>
-      </w:r>
-    </w:p>
-    <w:p>
-      <w:pPr>
-        <w:spacing w:before="80" w:after="140" w:line="259" w:lineRule="auto"/>
-        <w:ind w:left="173" w:right="173"/>
-        <w:shd w:fill="EDE6DD"/>
-        <w:pBdr>
-          <w:left w:val="single" w:sz="20" w:space="8" w:color="806A5A"/>
-          <w:top w:val="single" w:sz="4" w:space="5" w:color="D6CEC2"/>
-          <w:bottom w:val="single" w:sz="4" w:space="5" w:color="D6CEC2"/>
-          <w:right w:val="single" w:sz="4" w:space="5" w:color="D6CEC2"/>
-        </w:pBdr>
-      </w:pPr>
-      <w:r>
-        <w:rPr>
-          <w:rFonts w:ascii="Calibri" w:hAnsi="Calibri"/>
-          <w:b/>
-          <w:color w:val="806A5A"/>
-          <w:sz w:val="19"/>
-        </w:rPr>
-        <w:t xml:space="preserve">First-use download: </w:t>
-      </w:r>
-      <w:r>
-        <w:rPr>
-          <w:rFonts w:ascii="Calibri" w:hAnsi="Calibri"/>
-          <w:color w:val="1A1917"/>
-          <w:sz w:val="19"/>
-        </w:rPr>
-        <w:t>Selecting Abstractive - DistilBART downloads sshleifer/distilbart-cnn-6-6. Keep Extractive selected if the download, disk, RAM or CPU time is unsuitable.</w:t>
-      </w:r>
-    </w:p>
-    <w:p>
-      <w:pPr>
-        <w:pStyle w:val="Heading1"/>
-        <w:keepNext/>
-      </w:pPr>
-      <w:r>
-        <w:t>9. Start Streamlit</w:t>
-      </w:r>
-    </w:p>
-    <w:p>
-      <w:pPr>
-        <w:pStyle w:val="CodeBlock"/>
-        <w:keepLines/>
-        <w:shd w:fill="EEF3F8"/>
-      </w:pPr>
-      <w:r>
-        <w:rPr>
-          <w:rFonts w:ascii="Consolas" w:hAnsi="Consolas"/>
-          <w:color w:val="2A241F"/>
-          <w:sz w:val="17"/>
-        </w:rPr>
-        <w:t>streamlit run app.py</w:t>
-      </w:r>
-    </w:p>
-    <w:p>
-      <w:r>
-        <w:rPr>
-          <w:rFonts w:ascii="Calibri" w:hAnsi="Calibri"/>
-        </w:rPr>
-        <w:t>If the `streamlit` command is not recognised, run the module form below. Both commands start the same application.</w:t>
-      </w:r>
-    </w:p>
-    <w:p>
-      <w:pPr>
-        <w:pStyle w:val="CodeBlock"/>
-        <w:keepLines/>
-        <w:shd w:fill="EEF3F8"/>
-      </w:pPr>
-      <w:r>
-        <w:rPr>
-          <w:rFonts w:ascii="Consolas" w:hAnsi="Consolas"/>
-          <w:color w:val="2A241F"/>
-          <w:sz w:val="17"/>
-        </w:rPr>
-        <w:t>python -m streamlit run app.py</w:t>
-      </w:r>
-    </w:p>
-    <w:p>
-      <w:r>
-        <w:rPr>
-          <w:rFonts w:ascii="Calibri" w:hAnsi="Calibri"/>
-        </w:rPr>
-        <w:t>Open http://localhost:8501 if the browser does not open automatically. Keep the terminal running while using the application.</w:t>
-      </w:r>
-    </w:p>
-    <w:p>
-      <w:pPr>
-        <w:keepNext/>
-        <w:pageBreakBefore/>
-        <w:spacing w:after="40"/>
-        <w:jc w:val="center"/>
-      </w:pPr>
-      <w:r>
-        <w:drawing>
-          <wp:inline xmlns:a="http://schemas.openxmlformats.org/drawingml/2006/main" xmlns:pic="http://schemas.openxmlformats.org/drawingml/2006/picture">
-            <wp:extent cx="5669280" cy="3543300"/>
-            <wp:docPr id="33" name="Picture 33" descr="Figure S.1. News Desk." title="Figure S.1. News Desk."/>
-            <wp:cNvGraphicFramePr>
-              <a:graphicFrameLocks noChangeAspect="1"/>
-            </wp:cNvGraphicFramePr>
-            <a:graphic>
-              <a:graphicData uri="http://schemas.openxmlformats.org/drawingml/2006/picture">
-                <pic:pic>
-                  <pic:nvPicPr>
-                    <pic:cNvPr id="0" name="01_home.png"/>
-                    <pic:cNvPicPr/>
-                  </pic:nvPicPr>
-                  <pic:blipFill>
-                    <a:blip r:embed="rId14"/>
-                    <a:stretch>
-                      <a:fillRect/>
-                    </a:stretch>
-                  </pic:blipFill>
-                  <pic:spPr>
-                    <a:xfrm>
-                      <a:off x="0" y="0"/>
-                      <a:ext cx="5669280" cy="3543300"/>
-                    </a:xfrm>
-                    <a:prstGeom prst="rect"/>
-                  </pic:spPr>
-                </pic:pic>
-              </a:graphicData>
-            </a:graphic>
-          </wp:inline>
-        </w:drawing>
-      </w:r>
-    </w:p>
-    <w:p>
-      <w:pPr>
-        <w:pStyle w:val="Caption"/>
-        <w:keepNext w:val="0"/>
-      </w:pPr>
-      <w:r>
-        <w:rPr>
-          <w:rFonts w:ascii="Calibri" w:hAnsi="Calibri"/>
-          <w:i/>
-          <w:color w:val="6F685F"/>
-          <w:sz w:val="18"/>
-        </w:rPr>
-        <w:t>Figure S.1. News Desk.</w:t>
-      </w:r>
-    </w:p>
-    <w:p>
-      <w:r>
-        <w:rPr>
-          <w:rFonts w:ascii="Calibri" w:hAnsi="Calibri"/>
-        </w:rPr>
-        <w:t>The landing view presents the masthead, exact project boundary, primary/archive actions, original local artwork and technical information strip.</w:t>
-      </w:r>
-    </w:p>
-    <w:p>
-      <w:pPr>
-        <w:pStyle w:val="Heading1"/>
-        <w:keepNext/>
-      </w:pPr>
-      <w:r>
-        <w:t>10. Analyse the first sample article</w:t>
-      </w:r>
-    </w:p>
-    <w:p>
-      <w:pPr>
-        <w:pStyle w:val="ListNumber"/>
-      </w:pPr>
-      <w:r>
-        <w:rPr>
-          <w:rFonts w:ascii="Calibri" w:hAnsi="Calibri"/>
-        </w:rPr>
-        <w:t>Select Analyse Article in the top navigation.</w:t>
-      </w:r>
-    </w:p>
-    <w:p>
-      <w:pPr>
-        <w:pStyle w:val="ListNumber"/>
-      </w:pPr>
-      <w:r>
-        <w:rPr>
-          <w:rFonts w:ascii="Calibri" w:hAnsi="Calibri"/>
-        </w:rPr>
-        <w:t>Keep Paste text selected.</w:t>
-      </w:r>
-    </w:p>
-    <w:p>
-      <w:pPr>
-        <w:pStyle w:val="ListNumber"/>
-      </w:pPr>
-      <w:r>
-        <w:rPr>
-          <w:rFonts w:ascii="Calibri" w:hAnsi="Calibri"/>
-        </w:rPr>
-        <w:t>Select Load packaged sample or paste one of the files from data/sample.</w:t>
-      </w:r>
-    </w:p>
-    <w:p>
-      <w:pPr>
-        <w:pStyle w:val="ListNumber"/>
-      </w:pPr>
-      <w:r>
-        <w:rPr>
-          <w:rFonts w:ascii="Calibri" w:hAnsi="Calibri"/>
-        </w:rPr>
-        <w:t>Choose Extractive - TF-IDF centroid and Short.</w:t>
-      </w:r>
-    </w:p>
-    <w:p>
-      <w:pPr>
-        <w:pStyle w:val="ListNumber"/>
-      </w:pPr>
-      <w:r>
-        <w:rPr>
-          <w:rFonts w:ascii="Calibri" w:hAnsi="Calibri"/>
-        </w:rPr>
-        <w:t>Select Analyse Article.</w:t>
-      </w:r>
-    </w:p>
-    <w:p>
-      <w:pPr>
-        <w:pStyle w:val="ListNumber"/>
-      </w:pPr>
-      <w:r>
-        <w:rPr>
-          <w:rFonts w:ascii="Calibri" w:hAnsi="Calibri"/>
-        </w:rPr>
-        <w:t>Read the summary and credibility verdict together.</w:t>
-      </w:r>
-    </w:p>
-    <w:p>
-      <w:pPr>
-        <w:pStyle w:val="ListNumber"/>
-      </w:pPr>
-      <w:r>
-        <w:rPr>
-          <w:rFonts w:ascii="Calibri" w:hAnsi="Calibri"/>
-        </w:rPr>
-        <w:t>Inspect local terms and the disclaimer.</w:t>
-      </w:r>
-    </w:p>
-    <w:p>
-      <w:pPr>
-        <w:pStyle w:val="ListNumber"/>
-      </w:pPr>
-      <w:r>
-        <w:rPr>
-          <w:rFonts w:ascii="Calibri" w:hAnsi="Calibri"/>
-        </w:rPr>
-        <w:t>Download JSON or PDF, then open Editorial Archive.</w:t>
-      </w:r>
-    </w:p>
-    <w:p>
-      <w:pPr>
-        <w:keepNext/>
-        <w:pageBreakBefore/>
-        <w:spacing w:after="40"/>
-        <w:jc w:val="center"/>
-      </w:pPr>
-      <w:r>
-        <w:drawing>
-          <wp:inline xmlns:a="http://schemas.openxmlformats.org/drawingml/2006/main" xmlns:pic="http://schemas.openxmlformats.org/drawingml/2006/picture">
-            <wp:extent cx="5669280" cy="3937000"/>
-            <wp:docPr id="34" name="Picture 34" descr="Figure S.2. Populated article input." title="Figure S.2. Populated article input."/>
-            <wp:cNvGraphicFramePr>
-              <a:graphicFrameLocks noChangeAspect="1"/>
-            </wp:cNvGraphicFramePr>
-            <a:graphic>
-              <a:graphicData uri="http://schemas.openxmlformats.org/drawingml/2006/picture">
-                <pic:pic>
-                  <pic:nvPicPr>
-                    <pic:cNvPr id="0" name="image.png"/>
-                    <pic:cNvPicPr/>
-                  </pic:nvPicPr>
-                  <pic:blipFill>
-                    <a:blip r:embed="rId11"/>
-                    <a:stretch>
-                      <a:fillRect/>
-                    </a:stretch>
-                  </pic:blipFill>
-                  <pic:spPr>
-                    <a:xfrm>
-                      <a:off x="0" y="0"/>
-                      <a:ext cx="5669280" cy="3937000"/>
-                    </a:xfrm>
-                    <a:prstGeom prst="rect"/>
-                  </pic:spPr>
-                </pic:pic>
-              </a:graphicData>
-            </a:graphic>
-          </wp:inline>
-        </w:drawing>
-      </w:r>
-    </w:p>
-    <w:p>
-      <w:pPr>
-        <w:pStyle w:val="Caption"/>
-        <w:keepNext w:val="0"/>
-      </w:pPr>
-      <w:r>
-        <w:rPr>
-          <w:rFonts w:ascii="Calibri" w:hAnsi="Calibri"/>
-          <w:i/>
-          <w:color w:val="6F685F"/>
-          <w:sz w:val="18"/>
-        </w:rPr>
-        <w:t>Figure S.2. Populated article input.</w:t>
-      </w:r>
-    </w:p>
-    <w:p>
-      <w:r>
-        <w:rPr>
-          <w:rFonts w:ascii="Calibri" w:hAnsi="Calibri"/>
-        </w:rPr>
-        <w:t>Input method, article fields and summary controls share one responsive editorial workspace.</w:t>
-      </w:r>
-    </w:p>
-    <w:p>
-      <w:pPr>
-        <w:keepNext/>
-        <w:pageBreakBefore/>
-        <w:spacing w:after="40"/>
-        <w:jc w:val="center"/>
-      </w:pPr>
-      <w:r>
-        <w:drawing>
-          <wp:inline xmlns:a="http://schemas.openxmlformats.org/drawingml/2006/main" xmlns:pic="http://schemas.openxmlformats.org/drawingml/2006/picture">
-            <wp:extent cx="5669280" cy="3661410"/>
-            <wp:docPr id="35" name="Picture 35" descr="Figure S.3. Analysis result." title="Figure S.3. Analysis result."/>
-            <wp:cNvGraphicFramePr>
-              <a:graphicFrameLocks noChangeAspect="1"/>
-            </wp:cNvGraphicFramePr>
-            <a:graphic>
-              <a:graphicData uri="http://schemas.openxmlformats.org/drawingml/2006/picture">
-                <pic:pic>
-                  <pic:nvPicPr>
-                    <pic:cNvPr id="0" name="03_summary_and_risk_results.png"/>
-                    <pic:cNvPicPr/>
-                  </pic:nvPicPr>
-                  <pic:blipFill>
-                    <a:blip r:embed="rId19"/>
-                    <a:stretch>
-                      <a:fillRect/>
-                    </a:stretch>
-                  </pic:blipFill>
-                  <pic:spPr>
-                    <a:xfrm>
-                      <a:off x="0" y="0"/>
-                      <a:ext cx="5669280" cy="3661410"/>
-                    </a:xfrm>
-                    <a:prstGeom prst="rect"/>
-                  </pic:spPr>
-                </pic:pic>
-              </a:graphicData>
-            </a:graphic>
-          </wp:inline>
-        </w:drawing>
-      </w:r>
-    </w:p>
-    <w:p>
-      <w:pPr>
-        <w:pStyle w:val="Caption"/>
-        <w:keepNext w:val="0"/>
-      </w:pPr>
-      <w:r>
-        <w:rPr>
-          <w:rFonts w:ascii="Calibri" w:hAnsi="Calibri"/>
-          <w:i/>
-          <w:color w:val="6F685F"/>
-          <w:sz w:val="18"/>
-        </w:rPr>
-        <w:t>Figure S.3. Analysis result.</w:t>
-      </w:r>
-    </w:p>
-    <w:p>
-      <w:r>
-        <w:rPr>
-          <w:rFonts w:ascii="Calibri" w:hAnsi="Calibri"/>
-        </w:rPr>
-        <w:t>Word counts, compression, executive summary, textual verdict, probability/confidence and responsible interpretation are presented as one editorial report.</w:t>
-      </w:r>
-    </w:p>
-    <w:p>
-      <w:pPr>
-        <w:keepNext/>
-        <w:pageBreakBefore/>
-        <w:spacing w:after="40"/>
-        <w:jc w:val="center"/>
-      </w:pPr>
-      <w:r>
-        <w:drawing>
-          <wp:inline xmlns:a="http://schemas.openxmlformats.org/drawingml/2006/main" xmlns:pic="http://schemas.openxmlformats.org/drawingml/2006/picture">
-            <wp:extent cx="5669280" cy="3700780"/>
-            <wp:docPr id="36" name="Picture 36" descr="Figure S.4. Explanation and exports." title="Figure S.4. Explanation and exports."/>
-            <wp:cNvGraphicFramePr>
-              <a:graphicFrameLocks noChangeAspect="1"/>
-            </wp:cNvGraphicFramePr>
-            <a:graphic>
-              <a:graphicData uri="http://schemas.openxmlformats.org/drawingml/2006/picture">
-                <pic:pic>
-                  <pic:nvPicPr>
-                    <pic:cNvPr id="0" name="04_explainability_and_downloads.png"/>
-                    <pic:cNvPicPr/>
-                  </pic:nvPicPr>
-                  <pic:blipFill>
-                    <a:blip r:embed="rId12"/>
-                    <a:stretch>
-                      <a:fillRect/>
-                    </a:stretch>
-                  </pic:blipFill>
-                  <pic:spPr>
-                    <a:xfrm>
-                      <a:off x="0" y="0"/>
-                      <a:ext cx="5669280" cy="3700780"/>
-                    </a:xfrm>
-                    <a:prstGeom prst="rect"/>
-                  </pic:spPr>
-                </pic:pic>
-              </a:graphicData>
-            </a:graphic>
-          </wp:inline>
-        </w:drawing>
-      </w:r>
-    </w:p>
-    <w:p>
-      <w:pPr>
-        <w:pStyle w:val="Caption"/>
-        <w:keepNext w:val="0"/>
-      </w:pPr>
-      <w:r>
-        <w:rPr>
-          <w:rFonts w:ascii="Calibri" w:hAnsi="Calibri"/>
-          <w:i/>
-          <w:color w:val="6F685F"/>
-          <w:sz w:val="18"/>
-        </w:rPr>
-        <w:t>Figure S.4. Explanation and exports.</w:t>
-      </w:r>
-    </w:p>
-    <w:p>
-      <w:r>
-        <w:rPr>
-          <w:rFonts w:ascii="Calibri" w:hAnsi="Calibri"/>
-        </w:rPr>
-        <w:t>Muted green and oxblood bars oppose/support the misleading class; they are model correlations, not factual evidence.</w:t>
-      </w:r>
-    </w:p>
-    <w:p>
-      <w:r>
-        <w:br w:type="page"/>
-      </w:r>
-    </w:p>
-    <w:p>
-      <w:pPr>
-        <w:pStyle w:val="Heading1"/>
-        <w:keepNext/>
-      </w:pPr>
-      <w:r>
-        <w:t>11. Stop, restart and change the port</w:t>
-      </w:r>
-    </w:p>
-    <w:p>
-      <w:r>
-        <w:rPr>
-          <w:rFonts w:ascii="Calibri" w:hAnsi="Calibri"/>
-        </w:rPr>
-        <w:t>Press Ctrl+C in the Streamlit terminal to stop the server. Restart with the same run command after reactivating .venv. If port 8501 is busy, choose another port.</w:t>
-      </w:r>
-    </w:p>
-    <w:p>
-      <w:pPr>
-        <w:pStyle w:val="CodeBlock"/>
-        <w:keepLines/>
-        <w:shd w:fill="EEF3F8"/>
-      </w:pPr>
-      <w:r>
-        <w:rPr>
-          <w:rFonts w:ascii="Consolas" w:hAnsi="Consolas"/>
-          <w:color w:val="2A241F"/>
-          <w:sz w:val="17"/>
-        </w:rPr>
-        <w:t>python -m streamlit run app.py --server.port 8502</w:t>
-      </w:r>
-    </w:p>
-    <w:p>
-      <w:pPr>
-        <w:pStyle w:val="Heading1"/>
-        <w:keepNext/>
-      </w:pPr>
-      <w:r>
-        <w:t>12. Dataset download and placement</w:t>
-      </w:r>
-    </w:p>
-    <w:p>
-      <w:r>
-        <w:t>The private/local application runs with the packaged Joblib and its hash-matched private confidence_calibration.json. Runtime never retrains. Raw datasets are needed only for authorised offline reproduction and must remain Git-ignored/private.</w:t>
-      </w:r>
-    </w:p>
-    <w:p>
-      <w:pPr>
-        <w:pStyle w:val="CodeBlock"/>
-        <w:keepLines/>
-        <w:shd w:fill="EEF3F8"/>
-      </w:pPr>
-      <w:r>
-        <w:rPr>
-          <w:rFonts w:ascii="Consolas" w:hAnsi="Consolas"/>
-          <w:color w:val="2A241F"/>
-          <w:sz w:val="17"/>
-        </w:rPr>
-        <w:t>python training/download_data.py --dataset all</w:t>
-      </w:r>
-    </w:p>
-    <w:p>
-      <w:r>
-        <w:rPr>
-          <w:rFonts w:ascii="Calibri" w:hAnsi="Calibri"/>
-        </w:rPr>
-        <w:t>The script places True.csv, Fake.csv and xsum-test.parquet in data/raw. Manual users may place files there with the exact names. Dataset sources and redistribution cautions are documented in docs/DATASET_CARD.md.</w:t>
-      </w:r>
-    </w:p>
-    <w:p>
-      <w:pPr>
-        <w:pStyle w:val="Heading1"/>
-        <w:keepNext/>
-      </w:pPr>
-      <w:r>
-        <w:t>13. Optional offline training and controlled benchmark reproduction</w:t>
-      </w:r>
-    </w:p>
-    <w:p>
-      <w:pPr>
-        <w:pStyle w:val="CodeBlock"/>
-        <w:keepLines/>
-        <w:shd w:fill="EEF3F8"/>
-      </w:pPr>
-      <w:r>
-        <w:t># Offline development only; never called by Streamlit</w:t>
-        <w:br/>
-        <w:t>python training/train_fake_news_models.py</w:t>
-        <w:br/>
-        <w:t># Controlled evidence run; CSVs stay outside the public repository</w:t>
-        <w:br/>
-        <w:t>python training/benchmark_models.py --raw-dir /absolute/private/isot-directory</w:t>
-      </w:r>
-    </w:p>
-    <w:p>
-      <w:r>
-        <w:t>The original training command remains an offline research tool. The controlled benchmark first verifies the accepted production-model SHA-256 and 4,800-row reproduction evidence, then screens near-duplicates, preserves 19,200 training rows, uses 1,199 calibration and 1,200 policy rows, and reports once on a 2,399-row final test. It does not overwrite or retrain the packaged production model.</w:t>
-      </w:r>
-    </w:p>
-    <w:p>
-      <w:pPr>
-        <w:pStyle w:val="Heading1"/>
-        <w:keepNext/>
-      </w:pPr>
-      <w:r>
-        <w:t>14. Evaluate summarization</w:t>
-      </w:r>
-    </w:p>
-    <w:p>
-      <w:pPr>
-        <w:pStyle w:val="CodeBlock"/>
-        <w:keepLines/>
-        <w:shd w:fill="EEF3F8"/>
-      </w:pPr>
-      <w:r>
-        <w:rPr>
-          <w:rFonts w:ascii="Consolas" w:hAnsi="Consolas"/>
-          <w:color w:val="2A241F"/>
-          <w:sz w:val="17"/>
-        </w:rPr>
-        <w:t>python training/evaluate_summarizer.py --sample-size 150 --seed 42</w:t>
-      </w:r>
-    </w:p>
-    <w:p>
-      <w:r>
-        <w:rPr>
-          <w:rFonts w:ascii="Calibri" w:hAnsi="Calibri"/>
-        </w:rPr>
-        <w:t>This regenerates ROUGE-1/2/L, compression and latency on a fixed XSum test sample. Do not compare a different sample size without stating the change.</w:t>
-      </w:r>
-    </w:p>
-    <w:p>
-      <w:pPr>
-        <w:pStyle w:val="Heading1"/>
-        <w:keepNext/>
-      </w:pPr>
-      <w:r>
-        <w:t>15. Optional offline retraining with newly licensed data</w:t>
-      </w:r>
-    </w:p>
-    <w:p>
-      <w:pPr>
-        <w:pStyle w:val="ListNumber"/>
-      </w:pPr>
-      <w:r>
-        <w:rPr>
-          <w:rFonts w:ascii="Calibri" w:hAnsi="Calibri"/>
-        </w:rPr>
-        <w:t>Back up models/fake_news_pipeline.joblib and model_metadata.json.</w:t>
-      </w:r>
-    </w:p>
-    <w:p>
-      <w:pPr>
-        <w:pStyle w:val="ListNumber"/>
-      </w:pPr>
-      <w:r>
-        <w:rPr>
-          <w:rFonts w:ascii="Calibri" w:hAnsi="Calibri"/>
-        </w:rPr>
-        <w:t>Map new trustworthy labels to 0 reliable and 1 misleading.</w:t>
-      </w:r>
-    </w:p>
-    <w:p>
-      <w:pPr>
-        <w:pStyle w:val="ListNumber"/>
-      </w:pPr>
-      <w:r>
-        <w:rPr>
-          <w:rFonts w:ascii="Calibri" w:hAnsi="Calibri"/>
-        </w:rPr>
-        <w:t>Audit licence, duplicates, sources, topics, dates and annotation rules.</w:t>
-      </w:r>
-    </w:p>
-    <w:p>
-      <w:pPr>
-        <w:pStyle w:val="ListNumber"/>
-      </w:pPr>
-      <w:r>
-        <w:rPr>
-          <w:rFonts w:ascii="Calibri" w:hAnsi="Calibri"/>
-        </w:rPr>
-        <w:t>Modify preparation only if the new schema is documented.</w:t>
-      </w:r>
-    </w:p>
-    <w:p>
-      <w:pPr>
-        <w:pStyle w:val="ListNumber"/>
-      </w:pPr>
-      <w:r>
-        <w:rPr>
-          <w:rFonts w:ascii="Calibri" w:hAnsi="Calibri"/>
-        </w:rPr>
-        <w:t>Use group/time-aware validation where metadata permits.</w:t>
-      </w:r>
-    </w:p>
-    <w:p>
-      <w:pPr>
-        <w:pStyle w:val="ListNumber"/>
-      </w:pPr>
-      <w:r>
-        <w:rPr>
-          <w:rFonts w:ascii="Calibri" w:hAnsi="Calibri"/>
-        </w:rPr>
-        <w:t>Run tests and inspect new error analysis before replacing the packaged model.</w:t>
-      </w:r>
-    </w:p>
-    <w:p>
-      <w:r>
-        <w:br w:type="page"/>
-      </w:r>
-    </w:p>
-    <w:p>
-      <w:pPr>
-        <w:pStyle w:val="Heading1"/>
-        <w:keepNext/>
-      </w:pPr>
-      <w:r>
-        <w:t>16. Run automated tests</w:t>
-      </w:r>
-    </w:p>
-    <w:p>
-      <w:pPr>
-        <w:pStyle w:val="CodeBlock"/>
-        <w:keepLines/>
-        <w:shd w:fill="EEF3F8"/>
-      </w:pPr>
-      <w:r>
-        <w:rPr>
-          <w:rFonts w:ascii="Consolas" w:hAnsi="Consolas"/>
-          <w:color w:val="2A241F"/>
-          <w:sz w:val="17"/>
-        </w:rPr>
-        <w:t>python -m pytest -q -m "not private_model"</w:t>
-      </w:r>
-    </w:p>
-    <w:p>
-      <w:pPr>
-        <w:spacing w:before="80" w:after="140" w:line="259" w:lineRule="auto"/>
-        <w:ind w:left="173" w:right="173"/>
-        <w:shd w:fill="E8EEE8"/>
-        <w:pBdr>
-          <w:left w:val="single" w:sz="20" w:space="8" w:color="496454"/>
-          <w:top w:val="single" w:sz="4" w:space="5" w:color="D6CEC2"/>
-          <w:bottom w:val="single" w:sz="4" w:space="5" w:color="D6CEC2"/>
-          <w:right w:val="single" w:sz="4" w:space="5" w:color="D6CEC2"/>
-        </w:pBdr>
-      </w:pPr>
-      <w:r>
-        <w:t>Current public validation passes 144 tests with exactly four private-model tests deselected. The production presentation build, CI, pull-request dependency review and both CodeQL language analyses pass; CodeQL now uses Action v4. These checks do not establish zero open historical security alerts. The original 56-check private release and its five-width browser audit remain historical evidence. Public CI cannot reproduce private-runtime browser checks without the excluded artifacts.</w:t>
-      </w:r>
-    </w:p>
-    <w:p>
-      <w:pPr>
-        <w:pStyle w:val="Heading1"/>
-        <w:keepNext/>
-      </w:pPr>
-      <w:r>
-        <w:t>17. Target public deployment (currently blocked)</w:t>
-      </w:r>
-    </w:p>
-    <w:p>
-      <w:r>
-        <w:t>https://github.com/DevenGaikwad/NewsLens-AI is the canonical active public repository. The future Streamlit Community Cloud configuration is branch main, entrypoint app.py and root requirements.txt; Vercel uses web/ and exposes only NEXT_PUBLIC_STREAMLIT_APP_URL. The session history default is temporary visitor-isolated SQLite. No live deployment is claimed, and functional hosting must not proceed until a legally redistributable public model and complete rights chain are verified.</w:t>
-      </w:r>
-    </w:p>
-    <w:p>
-      <w:pPr>
-        <w:pStyle w:val="CodeBlock"/>
-        <w:keepLines/>
-        <w:shd w:fill="EEF3F8"/>
-      </w:pPr>
-      <w:r>
-        <w:rPr>
-          <w:rFonts w:ascii="Consolas" w:hAnsi="Consolas"/>
-          <w:color w:val="2A241F"/>
-          <w:sz w:val="17"/>
-        </w:rPr>
-        <w:t># Local verification before either deployment</w:t>
-        <w:br/>
-        <w:t>python -m pytest -q -m "not private_model"</w:t>
-        <w:br/>
-        <w:t>python -m streamlit run app.py</w:t>
-        <w:br/>
-        <w:br/>
-        <w:t># Vercel presentation shell</w:t>
-        <w:br/>
-        <w:t>cd web</w:t>
-        <w:br/>
-        <w:t>npm install</w:t>
-        <w:br/>
-        <w:t>npm run build</w:t>
-      </w:r>
-    </w:p>
-    <w:p>
-      <w:pPr>
-        <w:spacing w:before="80" w:after="140" w:line="259" w:lineRule="auto"/>
-        <w:ind w:left="173" w:right="173"/>
-        <w:shd w:fill="F3EBDD"/>
-        <w:pBdr>
-          <w:left w:val="single" w:sz="20" w:space="8" w:color="8A693D"/>
-          <w:top w:val="single" w:sz="4" w:space="5" w:color="D6CEC2"/>
-          <w:bottom w:val="single" w:sz="4" w:space="5" w:color="D6CEC2"/>
-          <w:right w:val="single" w:sz="4" w:space="5" w:color="D6CEC2"/>
-        </w:pBdr>
-      </w:pPr>
-      <w:r>
-        <w:t>Public-artifact and deployment gate: do not publish secrets, visitor data, generated databases, raw datasets, the private Joblib or confidence_calibration.json. The public repository excludes those artifacts and cannot currently run classification; do not retrain, mock or replace the model to bypass this gate. The sanitized source is published; final security sign-off still requires fresh restricted evidence, and functional hosting must remain blocked until a legally redistributable public model and complete rights chain are verified.</w:t>
-      </w:r>
-    </w:p>
-    <w:p>
-      <w:pPr>
-        <w:pStyle w:val="Heading1"/>
-        <w:keepNext/>
-      </w:pPr>
-      <w:r>
-        <w:t>18. Troubleshooting</w:t>
-      </w:r>
-    </w:p>
-    <w:p>
-      <w:pPr>
-        <w:pStyle w:val="Heading2"/>
-        <w:keepNext/>
-      </w:pPr>
-      <w:r>
-        <w:t>'streamlit' is not recognized</w:t>
-      </w:r>
-    </w:p>
-    <w:p>
-      <w:r>
-        <w:rPr>
-          <w:rFonts w:ascii="Calibri" w:hAnsi="Calibri"/>
-        </w:rPr>
-        <w:t>Activate .venv, then use `python -m streamlit run app.py`.</w:t>
-      </w:r>
-    </w:p>
-    <w:p>
-      <w:pPr>
-        <w:pStyle w:val="Heading2"/>
-        <w:keepNext/>
-      </w:pPr>
-      <w:r>
-        <w:t>ModuleNotFoundError</w:t>
-      </w:r>
-    </w:p>
-    <w:p>
-      <w:r>
-        <w:rPr>
-          <w:rFonts w:ascii="Calibri" w:hAnsi="Calibri"/>
-        </w:rPr>
-        <w:t>Confirm the selected interpreter is .venv and rerun pip install -r requirements-lite.txt.</w:t>
-      </w:r>
-    </w:p>
-    <w:p>
-      <w:pPr>
-        <w:pStyle w:val="Heading2"/>
-        <w:keepNext/>
-      </w:pPr>
-      <w:r>
-        <w:t>Wrong Python interpreter</w:t>
-      </w:r>
-    </w:p>
-    <w:p>
-      <w:r>
-        <w:rPr>
-          <w:rFonts w:ascii="Calibri" w:hAnsi="Calibri"/>
-        </w:rPr>
-        <w:t>Ctrl+Shift+P &gt; Python: Select Interpreter &gt; choose .venv.</w:t>
-      </w:r>
-    </w:p>
-    <w:p>
-      <w:pPr>
-        <w:pStyle w:val="Heading2"/>
-        <w:keepNext/>
-      </w:pPr>
-      <w:r>
-        <w:t>PowerShell execution policy</w:t>
-      </w:r>
-    </w:p>
-    <w:p>
-      <w:r>
-        <w:rPr>
-          <w:rFonts w:ascii="Calibri" w:hAnsi="Calibri"/>
-        </w:rPr>
-        <w:t>Use Command Prompt activation, or run `Set-ExecutionPolicy -Scope Process Bypass` only for the current window if institutional policy permits.</w:t>
-      </w:r>
-    </w:p>
-    <w:p>
-      <w:pPr>
-        <w:pStyle w:val="Heading2"/>
-        <w:keepNext/>
-      </w:pPr>
-      <w:r>
-        <w:t>Torch installation problem</w:t>
-      </w:r>
-    </w:p>
-    <w:p>
-      <w:r>
-        <w:rPr>
-          <w:rFonts w:ascii="Calibri" w:hAnsi="Calibri"/>
-        </w:rPr>
-        <w:t>Use requirements-lite.txt. Install the optional full file later; consult the official PyTorch selector for your CPU/OS.</w:t>
-      </w:r>
-    </w:p>
-    <w:p>
-      <w:pPr>
-        <w:pStyle w:val="Heading2"/>
-        <w:keepNext/>
-      </w:pPr>
-      <w:r>
-        <w:t>Transformer download problem</w:t>
-      </w:r>
-    </w:p>
-    <w:p>
-      <w:r>
-        <w:rPr>
-          <w:rFonts w:ascii="Calibri" w:hAnsi="Calibri"/>
-        </w:rPr>
-        <w:t>Check internet/disk, retry later, set HF_HOME to a writable folder, or use extractive mode.</w:t>
-      </w:r>
-    </w:p>
-    <w:p>
-      <w:pPr>
-        <w:pStyle w:val="Heading2"/>
-        <w:keepNext/>
-      </w:pPr>
-      <w:r>
-        <w:t>NLTK resource error</w:t>
-      </w:r>
-    </w:p>
-    <w:p>
-      <w:r>
-        <w:rPr>
-          <w:rFonts w:ascii="Calibri" w:hAnsi="Calibri"/>
-        </w:rPr>
-        <w:t>This project does not require downloaded NLTK tokenizers; ensure you are running the packaged code, not a tutorial copy.</w:t>
-      </w:r>
-    </w:p>
-    <w:p>
-      <w:pPr>
-        <w:pStyle w:val="Heading2"/>
-        <w:keepNext/>
-      </w:pPr>
-      <w:r>
-        <w:t>Missing dataset</w:t>
-      </w:r>
-    </w:p>
-    <w:p>
-      <w:r>
-        <w:rPr>
-          <w:rFonts w:ascii="Calibri" w:hAnsi="Calibri"/>
-        </w:rPr>
-        <w:t>Run training/download_data.py or place exact filenames under data/raw.</w:t>
-      </w:r>
-    </w:p>
-    <w:p>
-      <w:pPr>
-        <w:pStyle w:val="Heading2"/>
-        <w:keepNext/>
-      </w:pPr>
-      <w:r>
-        <w:t>Joblib model not found</w:t>
-      </w:r>
-    </w:p>
-    <w:p>
-      <w:r>
-        <w:rPr>
-          <w:rFonts w:ascii="Calibri" w:hAnsi="Calibri"/>
-        </w:rPr>
-        <w:t>Use only the owner-approved local model and its matching calibration. The public copy intentionally excludes both; do not retrain to bypass the deployment gate.</w:t>
-      </w:r>
-    </w:p>
-    <w:p>
-      <w:pPr>
-        <w:pStyle w:val="Heading2"/>
-        <w:keepNext/>
-      </w:pPr>
-      <w:r>
-        <w:t>Port already in use</w:t>
-      </w:r>
-    </w:p>
-    <w:p>
-      <w:r>
-        <w:rPr>
-          <w:rFonts w:ascii="Calibri" w:hAnsi="Calibri"/>
-        </w:rPr>
-        <w:t>Use --server.port 8502 or stop the old terminal with Ctrl+C.</w:t>
-      </w:r>
-    </w:p>
-    <w:p>
-      <w:pPr>
-        <w:pStyle w:val="Heading2"/>
-        <w:keepNext/>
-      </w:pPr>
-      <w:r>
-        <w:t>URL extraction failure</w:t>
-      </w:r>
-    </w:p>
-    <w:p>
-      <w:r>
-        <w:rPr>
-          <w:rFonts w:ascii="Calibri" w:hAnsi="Calibri"/>
-        </w:rPr>
-        <w:t>The site may be paywalled or blocking bots. Paste the article text directly.</w:t>
-      </w:r>
-    </w:p>
-    <w:p>
-      <w:pPr>
-        <w:pStyle w:val="Heading2"/>
-        <w:keepNext/>
-      </w:pPr>
-      <w:r>
-        <w:t>Browser does not open</w:t>
-      </w:r>
-    </w:p>
-    <w:p>
-      <w:r>
-        <w:rPr>
-          <w:rFonts w:ascii="Calibri" w:hAnsi="Calibri"/>
-        </w:rPr>
-        <w:t>Visit http://localhost:8501 manually.</w:t>
-      </w:r>
-    </w:p>
-    <w:p>
-      <w:pPr>
-        <w:pStyle w:val="Heading2"/>
-        <w:keepNext/>
-      </w:pPr>
-      <w:r>
-        <w:t>Blank Streamlit page</w:t>
-      </w:r>
-    </w:p>
-    <w:p>
-      <w:r>
-        <w:rPr>
-          <w:rFonts w:ascii="Calibri" w:hAnsi="Calibri"/>
-        </w:rPr>
-        <w:t>Hard refresh, inspect the terminal error, confirm project root, and clear only browser cache/session if needed.</w:t>
-      </w:r>
-    </w:p>
-    <w:p>
-      <w:pPr>
-        <w:pStyle w:val="Heading2"/>
-        <w:keepNext/>
-      </w:pPr>
-      <w:r>
-        <w:t>Windows path problem</w:t>
-      </w:r>
-    </w:p>
-    <w:p>
-      <w:r>
-        <w:rPr>
-          <w:rFonts w:ascii="Calibri" w:hAnsi="Calibri"/>
-        </w:rPr>
-        <w:t>Extract to a short local path without OneDrive permission conflicts; do not run directly inside the ZIP.</w:t>
-      </w:r>
-    </w:p>
-    <w:p>
-      <w:pPr>
-        <w:pStyle w:val="Heading2"/>
-        <w:keepNext/>
-      </w:pPr>
-      <w:r>
-        <w:t>PDF has no text</w:t>
-      </w:r>
-    </w:p>
-    <w:p>
-      <w:r>
-        <w:rPr>
-          <w:rFonts w:ascii="Calibri" w:hAnsi="Calibri"/>
-        </w:rPr>
-        <w:t>The PDF is scanned. Apply OCR outside the app, then upload a text-based PDF or TXT.</w:t>
-      </w:r>
-    </w:p>
-    <w:p>
-      <w:pPr>
-        <w:pStyle w:val="Heading1"/>
-        <w:keepNext/>
-      </w:pPr>
-      <w:r>
-        <w:t>19. Beginner demonstration checklist</w:t>
+        <w:t>Completed</w:t>
       </w:r>
     </w:p>
     <w:p>
@@ -2726,10 +1230,7 @@
         <w:pStyle w:val="ListBullet"/>
       </w:pPr>
       <w:r>
-        <w:rPr>
-          <w:rFonts w:ascii="Calibri" w:hAnsi="Calibri"/>
-        </w:rPr>
-        <w:t>News Desk loads without a red error.</w:t>
+        <w:t>Authoritative archive independently verified at the exact path, size, SHA-256, and Git blob.</w:t>
       </w:r>
     </w:p>
     <w:p>
@@ -2737,10 +1238,7 @@
         <w:pStyle w:val="ListBullet"/>
       </w:pPr>
       <w:r>
-        <w:rPr>
-          <w:rFonts w:ascii="Calibri" w:hAnsi="Calibri"/>
-        </w:rPr>
-        <w:t>All six top-navigation destinations open.</w:t>
+        <w:t>PR A merged through protected GitHub rules as PR #44.</w:t>
       </w:r>
     </w:p>
     <w:p>
@@ -2748,10 +1246,17 @@
         <w:pStyle w:val="ListBullet"/>
       </w:pPr>
       <w:r>
+        <w:t xml:space="preserve">PR A squash merge: </w:t>
+      </w:r>
+      <w:r>
         <w:rPr>
-          <w:rFonts w:ascii="Calibri" w:hAnsi="Calibri"/>
+          <w:rFonts w:ascii="Consolas" w:hAnsi="Consolas"/>
+          <w:sz w:val="17"/>
         </w:rPr>
-        <w:t>Desktop and mobile layouts avoid horizontal clipping.</w:t>
+        <w:t>d3e77e6610c4a9c83d9137ca672a9aad4278285f</w:t>
+      </w:r>
+      <w:r>
+        <w:t>.</w:t>
       </w:r>
     </w:p>
     <w:p>
@@ -2759,10 +1264,17 @@
         <w:pStyle w:val="ListBullet"/>
       </w:pPr>
       <w:r>
+        <w:t xml:space="preserve">PR A merged tree: </w:t>
+      </w:r>
+      <w:r>
         <w:rPr>
-          <w:rFonts w:ascii="Calibri" w:hAnsi="Calibri"/>
+          <w:rFonts w:ascii="Consolas" w:hAnsi="Consolas"/>
+          <w:sz w:val="17"/>
         </w:rPr>
-        <w:t>Reliable, misleading and uncertain synthetic samples run.</w:t>
+        <w:t>520bad55ea12f1a8e48ad2e533af26312c62933d</w:t>
+      </w:r>
+      <w:r>
+        <w:t>.</w:t>
       </w:r>
     </w:p>
     <w:p>
@@ -2770,10 +1282,7 @@
         <w:pStyle w:val="ListBullet"/>
       </w:pPr>
       <w:r>
-        <w:rPr>
-          <w:rFonts w:ascii="Calibri" w:hAnsi="Calibri"/>
-        </w:rPr>
-        <w:t>Extractive summary changes with Short/Medium/Detailed.</w:t>
+        <w:t>Synthetic-only model training, bounded selection, calibration, locked evaluation, counterfactual test, shortcut baselines, artifact packaging, and runtime integration completed locally.</w:t>
       </w:r>
     </w:p>
     <w:p>
@@ -2781,7 +1290,17 @@
         <w:pStyle w:val="ListBullet"/>
       </w:pPr>
       <w:r>
-        <w:t>Calibrated probabilities sum to approximately 100%, and the three exact outcome states are reachable.</w:t>
+        <w:t xml:space="preserve">Model SHA-256: </w:t>
+      </w:r>
+      <w:r>
+        <w:rPr>
+          <w:rFonts w:ascii="Consolas" w:hAnsi="Consolas"/>
+          <w:sz w:val="17"/>
+        </w:rPr>
+        <w:t>c1ad8c044cd95bc7bf25a94716010ddbe21fbae2ec92a0c1cefb01f5c3c979c6</w:t>
+      </w:r>
+      <w:r>
+        <w:t>.</w:t>
       </w:r>
     </w:p>
     <w:p>
@@ -2789,10 +1308,25 @@
         <w:pStyle w:val="ListBullet"/>
       </w:pPr>
       <w:r>
+        <w:t xml:space="preserve">Calibration SHA-256: </w:t>
+      </w:r>
+      <w:r>
         <w:rPr>
-          <w:rFonts w:ascii="Calibri" w:hAnsi="Calibri"/>
+          <w:rFonts w:ascii="Consolas" w:hAnsi="Consolas"/>
+          <w:sz w:val="17"/>
         </w:rPr>
-        <w:t>The disclaimer is visible.</w:t>
+        <w:t>adcf03a860ef8fb41058b3a4dcc80351dbd02e05f81e0fc1e7f971624af6ab77</w:t>
+      </w:r>
+      <w:r>
+        <w:t>.</w:t>
+      </w:r>
+    </w:p>
+    <w:p>
+      <w:pPr>
+        <w:pStyle w:val="Heading2"/>
+      </w:pPr>
+      <w:r>
+        <w:t>Pending at this checkpoint</w:t>
       </w:r>
     </w:p>
     <w:p>
@@ -2800,10 +1334,7 @@
         <w:pStyle w:val="ListBullet"/>
       </w:pPr>
       <w:r>
-        <w:rPr>
-          <w:rFonts w:ascii="Calibri" w:hAnsi="Calibri"/>
-        </w:rPr>
-        <w:t>JSON and PDF downloads open.</w:t>
+        <w:t>Complete local validation after documentation reconciliation.</w:t>
       </w:r>
     </w:p>
     <w:p>
@@ -2811,10 +1342,7 @@
         <w:pStyle w:val="ListBullet"/>
       </w:pPr>
       <w:r>
-        <w:rPr>
-          <w:rFonts w:ascii="Calibri" w:hAnsi="Calibri"/>
-        </w:rPr>
-        <w:t>Editorial Archive shows one row per unique article.</w:t>
+        <w:t>Open, validate, and protected-merge PR B.</w:t>
       </w:r>
     </w:p>
     <w:p>
@@ -2822,10 +1350,7 @@
         <w:pStyle w:val="ListBullet"/>
       </w:pPr>
       <w:r>
-        <w:rPr>
-          <w:rFonts w:ascii="Calibri" w:hAnsi="Calibri"/>
-        </w:rPr>
-        <w:t>Model Accountability and Dataset Analysis use real saved charts.</w:t>
+        <w:t>Verify exact-new-main CI and CodeQL.</w:t>
       </w:r>
     </w:p>
     <w:p>
@@ -2833,52 +1358,439 @@
         <w:pStyle w:val="ListBullet"/>
       </w:pPr>
       <w:r>
-        <w:t>python -m pytest -q -m "not private_model" passes 144 public tests; exactly four private-model tests are deselected.</w:t>
+        <w:t xml:space="preserve">Deploy main to authenticated Streamlit Community Cloud workspace </w:t>
+      </w:r>
+      <w:r>
+        <w:rPr>
+          <w:rFonts w:ascii="Consolas" w:hAnsi="Consolas"/>
+          <w:sz w:val="17"/>
+        </w:rPr>
+        <w:t>devengaikwad</w:t>
+      </w:r>
+      <w:r>
+        <w:t>.</w:t>
       </w:r>
     </w:p>
     <w:p>
       <w:pPr>
-        <w:pStyle w:val="Heading1"/>
-        <w:keepNext/>
+        <w:pStyle w:val="ListBullet"/>
       </w:pPr>
       <w:r>
-        <w:t>20. Exact quick-reference commands</w:t>
+        <w:t>Record the final public URL, deployed commit, and browser smoke-test evidence.</w:t>
+      </w:r>
+    </w:p>
+    <w:p>
+      <w:r>
+        <w:t>No PR B remote mutation had occurred when this checkpoint was written. Six retained Dependabot PRs and the historical release tag remain outside scope.</w:t>
       </w:r>
     </w:p>
     <w:p>
       <w:pPr>
-        <w:pStyle w:val="CodeBlock"/>
-        <w:keepLines/>
-        <w:shd w:fill="EEF3F8"/>
+        <w:sectPr>
+          <w:pgSz w:w="12240" w:h="15840"/>
+          <w:pgMar w:top="979" w:right="1037" w:bottom="936" w:left="1123" w:header="720" w:footer="720" w:gutter="0"/>
+          <w:cols w:space="720"/>
+          <w:docGrid w:linePitch="360"/>
+        </w:sectPr>
+      </w:pPr>
+    </w:p>
+    <w:p>
+      <w:pPr>
+        <w:pStyle w:val="Heading1"/>
       </w:pPr>
       <w:r>
-        <w:rPr>
-          <w:rFonts w:ascii="Consolas" w:hAnsi="Consolas"/>
-          <w:color w:val="2A241F"/>
-          <w:sz w:val="17"/>
-        </w:rPr>
-        <w:t>py -3.12 -m venv .venv</w:t>
-        <w:br/>
-        <w:t>.venv\Scripts\activate</w:t>
-        <w:br/>
-        <w:t>python -m pip install --upgrade pip</w:t>
-        <w:br/>
-        <w:t>pip install -r requirements-lite.txt</w:t>
-        <w:br/>
-        <w:t>python -m pytest -q -m "not private_model"</w:t>
-        <w:br/>
-        <w:t>python -m streamlit run app.py</w:t>
+        <w:t>Deployment Evidence Values</w:t>
+      </w:r>
+    </w:p>
+    <w:p>
+      <w:r>
+        <w:t>This file is updated in place as externally assigned values become available.</w:t>
+      </w:r>
+    </w:p>
+    <w:tbl>
+      <w:tblPr>
+        <w:tblStyle w:val="TableGrid"/>
+        <w:tblW w:type="auto" w:w="0"/>
+        <w:tblLook w:firstColumn="1" w:firstRow="1" w:lastColumn="0" w:lastRow="0" w:noHBand="0" w:noVBand="1" w:val="04A0"/>
+      </w:tblPr>
+      <w:tblGrid>
+        <w:gridCol w:w="5040"/>
+        <w:gridCol w:w="5040"/>
+      </w:tblGrid>
+      <w:tr>
+        <w:tc>
+          <w:tcPr>
+            <w:tcW w:type="dxa" w:w="5040"/>
+            <w:shd w:fill="EAE4D8"/>
+          </w:tcPr>
+          <w:p>
+            <w:r>
+              <w:rPr>
+                <w:rFonts w:ascii="Calibri" w:hAnsi="Calibri"/>
+                <w:b/>
+                <w:sz w:val="17"/>
+              </w:rPr>
+              <w:t>Value</w:t>
+            </w:r>
+          </w:p>
+        </w:tc>
+        <w:tc>
+          <w:tcPr>
+            <w:tcW w:type="dxa" w:w="5040"/>
+            <w:shd w:fill="EAE4D8"/>
+          </w:tcPr>
+          <w:p>
+            <w:r>
+              <w:rPr>
+                <w:rFonts w:ascii="Calibri" w:hAnsi="Calibri"/>
+                <w:b/>
+                <w:sz w:val="17"/>
+              </w:rPr>
+              <w:t>Current status</w:t>
+            </w:r>
+          </w:p>
+        </w:tc>
+      </w:tr>
+      <w:tr>
+        <w:tc>
+          <w:tcPr>
+            <w:tcW w:type="dxa" w:w="5040"/>
+          </w:tcPr>
+          <w:p>
+            <w:r>
+              <w:rPr>
+                <w:rFonts w:ascii="Calibri" w:hAnsi="Calibri"/>
+                <w:sz w:val="17"/>
+              </w:rPr>
+              <w:t>Repository</w:t>
+            </w:r>
+          </w:p>
+        </w:tc>
+        <w:tc>
+          <w:tcPr>
+            <w:tcW w:type="dxa" w:w="5040"/>
+          </w:tcPr>
+          <w:p>
+            <w:r>
+              <w:rPr>
+                <w:rFonts w:ascii="Calibri" w:hAnsi="Calibri"/>
+                <w:sz w:val="17"/>
+              </w:rPr>
+              <w:t>`https://github.com/DevenGaikwad/NewsLens-AI`</w:t>
+            </w:r>
+          </w:p>
+        </w:tc>
+      </w:tr>
+      <w:tr>
+        <w:tc>
+          <w:tcPr>
+            <w:tcW w:type="dxa" w:w="5040"/>
+          </w:tcPr>
+          <w:p>
+            <w:r>
+              <w:rPr>
+                <w:rFonts w:ascii="Calibri" w:hAnsi="Calibri"/>
+                <w:sz w:val="17"/>
+              </w:rPr>
+              <w:t>Dataset PR</w:t>
+            </w:r>
+          </w:p>
+        </w:tc>
+        <w:tc>
+          <w:tcPr>
+            <w:tcW w:type="dxa" w:w="5040"/>
+          </w:tcPr>
+          <w:p>
+            <w:r>
+              <w:rPr>
+                <w:rFonts w:ascii="Calibri" w:hAnsi="Calibri"/>
+                <w:sz w:val="17"/>
+              </w:rPr>
+              <w:t>#44, merged</w:t>
+            </w:r>
+          </w:p>
+        </w:tc>
+      </w:tr>
+      <w:tr>
+        <w:tc>
+          <w:tcPr>
+            <w:tcW w:type="dxa" w:w="5040"/>
+          </w:tcPr>
+          <w:p>
+            <w:r>
+              <w:rPr>
+                <w:rFonts w:ascii="Calibri" w:hAnsi="Calibri"/>
+                <w:sz w:val="17"/>
+              </w:rPr>
+              <w:t>Dataset merge commit</w:t>
+            </w:r>
+          </w:p>
+        </w:tc>
+        <w:tc>
+          <w:tcPr>
+            <w:tcW w:type="dxa" w:w="5040"/>
+          </w:tcPr>
+          <w:p>
+            <w:r>
+              <w:rPr>
+                <w:rFonts w:ascii="Calibri" w:hAnsi="Calibri"/>
+                <w:sz w:val="17"/>
+              </w:rPr>
+              <w:t>`d3e77e6610c4a9c83d9137ca672a9aad4278285f`</w:t>
+            </w:r>
+          </w:p>
+        </w:tc>
+      </w:tr>
+      <w:tr>
+        <w:tc>
+          <w:tcPr>
+            <w:tcW w:type="dxa" w:w="5040"/>
+          </w:tcPr>
+          <w:p>
+            <w:r>
+              <w:rPr>
+                <w:rFonts w:ascii="Calibri" w:hAnsi="Calibri"/>
+                <w:sz w:val="17"/>
+              </w:rPr>
+              <w:t>Model PR</w:t>
+            </w:r>
+          </w:p>
+        </w:tc>
+        <w:tc>
+          <w:tcPr>
+            <w:tcW w:type="dxa" w:w="5040"/>
+          </w:tcPr>
+          <w:p>
+            <w:r>
+              <w:rPr>
+                <w:rFonts w:ascii="Calibri" w:hAnsi="Calibri"/>
+                <w:sz w:val="17"/>
+              </w:rPr>
+              <w:t>Pending protected PR B</w:t>
+            </w:r>
+          </w:p>
+        </w:tc>
+      </w:tr>
+      <w:tr>
+        <w:tc>
+          <w:tcPr>
+            <w:tcW w:type="dxa" w:w="5040"/>
+          </w:tcPr>
+          <w:p>
+            <w:r>
+              <w:rPr>
+                <w:rFonts w:ascii="Calibri" w:hAnsi="Calibri"/>
+                <w:sz w:val="17"/>
+              </w:rPr>
+              <w:t>Model PR validated head</w:t>
+            </w:r>
+          </w:p>
+        </w:tc>
+        <w:tc>
+          <w:tcPr>
+            <w:tcW w:type="dxa" w:w="5040"/>
+          </w:tcPr>
+          <w:p>
+            <w:r>
+              <w:rPr>
+                <w:rFonts w:ascii="Calibri" w:hAnsi="Calibri"/>
+                <w:sz w:val="17"/>
+              </w:rPr>
+              <w:t>Pending</w:t>
+            </w:r>
+          </w:p>
+        </w:tc>
+      </w:tr>
+      <w:tr>
+        <w:tc>
+          <w:tcPr>
+            <w:tcW w:type="dxa" w:w="5040"/>
+          </w:tcPr>
+          <w:p>
+            <w:r>
+              <w:rPr>
+                <w:rFonts w:ascii="Calibri" w:hAnsi="Calibri"/>
+                <w:sz w:val="17"/>
+              </w:rPr>
+              <w:t>Model squash merge</w:t>
+            </w:r>
+          </w:p>
+        </w:tc>
+        <w:tc>
+          <w:tcPr>
+            <w:tcW w:type="dxa" w:w="5040"/>
+          </w:tcPr>
+          <w:p>
+            <w:r>
+              <w:rPr>
+                <w:rFonts w:ascii="Calibri" w:hAnsi="Calibri"/>
+                <w:sz w:val="17"/>
+              </w:rPr>
+              <w:t>Pending</w:t>
+            </w:r>
+          </w:p>
+        </w:tc>
+      </w:tr>
+      <w:tr>
+        <w:tc>
+          <w:tcPr>
+            <w:tcW w:type="dxa" w:w="5040"/>
+          </w:tcPr>
+          <w:p>
+            <w:r>
+              <w:rPr>
+                <w:rFonts w:ascii="Calibri" w:hAnsi="Calibri"/>
+                <w:sz w:val="17"/>
+              </w:rPr>
+              <w:t>Exact new-main tree</w:t>
+            </w:r>
+          </w:p>
+        </w:tc>
+        <w:tc>
+          <w:tcPr>
+            <w:tcW w:type="dxa" w:w="5040"/>
+          </w:tcPr>
+          <w:p>
+            <w:r>
+              <w:rPr>
+                <w:rFonts w:ascii="Calibri" w:hAnsi="Calibri"/>
+                <w:sz w:val="17"/>
+              </w:rPr>
+              <w:t>Pending</w:t>
+            </w:r>
+          </w:p>
+        </w:tc>
+      </w:tr>
+      <w:tr>
+        <w:tc>
+          <w:tcPr>
+            <w:tcW w:type="dxa" w:w="5040"/>
+          </w:tcPr>
+          <w:p>
+            <w:r>
+              <w:rPr>
+                <w:rFonts w:ascii="Calibri" w:hAnsi="Calibri"/>
+                <w:sz w:val="17"/>
+              </w:rPr>
+              <w:t>Streamlit workspace</w:t>
+            </w:r>
+          </w:p>
+        </w:tc>
+        <w:tc>
+          <w:tcPr>
+            <w:tcW w:type="dxa" w:w="5040"/>
+          </w:tcPr>
+          <w:p>
+            <w:r>
+              <w:rPr>
+                <w:rFonts w:ascii="Calibri" w:hAnsi="Calibri"/>
+                <w:sz w:val="17"/>
+              </w:rPr>
+              <w:t>`devengaikwad`</w:t>
+            </w:r>
+          </w:p>
+        </w:tc>
+      </w:tr>
+      <w:tr>
+        <w:tc>
+          <w:tcPr>
+            <w:tcW w:type="dxa" w:w="5040"/>
+          </w:tcPr>
+          <w:p>
+            <w:r>
+              <w:rPr>
+                <w:rFonts w:ascii="Calibri" w:hAnsi="Calibri"/>
+                <w:sz w:val="17"/>
+              </w:rPr>
+              <w:t>Streamlit URL</w:t>
+            </w:r>
+          </w:p>
+        </w:tc>
+        <w:tc>
+          <w:tcPr>
+            <w:tcW w:type="dxa" w:w="5040"/>
+          </w:tcPr>
+          <w:p>
+            <w:r>
+              <w:rPr>
+                <w:rFonts w:ascii="Calibri" w:hAnsi="Calibri"/>
+                <w:sz w:val="17"/>
+              </w:rPr>
+              <w:t>Pending deployment</w:t>
+            </w:r>
+          </w:p>
+        </w:tc>
+      </w:tr>
+      <w:tr>
+        <w:tc>
+          <w:tcPr>
+            <w:tcW w:type="dxa" w:w="5040"/>
+          </w:tcPr>
+          <w:p>
+            <w:r>
+              <w:rPr>
+                <w:rFonts w:ascii="Calibri" w:hAnsi="Calibri"/>
+                <w:sz w:val="17"/>
+              </w:rPr>
+              <w:t>Deployed main commit</w:t>
+            </w:r>
+          </w:p>
+        </w:tc>
+        <w:tc>
+          <w:tcPr>
+            <w:tcW w:type="dxa" w:w="5040"/>
+          </w:tcPr>
+          <w:p>
+            <w:r>
+              <w:rPr>
+                <w:rFonts w:ascii="Calibri" w:hAnsi="Calibri"/>
+                <w:sz w:val="17"/>
+              </w:rPr>
+              <w:t>Pending deployment</w:t>
+            </w:r>
+          </w:p>
+        </w:tc>
+      </w:tr>
+      <w:tr>
+        <w:tc>
+          <w:tcPr>
+            <w:tcW w:type="dxa" w:w="5040"/>
+          </w:tcPr>
+          <w:p>
+            <w:r>
+              <w:rPr>
+                <w:rFonts w:ascii="Calibri" w:hAnsi="Calibri"/>
+                <w:sz w:val="17"/>
+              </w:rPr>
+              <w:t>Public smoke test</w:t>
+            </w:r>
+          </w:p>
+        </w:tc>
+        <w:tc>
+          <w:tcPr>
+            <w:tcW w:type="dxa" w:w="5040"/>
+          </w:tcPr>
+          <w:p>
+            <w:r>
+              <w:rPr>
+                <w:rFonts w:ascii="Calibri" w:hAnsi="Calibri"/>
+                <w:sz w:val="17"/>
+              </w:rPr>
+              <w:t>Pending deployment</w:t>
+            </w:r>
+          </w:p>
+        </w:tc>
+      </w:tr>
+    </w:tbl>
+    <w:p/>
+    <w:p>
+      <w:r>
+        <w:t>Pending is evidence discipline, not a claim of completion. Vercel is intentionally not part of the deployment plan.</w:t>
       </w:r>
     </w:p>
     <w:sectPr>
-      <w:headerReference w:type="default" r:id="rId9"/>
-      <w:footerReference w:type="default" r:id="rId10"/>
-      <w:headerReference w:type="first" r:id="rId15"/>
-      <w:footerReference w:type="first" r:id="rId16"/>
-      <w:headerReference w:type="even" r:id="rId17"/>
-      <w:footerReference w:type="even" r:id="rId18"/>
       <w:pgSz w:w="12240" w:h="15840"/>
-      <w:pgMar w:top="1440" w:right="1440" w:bottom="1440" w:left="1440" w:header="708" w:footer="708" w:gutter="0"/>
+      <w:pgMar w:top="979" w:right="1037" w:bottom="936" w:left="1123" w:header="720" w:footer="720" w:gutter="0"/>
       <w:cols w:space="720"/>
       <w:docGrid w:linePitch="360"/>
     </w:sectPr>
@@ -2891,69 +1803,21 @@
   <w:p>
     <w:pPr>
       <w:pStyle w:val="Footer"/>
-      <w:spacing w:before="0"/>
       <w:jc w:val="center"/>
     </w:pPr>
-    <w:r/>
     <w:r>
       <w:rPr>
         <w:rFonts w:ascii="Calibri" w:hAnsi="Calibri"/>
-        <w:color w:val="6F685F"/>
+        <w:color w:val="77736C"/>
         <w:sz w:val="16"/>
       </w:rPr>
-      <w:t>NewsLens AI · Designed and developed by Deven Gaikwad</w:t>
-    </w:r>
-    <w:r>
-      <w:rPr>
-        <w:rFonts w:ascii="Calibri" w:hAnsi="Calibri"/>
-        <w:color w:val="6F685F"/>
-        <w:sz w:val="17"/>
-      </w:rPr>
-      <w:br/>
-      <w:t xml:space="preserve">© 2026 Deven Gaikwad. All rights reserved. · Page </w:t>
+      <w:t xml:space="preserve">© 2026 Deven Sachin Gaikwad · Phase 5S · Page </w:t>
     </w:r>
     <w:r>
       <w:fldChar w:fldCharType="begin"/>
       <w:instrText xml:space="preserve">PAGE</w:instrText>
-      <w:fldChar w:fldCharType="separate"/>
-      <w:t>1</w:t>
       <w:fldChar w:fldCharType="end"/>
     </w:r>
-    <w:r>
-      <w:rPr>
-        <w:rFonts w:ascii="Calibri" w:hAnsi="Calibri"/>
-        <w:color w:val="6F685F"/>
-        <w:sz w:val="17"/>
-      </w:rPr>
-      <w:t xml:space="preserve"> of </w:t>
-    </w:r>
-    <w:r>
-      <w:fldChar w:fldCharType="begin"/>
-      <w:instrText xml:space="preserve">NUMPAGES</w:instrText>
-      <w:fldChar w:fldCharType="separate"/>
-      <w:t>1</w:t>
-      <w:fldChar w:fldCharType="end"/>
-    </w:r>
-  </w:p>
-</w:ftr>
-</file>
-
-<file path=word/footer2.xml><?xml version="1.0" encoding="utf-8"?>
-<w:ftr xmlns:m="http://schemas.openxmlformats.org/officeDocument/2006/math" xmlns:mc="http://schemas.openxmlformats.org/markup-compatibility/2006" xmlns:mo="http://schemas.microsoft.com/office/mac/office/2008/main" xmlns:mv="urn:schemas-microsoft-com:mac:vml" xmlns:o="urn:schemas-microsoft-com:office:office" xmlns:r="http://schemas.openxmlformats.org/officeDocument/2006/relationships" xmlns:v="urn:schemas-microsoft-com:vml" xmlns:w10="urn:schemas-microsoft-com:office:word" xmlns:w14="http://schemas.microsoft.com/office/word/2010/wordml" xmlns:w="http://schemas.openxmlformats.org/wordprocessingml/2006/main" xmlns:wne="http://schemas.microsoft.com/office/word/2006/wordml" xmlns:wp14="http://schemas.microsoft.com/office/word/2010/wordprocessingDrawing" xmlns:wp="http://schemas.openxmlformats.org/drawingml/2006/wordprocessingDrawing" xmlns:wpc="http://schemas.microsoft.com/office/word/2010/wordprocessingCanvas" xmlns:wpg="http://schemas.microsoft.com/office/word/2010/wordprocessingGroup" xmlns:wpi="http://schemas.microsoft.com/office/word/2010/wordprocessingInk" xmlns:wps="http://schemas.microsoft.com/office/word/2010/wordprocessingShape" mc:Ignorable="w14 wp14">
-  <w:p>
-    <w:pPr>
-      <w:pStyle w:val="Footer"/>
-    </w:pPr>
-  </w:p>
-</w:ftr>
-</file>
-
-<file path=word/footer3.xml><?xml version="1.0" encoding="utf-8"?>
-<w:ftr xmlns:m="http://schemas.openxmlformats.org/officeDocument/2006/math" xmlns:mc="http://schemas.openxmlformats.org/markup-compatibility/2006" xmlns:mo="http://schemas.microsoft.com/office/mac/office/2008/main" xmlns:mv="urn:schemas-microsoft-com:mac:vml" xmlns:o="urn:schemas-microsoft-com:office:office" xmlns:r="http://schemas.openxmlformats.org/officeDocument/2006/relationships" xmlns:v="urn:schemas-microsoft-com:vml" xmlns:w10="urn:schemas-microsoft-com:office:word" xmlns:w14="http://schemas.microsoft.com/office/word/2010/wordml" xmlns:w="http://schemas.openxmlformats.org/wordprocessingml/2006/main" xmlns:wne="http://schemas.microsoft.com/office/word/2006/wordml" xmlns:wp14="http://schemas.microsoft.com/office/word/2010/wordprocessingDrawing" xmlns:wp="http://schemas.openxmlformats.org/drawingml/2006/wordprocessingDrawing" xmlns:wpc="http://schemas.microsoft.com/office/word/2010/wordprocessingCanvas" xmlns:wpg="http://schemas.microsoft.com/office/word/2010/wordprocessingGroup" xmlns:wpi="http://schemas.microsoft.com/office/word/2010/wordprocessingInk" xmlns:wps="http://schemas.microsoft.com/office/word/2010/wordprocessingShape" mc:Ignorable="w14 wp14">
-  <w:p>
-    <w:pPr>
-      <w:pStyle w:val="Footer"/>
-    </w:pPr>
   </w:p>
 </w:ftr>
 </file>
@@ -2963,53 +1827,17 @@
   <w:p>
     <w:pPr>
       <w:pStyle w:val="Header"/>
-      <w:tabs>
-        <w:tab w:pos="9360" w:val="right"/>
-      </w:tabs>
-      <w:spacing w:after="0"/>
-      <w:jc w:val="left"/>
-    </w:pPr>
-    <w:r/>
+      <w:jc w:val="right"/>
+    </w:pPr>
     <w:r>
       <w:rPr>
         <w:rFonts w:ascii="Calibri" w:hAnsi="Calibri"/>
         <w:b/>
-        <w:color w:val="6F685F"/>
-        <w:sz w:val="17"/>
-      </w:rPr>
-      <w:t>NewsLens AI · Setup and Run Guide</w:t>
+        <w:color w:val="77736C"/>
+        <w:sz w:val="16"/>
+      </w:rPr>
+      <w:t>NEWSLENS AI  |  NEWSLENS AI SETUP AND RUN GUIDE</w:t>
     </w:r>
-    <w:r>
-      <w:tab/>
-    </w:r>
-    <w:r>
-      <w:rPr>
-        <w:rFonts w:ascii="Calibri" w:hAnsi="Calibri"/>
-        <w:color w:val="496454"/>
-        <w:sz w:val="17"/>
-      </w:rPr>
-      <w:t>DEVEN GAIKWAD · PROPRIETARY DOCUMENTATION</w:t>
-    </w:r>
-  </w:p>
-</w:hdr>
-</file>
-
-<file path=word/header2.xml><?xml version="1.0" encoding="utf-8"?>
-<w:hdr xmlns:m="http://schemas.openxmlformats.org/officeDocument/2006/math" xmlns:mc="http://schemas.openxmlformats.org/markup-compatibility/2006" xmlns:mo="http://schemas.microsoft.com/office/mac/office/2008/main" xmlns:mv="urn:schemas-microsoft-com:mac:vml" xmlns:o="urn:schemas-microsoft-com:office:office" xmlns:r="http://schemas.openxmlformats.org/officeDocument/2006/relationships" xmlns:v="urn:schemas-microsoft-com:vml" xmlns:w10="urn:schemas-microsoft-com:office:word" xmlns:w14="http://schemas.microsoft.com/office/word/2010/wordml" xmlns:w="http://schemas.openxmlformats.org/wordprocessingml/2006/main" xmlns:wne="http://schemas.microsoft.com/office/word/2006/wordml" xmlns:wp14="http://schemas.microsoft.com/office/word/2010/wordprocessingDrawing" xmlns:wp="http://schemas.openxmlformats.org/drawingml/2006/wordprocessingDrawing" xmlns:wpc="http://schemas.microsoft.com/office/word/2010/wordprocessingCanvas" xmlns:wpg="http://schemas.microsoft.com/office/word/2010/wordprocessingGroup" xmlns:wpi="http://schemas.microsoft.com/office/word/2010/wordprocessingInk" xmlns:wps="http://schemas.microsoft.com/office/word/2010/wordprocessingShape" mc:Ignorable="w14 wp14">
-  <w:p>
-    <w:pPr>
-      <w:pStyle w:val="Header"/>
-    </w:pPr>
-  </w:p>
-</w:hdr>
-</file>
-
-<file path=word/header3.xml><?xml version="1.0" encoding="utf-8"?>
-<w:hdr xmlns:m="http://schemas.openxmlformats.org/officeDocument/2006/math" xmlns:mc="http://schemas.openxmlformats.org/markup-compatibility/2006" xmlns:mo="http://schemas.microsoft.com/office/mac/office/2008/main" xmlns:mv="urn:schemas-microsoft-com:mac:vml" xmlns:o="urn:schemas-microsoft-com:office:office" xmlns:r="http://schemas.openxmlformats.org/officeDocument/2006/relationships" xmlns:v="urn:schemas-microsoft-com:vml" xmlns:w10="urn:schemas-microsoft-com:office:word" xmlns:w14="http://schemas.microsoft.com/office/word/2010/wordml" xmlns:w="http://schemas.openxmlformats.org/wordprocessingml/2006/main" xmlns:wne="http://schemas.microsoft.com/office/word/2006/wordml" xmlns:wp14="http://schemas.microsoft.com/office/word/2010/wordprocessingDrawing" xmlns:wp="http://schemas.openxmlformats.org/drawingml/2006/wordprocessingDrawing" xmlns:wpc="http://schemas.microsoft.com/office/word/2010/wordprocessingCanvas" xmlns:wpg="http://schemas.microsoft.com/office/word/2010/wordprocessingGroup" xmlns:wpi="http://schemas.microsoft.com/office/word/2010/wordprocessingInk" xmlns:wps="http://schemas.microsoft.com/office/word/2010/wordprocessingShape" mc:Ignorable="w14 wp14">
-  <w:p>
-    <w:pPr>
-      <w:pStyle w:val="Header"/>
-    </w:pPr>
   </w:p>
 </w:hdr>
 </file>
@@ -3378,13 +2206,12 @@
     <w:qFormat/>
     <w:rsid w:val="00FC693F"/>
     <w:pPr>
-      <w:spacing w:before="0" w:after="120" w:line="300" w:lineRule="auto"/>
-      <w:jc w:val="left"/>
+      <w:spacing w:after="100" w:line="259" w:lineRule="auto"/>
     </w:pPr>
     <w:rPr>
       <w:rFonts w:ascii="Calibri" w:hAnsi="Calibri"/>
       <w:color w:val="1A1917"/>
-      <w:sz w:val="22"/>
+      <w:sz w:val="20"/>
     </w:rPr>
   </w:style>
   <w:style w:type="paragraph" w:styleId="Header">
@@ -3442,7 +2269,7 @@
     <w:pPr>
       <w:keepNext/>
       <w:keepLines/>
-      <w:spacing w:before="360" w:after="200"/>
+      <w:spacing w:before="280" w:after="120"/>
       <w:outlineLvl w:val="0"/>
     </w:pPr>
     <w:rPr>
@@ -3450,7 +2277,7 @@
       <w:b/>
       <w:bCs/>
       <w:color w:val="6D5947"/>
-      <w:sz w:val="32"/>
+      <w:sz w:val="36"/>
       <w:szCs w:val="28"/>
     </w:rPr>
   </w:style>
@@ -3466,15 +2293,15 @@
     <w:pPr>
       <w:keepNext/>
       <w:keepLines/>
-      <w:spacing w:before="280" w:after="140"/>
+      <w:spacing w:before="200" w:after="0"/>
       <w:outlineLvl w:val="1"/>
     </w:pPr>
     <w:rPr>
       <w:rFonts w:asciiTheme="majorHAnsi" w:eastAsiaTheme="majorEastAsia" w:hAnsiTheme="majorHAnsi" w:cstheme="majorBidi" w:ascii="Calibri" w:hAnsi="Calibri"/>
       <w:b/>
       <w:bCs/>
-      <w:color w:val="6D5947"/>
-      <w:sz w:val="26"/>
+      <w:color w:val="496454"/>
+      <w:sz w:val="28"/>
       <w:szCs w:val="26"/>
     </w:rPr>
   </w:style>
@@ -3490,15 +2317,15 @@
     <w:pPr>
       <w:keepNext/>
       <w:keepLines/>
-      <w:spacing w:before="200" w:after="100"/>
+      <w:spacing w:before="200" w:after="0"/>
       <w:outlineLvl w:val="2"/>
     </w:pPr>
     <w:rPr>
       <w:rFonts w:asciiTheme="majorHAnsi" w:eastAsiaTheme="majorEastAsia" w:hAnsiTheme="majorHAnsi" w:cstheme="majorBidi" w:ascii="Calibri" w:hAnsi="Calibri"/>
       <w:b/>
       <w:bCs/>
-      <w:color w:val="1F4D78"/>
-      <w:sz w:val="24"/>
+      <w:color w:val="6D5947"/>
+      <w:sz w:val="22"/>
     </w:rPr>
   </w:style>
   <w:style w:type="paragraph" w:styleId="Heading4">
@@ -3736,11 +2563,12 @@
       <w:contextualSpacing/>
     </w:pPr>
     <w:rPr>
-      <w:rFonts w:asciiTheme="majorHAnsi" w:eastAsiaTheme="majorEastAsia" w:hAnsiTheme="majorHAnsi" w:cstheme="majorBidi"/>
-      <w:color w:val="17365D" w:themeColor="text2" w:themeShade="BF"/>
+      <w:rFonts w:asciiTheme="majorHAnsi" w:eastAsiaTheme="majorEastAsia" w:hAnsiTheme="majorHAnsi" w:cstheme="majorBidi" w:ascii="Calibri" w:hAnsi="Calibri"/>
+      <w:b/>
+      <w:color w:val="6D5947"/>
       <w:spacing w:val="5"/>
       <w:kern w:val="28"/>
-      <w:sz w:val="52"/>
+      <w:sz w:val="56"/>
       <w:szCs w:val="52"/>
     </w:rPr>
   </w:style>
@@ -3914,14 +2742,8 @@
       <w:numPr>
         <w:numId w:val="1"/>
       </w:numPr>
-      <w:spacing w:after="80" w:line="300" w:lineRule="auto"/>
-      <w:ind w:left="540" w:hanging="271"/>
       <w:contextualSpacing/>
     </w:pPr>
-    <w:rPr>
-      <w:rFonts w:ascii="Calibri" w:hAnsi="Calibri"/>
-      <w:sz w:val="22"/>
-    </w:rPr>
   </w:style>
   <w:style w:type="paragraph" w:styleId="ListBullet2">
     <w:name w:val="List Bullet 2"/>
@@ -3959,14 +2781,8 @@
       <w:numPr>
         <w:numId w:val="5"/>
       </w:numPr>
-      <w:spacing w:after="80" w:line="300" w:lineRule="auto"/>
-      <w:ind w:left="540" w:hanging="271"/>
       <w:contextualSpacing/>
     </w:pPr>
-    <w:rPr>
-      <w:rFonts w:ascii="Calibri" w:hAnsi="Calibri"/>
-      <w:sz w:val="22"/>
-    </w:rPr>
   </w:style>
   <w:style w:type="paragraph" w:styleId="ListNumber2">
     <w:name w:val="List Number 2"/>
@@ -4187,15 +3003,12 @@
     <w:qFormat/>
     <w:rsid w:val="00FC693F"/>
     <w:pPr>
-      <w:spacing w:line="240" w:lineRule="auto" w:before="80" w:after="160"/>
-      <w:jc w:val="center"/>
+      <w:spacing w:line="240" w:lineRule="auto"/>
     </w:pPr>
     <w:rPr>
-      <w:rFonts w:ascii="Calibri" w:hAnsi="Calibri"/>
       <w:b/>
       <w:bCs/>
-      <w:i/>
-      <w:color w:val="6F685F"/>
+      <w:color w:val="4F81BD" w:themeColor="accent1"/>
       <w:sz w:val="18"/>
       <w:szCs w:val="18"/>
     </w:rPr>
@@ -15084,18 +13897,6 @@
         <w:shd w:val="clear" w:color="auto" w:fill="FBCAA2" w:themeFill="accent6" w:themeFillTint="7F"/>
       </w:tcPr>
     </w:tblStylePr>
-  </w:style>
-  <w:style w:type="paragraph" w:customStyle="1" w:styleId="CodeBlock">
-    <w:name w:val="Code Block"/>
-    <w:pPr>
-      <w:spacing w:before="80" w:after="140" w:line="240" w:lineRule="auto"/>
-      <w:ind w:left="259" w:right="259"/>
-    </w:pPr>
-    <w:rPr>
-      <w:rFonts w:ascii="Consolas" w:hAnsi="Consolas"/>
-      <w:color w:val="2A241F"/>
-      <w:sz w:val="17"/>
-    </w:rPr>
   </w:style>
 </w:styles>
 </file>

</xml_diff>

<commit_message>
feat(model): publish synthetic classifier and calibrated runtime (#45)
Train exclusively from the accepted synthetic benchmark, bind calibration to the exact public model hash, integrate the synthetic consistency signal, and reconcile runtime, tests, documentation, security evidence, and release records.

All training articles and entities are synthetic. No ISOT content or private ISOT-derived artifact is included.
</commit_message>
<xml_diff>
--- a/docs/NewsLens_AI_Setup_and_Run_Guide.docx
+++ b/docs/NewsLens_AI_Setup_and_Run_Guide.docx
@@ -4,606 +4,59 @@
   <w:body>
     <w:p>
       <w:pPr>
-        <w:spacing w:after="160"/>
+        <w:pStyle w:val="Subtitle"/>
+        <w:jc w:val="center"/>
+      </w:pPr>
+      <w:r>
+        <w:t>NEWSLENS AI</w:t>
+      </w:r>
+    </w:p>
+    <w:p/>
+    <w:p>
+      <w:pPr>
+        <w:pStyle w:val="Title"/>
+        <w:jc w:val="center"/>
+      </w:pPr>
+      <w:r>
+        <w:t>NewsLens AI Setup and Run Guide</w:t>
+      </w:r>
+    </w:p>
+    <w:p>
+      <w:pPr>
         <w:jc w:val="center"/>
       </w:pPr>
       <w:r>
         <w:rPr>
-          <w:rFonts w:ascii="Calibri" w:hAnsi="Calibri"/>
-          <w:b/>
-          <w:color w:val="2A241F"/>
-          <w:sz w:val="24"/>
+          <w:color w:val="496454"/>
+          <w:sz w:val="28"/>
         </w:rPr>
-        <w:t>NEWSLENS AI</w:t>
+        <w:t>Python 3.12 local setup, validation and Streamlit deployment</w:t>
       </w:r>
     </w:p>
+    <w:p/>
     <w:p>
       <w:pPr>
-        <w:spacing w:before="80" w:after="80"/>
-        <w:ind w:left="3456" w:right="3456"/>
-        <w:jc w:val="center"/>
-        <w:pBdr>
-          <w:top w:val="single" w:sz="8" w:space="6" w:color="9AA9BC"/>
-          <w:left w:val="single" w:sz="8" w:space="6" w:color="9AA9BC"/>
-          <w:bottom w:val="single" w:sz="8" w:space="6" w:color="9AA9BC"/>
-          <w:right w:val="single" w:sz="8" w:space="6" w:color="9AA9BC"/>
-        </w:pBdr>
-        <w:shd w:fill="EAE4D8"/>
-      </w:pPr>
-      <w:r>
-        <w:rPr>
-          <w:rFonts w:ascii="Calibri" w:hAnsi="Calibri"/>
-          <w:b/>
-          <w:color w:val="6F685F"/>
-          <w:sz w:val="16"/>
-        </w:rPr>
-        <w:t>PUBLIC DOCUMENTATION</w:t>
-      </w:r>
-    </w:p>
-    <w:p>
-      <w:pPr>
-        <w:spacing w:after="0"/>
-      </w:pPr>
-    </w:p>
-    <w:p>
-      <w:pPr>
-        <w:spacing w:after="200"/>
         <w:jc w:val="center"/>
       </w:pPr>
       <w:r>
         <w:rPr>
-          <w:rFonts w:ascii="Calibri" w:hAnsi="Calibri"/>
-          <w:b/>
-          <w:color w:val="496454"/>
-          <w:sz w:val="22"/>
+          <w:i/>
+          <w:color w:val="77736C"/>
         </w:rPr>
-        <w:t>PRACTICAL GUIDE</w:t>
+        <w:t>All classifier training articles and entities are synthetic. This report documents a bounded ledger-consistency demonstration, not unrestricted real-world fact verification.</w:t>
       </w:r>
     </w:p>
+    <w:p/>
     <w:p>
       <w:pPr>
-        <w:spacing w:after="200"/>
         <w:jc w:val="center"/>
       </w:pPr>
       <w:r>
-        <w:rPr>
-          <w:rFonts w:ascii="Calibri" w:hAnsi="Calibri"/>
-          <w:b/>
-          <w:color w:val="2A241F"/>
-          <w:sz w:val="48"/>
-        </w:rPr>
-        <w:t>NewsLens AI</w:t>
+        <w:t>Prepared by</w:t>
         <w:br/>
-        <w:t>Setup and Run Guide</w:t>
-      </w:r>
-    </w:p>
-    <w:p>
-      <w:pPr>
-        <w:spacing w:after="320"/>
-        <w:jc w:val="center"/>
-      </w:pPr>
-      <w:r>
-        <w:rPr>
-          <w:rFonts w:ascii="Calibri" w:hAnsi="Calibri"/>
-          <w:i/>
-          <w:color w:val="6D5947"/>
-          <w:sz w:val="23"/>
-        </w:rPr>
-        <w:t>Beginner-friendly installation, first run, retraining, testing and troubleshooting</w:t>
-      </w:r>
-    </w:p>
-    <w:tbl>
-      <w:tblPr>
-        <w:tblStyle w:val="TableGrid"/>
-        <w:tblW w:type="dxa" w:w="9360"/>
-        <w:jc w:val="left"/>
-        <w:tblLayout w:type="fixed"/>
-        <w:tblLook w:firstColumn="1" w:firstRow="1" w:lastColumn="0" w:lastRow="0" w:noHBand="0" w:noVBand="1" w:val="04A0"/>
-        <w:tblInd w:type="dxa" w:w="120"/>
-        <w:tblCellMar>
-          <w:top w:w="80" w:type="dxa"/>
-          <w:left w:w="120" w:type="dxa"/>
-          <w:bottom w:w="80" w:type="dxa"/>
-          <w:right w:w="120" w:type="dxa"/>
-        </w:tblCellMar>
-      </w:tblPr>
-      <w:tblGrid>
-        <w:gridCol w:w="3240"/>
-        <w:gridCol w:w="6120"/>
-      </w:tblGrid>
-      <w:tr>
-        <w:trPr>
-          <w:tblHeader w:val="true"/>
-        </w:trPr>
-        <w:tc>
-          <w:tcPr>
-            <w:tcW w:type="dxa" w:w="3240"/>
-            <w:vAlign w:val="center"/>
-            <w:shd w:fill="F3F0E8"/>
-          </w:tcPr>
-          <w:p>
-            <w:pPr>
-              <w:spacing w:before="0" w:after="0" w:line="252" w:lineRule="auto"/>
-              <w:jc w:val="center"/>
-            </w:pPr>
-            <w:r>
-              <w:rPr>
-                <w:rFonts w:ascii="Calibri" w:hAnsi="Calibri"/>
-                <w:b/>
-                <w:sz w:val="16"/>
-              </w:rPr>
-            </w:r>
-            <w:r>
-              <w:rPr>
-                <w:rFonts w:ascii="Calibri" w:hAnsi="Calibri"/>
-                <w:b/>
-                <w:color w:val="2A241F"/>
-                <w:sz w:val="16"/>
-              </w:rPr>
-              <w:t>Field</w:t>
-            </w:r>
-          </w:p>
-        </w:tc>
-        <w:tc>
-          <w:tcPr>
-            <w:tcW w:type="dxa" w:w="6120"/>
-            <w:vAlign w:val="center"/>
-            <w:shd w:fill="F3F0E8"/>
-          </w:tcPr>
-          <w:p>
-            <w:pPr>
-              <w:spacing w:before="0" w:after="0" w:line="252" w:lineRule="auto"/>
-              <w:jc w:val="center"/>
-            </w:pPr>
-            <w:r>
-              <w:rPr>
-                <w:rFonts w:ascii="Calibri" w:hAnsi="Calibri"/>
-                <w:b/>
-                <w:sz w:val="16"/>
-              </w:rPr>
-            </w:r>
-            <w:r>
-              <w:rPr>
-                <w:rFonts w:ascii="Calibri" w:hAnsi="Calibri"/>
-                <w:b/>
-                <w:color w:val="2A241F"/>
-                <w:sz w:val="16"/>
-              </w:rPr>
-              <w:t>Value</w:t>
-            </w:r>
-          </w:p>
-        </w:tc>
-      </w:tr>
-      <w:tr>
-        <w:tc>
-          <w:tcPr>
-            <w:tcW w:type="dxa" w:w="3240"/>
-            <w:vAlign w:val="center"/>
-          </w:tcPr>
-          <w:p>
-            <w:pPr>
-              <w:spacing w:before="0" w:after="0" w:line="252" w:lineRule="auto"/>
-              <w:jc w:val="left"/>
-            </w:pPr>
-            <w:r>
-              <w:rPr>
-                <w:rFonts w:ascii="Calibri" w:hAnsi="Calibri"/>
-                <w:sz w:val="16"/>
-              </w:rPr>
-            </w:r>
-            <w:r>
-              <w:rPr>
-                <w:rFonts w:ascii="Calibri" w:hAnsi="Calibri"/>
-                <w:b w:val="0"/>
-                <w:color w:val="1A1917"/>
-                <w:sz w:val="16"/>
-              </w:rPr>
-              <w:t>Product</w:t>
-            </w:r>
-          </w:p>
-        </w:tc>
-        <w:tc>
-          <w:tcPr>
-            <w:tcW w:type="dxa" w:w="6120"/>
-            <w:vAlign w:val="center"/>
-          </w:tcPr>
-          <w:p>
-            <w:pPr>
-              <w:spacing w:before="0" w:after="0" w:line="252" w:lineRule="auto"/>
-              <w:jc w:val="left"/>
-            </w:pPr>
-            <w:r>
-              <w:rPr>
-                <w:rFonts w:ascii="Calibri" w:hAnsi="Calibri"/>
-                <w:sz w:val="16"/>
-              </w:rPr>
-            </w:r>
-            <w:r>
-              <w:rPr>
-                <w:rFonts w:ascii="Calibri" w:hAnsi="Calibri"/>
-                <w:b w:val="0"/>
-                <w:color w:val="1A1917"/>
-                <w:sz w:val="16"/>
-              </w:rPr>
-              <w:t>NewsLens AI</w:t>
-            </w:r>
-          </w:p>
-        </w:tc>
-      </w:tr>
-      <w:tr>
-        <w:tc>
-          <w:tcPr>
-            <w:tcW w:type="dxa" w:w="3240"/>
-            <w:vAlign w:val="center"/>
-            <w:shd w:fill="FAFCFF"/>
-          </w:tcPr>
-          <w:p>
-            <w:pPr>
-              <w:spacing w:before="0" w:after="0" w:line="252" w:lineRule="auto"/>
-              <w:jc w:val="left"/>
-            </w:pPr>
-            <w:r>
-              <w:rPr>
-                <w:rFonts w:ascii="Calibri" w:hAnsi="Calibri"/>
-                <w:sz w:val="16"/>
-              </w:rPr>
-            </w:r>
-            <w:r>
-              <w:rPr>
-                <w:rFonts w:ascii="Calibri" w:hAnsi="Calibri"/>
-                <w:b w:val="0"/>
-                <w:color w:val="1A1917"/>
-                <w:sz w:val="16"/>
-              </w:rPr>
-              <w:t>Document status</w:t>
-            </w:r>
-          </w:p>
-        </w:tc>
-        <w:tc>
-          <w:tcPr>
-            <w:tcW w:type="dxa" w:w="6120"/>
-            <w:vAlign w:val="center"/>
-            <w:shd w:fill="FAFCFF"/>
-          </w:tcPr>
-          <w:p>
-            <w:pPr>
-              <w:spacing w:before="0" w:after="0"/>
-            </w:pPr>
-            <w:r>
-              <w:rPr>
-                <w:rFonts w:ascii="Calibri" w:hAnsi="Calibri"/>
-                <w:sz w:val="16"/>
-              </w:rPr>
-              <w:t>Public GitHub repository active; Streamlit and Vercel blocked pending a legally redistributable public model</w:t>
-            </w:r>
-          </w:p>
-        </w:tc>
-      </w:tr>
-      <w:tr>
-        <w:tc>
-          <w:tcPr>
-            <w:tcW w:type="dxa" w:w="3240"/>
-            <w:vAlign w:val="center"/>
-          </w:tcPr>
-          <w:p>
-            <w:pPr>
-              <w:spacing w:before="0" w:after="0" w:line="252" w:lineRule="auto"/>
-              <w:jc w:val="left"/>
-            </w:pPr>
-            <w:r>
-              <w:rPr>
-                <w:rFonts w:ascii="Calibri" w:hAnsi="Calibri"/>
-                <w:sz w:val="16"/>
-              </w:rPr>
-            </w:r>
-            <w:r>
-              <w:rPr>
-                <w:rFonts w:ascii="Calibri" w:hAnsi="Calibri"/>
-                <w:b w:val="0"/>
-                <w:color w:val="1A1917"/>
-                <w:sz w:val="16"/>
-              </w:rPr>
-              <w:t>Author and developer</w:t>
-            </w:r>
-          </w:p>
-        </w:tc>
-        <w:tc>
-          <w:tcPr>
-            <w:tcW w:type="dxa" w:w="6120"/>
-            <w:vAlign w:val="center"/>
-          </w:tcPr>
-          <w:p>
-            <w:pPr>
-              <w:spacing w:before="0" w:after="0"/>
-            </w:pPr>
-            <w:r>
-              <w:rPr>
-                <w:rFonts w:ascii="Calibri" w:hAnsi="Calibri"/>
-                <w:sz w:val="16"/>
-              </w:rPr>
-              <w:t>Deven Gaikwad</w:t>
-            </w:r>
-          </w:p>
-        </w:tc>
-      </w:tr>
-      <w:tr>
-        <w:tc>
-          <w:tcPr>
-            <w:tcW w:type="dxa" w:w="3240"/>
-            <w:vAlign w:val="center"/>
-            <w:shd w:fill="FAFCFF"/>
-          </w:tcPr>
-          <w:p>
-            <w:pPr>
-              <w:spacing w:before="0" w:after="0" w:line="252" w:lineRule="auto"/>
-              <w:jc w:val="left"/>
-            </w:pPr>
-            <w:r>
-              <w:rPr>
-                <w:rFonts w:ascii="Calibri" w:hAnsi="Calibri"/>
-                <w:sz w:val="16"/>
-              </w:rPr>
-            </w:r>
-            <w:r>
-              <w:rPr>
-                <w:rFonts w:ascii="Calibri" w:hAnsi="Calibri"/>
-                <w:b w:val="0"/>
-                <w:color w:val="1A1917"/>
-                <w:sz w:val="16"/>
-              </w:rPr>
-              <w:t>Copyright</w:t>
-            </w:r>
-          </w:p>
-        </w:tc>
-        <w:tc>
-          <w:tcPr>
-            <w:tcW w:type="dxa" w:w="6120"/>
-            <w:vAlign w:val="center"/>
-            <w:shd w:fill="FAFCFF"/>
-          </w:tcPr>
-          <w:p>
-            <w:pPr>
-              <w:spacing w:before="0" w:after="0"/>
-            </w:pPr>
-            <w:r>
-              <w:rPr>
-                <w:rFonts w:ascii="Calibri" w:hAnsi="Calibri"/>
-                <w:sz w:val="16"/>
-              </w:rPr>
-              <w:t>© 2026 Deven Gaikwad. All rights reserved.</w:t>
-            </w:r>
-          </w:p>
-        </w:tc>
-      </w:tr>
-      <w:tr>
-        <w:tc>
-          <w:tcPr>
-            <w:tcW w:type="dxa" w:w="3240"/>
-            <w:vAlign w:val="center"/>
-          </w:tcPr>
-          <w:p>
-            <w:pPr>
-              <w:spacing w:before="0" w:after="0" w:line="252" w:lineRule="auto"/>
-              <w:jc w:val="left"/>
-            </w:pPr>
-            <w:r>
-              <w:rPr>
-                <w:rFonts w:ascii="Calibri" w:hAnsi="Calibri"/>
-                <w:sz w:val="16"/>
-              </w:rPr>
-            </w:r>
-            <w:r>
-              <w:rPr>
-                <w:rFonts w:ascii="Calibri" w:hAnsi="Calibri"/>
-                <w:b w:val="0"/>
-                <w:color w:val="1A1917"/>
-                <w:sz w:val="16"/>
-              </w:rPr>
-              <w:t>Runtime</w:t>
-            </w:r>
-          </w:p>
-        </w:tc>
-        <w:tc>
-          <w:tcPr>
-            <w:tcW w:type="dxa" w:w="6120"/>
-            <w:vAlign w:val="center"/>
-          </w:tcPr>
-          <w:p>
-            <w:pPr>
-              <w:spacing w:before="0" w:after="0" w:line="252" w:lineRule="auto"/>
-              <w:jc w:val="left"/>
-            </w:pPr>
-            <w:r>
-              <w:rPr>
-                <w:rFonts w:ascii="Calibri" w:hAnsi="Calibri"/>
-                <w:sz w:val="16"/>
-              </w:rPr>
-            </w:r>
-            <w:r>
-              <w:rPr>
-                <w:rFonts w:ascii="Calibri" w:hAnsi="Calibri"/>
-                <w:b w:val="0"/>
-                <w:color w:val="1A1917"/>
-                <w:sz w:val="16"/>
-              </w:rPr>
-              <w:t>Streamlit · Python 3.12 · app.py</w:t>
-            </w:r>
-          </w:p>
-        </w:tc>
-      </w:tr>
-      <w:tr>
-        <w:tc>
-          <w:tcPr>
-            <w:tcW w:type="dxa" w:w="3240"/>
-            <w:vAlign w:val="center"/>
-            <w:shd w:fill="FAFCFF"/>
-          </w:tcPr>
-          <w:p>
-            <w:pPr>
-              <w:spacing w:before="0" w:after="0" w:line="252" w:lineRule="auto"/>
-              <w:jc w:val="left"/>
-            </w:pPr>
-            <w:r>
-              <w:rPr>
-                <w:rFonts w:ascii="Calibri" w:hAnsi="Calibri"/>
-                <w:sz w:val="16"/>
-              </w:rPr>
-            </w:r>
-            <w:r>
-              <w:rPr>
-                <w:rFonts w:ascii="Calibri" w:hAnsi="Calibri"/>
-                <w:b w:val="0"/>
-                <w:color w:val="1A1917"/>
-                <w:sz w:val="16"/>
-              </w:rPr>
-              <w:t>Model boundary</w:t>
-            </w:r>
-          </w:p>
-        </w:tc>
-        <w:tc>
-          <w:tcPr>
-            <w:tcW w:type="dxa" w:w="6120"/>
-            <w:vAlign w:val="center"/>
-            <w:shd w:fill="FAFCFF"/>
-          </w:tcPr>
-          <w:p>
-            <w:pPr>
-              <w:spacing w:before="0" w:after="0" w:line="252" w:lineRule="auto"/>
-              <w:jc w:val="left"/>
-            </w:pPr>
-            <w:r>
-              <w:rPr>
-                <w:rFonts w:ascii="Calibri" w:hAnsi="Calibri"/>
-                <w:sz w:val="16"/>
-              </w:rPr>
-            </w:r>
-            <w:r>
-              <w:rPr>
-                <w:rFonts w:ascii="Calibri" w:hAnsi="Calibri"/>
-                <w:b w:val="0"/>
-                <w:color w:val="1A1917"/>
-                <w:sz w:val="16"/>
-              </w:rPr>
-              <w:t>Linguistic credibility-risk estimate; not a verified fact-check</w:t>
-            </w:r>
-          </w:p>
-        </w:tc>
-      </w:tr>
-      <w:tr>
-        <w:tc>
-          <w:tcPr>
-            <w:tcW w:type="dxa" w:w="3240"/>
-            <w:vAlign w:val="center"/>
-          </w:tcPr>
-          <w:p>
-            <w:pPr>
-              <w:spacing w:before="0" w:after="0" w:line="252" w:lineRule="auto"/>
-              <w:jc w:val="left"/>
-            </w:pPr>
-            <w:r>
-              <w:rPr>
-                <w:rFonts w:ascii="Calibri" w:hAnsi="Calibri"/>
-                <w:sz w:val="16"/>
-              </w:rPr>
-            </w:r>
-            <w:r>
-              <w:rPr>
-                <w:rFonts w:ascii="Calibri" w:hAnsi="Calibri"/>
-                <w:b w:val="0"/>
-                <w:color w:val="1A1917"/>
-                <w:sz w:val="16"/>
-              </w:rPr>
-              <w:t>Repository</w:t>
-            </w:r>
-          </w:p>
-        </w:tc>
-        <w:tc>
-          <w:tcPr>
-            <w:tcW w:type="dxa" w:w="6120"/>
-            <w:vAlign w:val="center"/>
-          </w:tcPr>
-          <w:p>
-            <w:pPr>
-              <w:spacing w:before="0" w:after="0"/>
-            </w:pPr>
-            <w:r>
-              <w:rPr>
-                <w:rFonts w:ascii="Calibri" w:hAnsi="Calibri"/>
-                <w:sz w:val="16"/>
-              </w:rPr>
-              <w:t>Canonical public repository: https://github.com/DevenGaikwad/NewsLens-AI (active)</w:t>
-            </w:r>
-          </w:p>
-        </w:tc>
-      </w:tr>
-      <w:tr>
-        <w:tc>
-          <w:tcPr>
-            <w:tcW w:type="dxa" w:w="3240"/>
-            <w:vAlign w:val="center"/>
-            <w:shd w:fill="FAFCFF"/>
-          </w:tcPr>
-          <w:p>
-            <w:pPr>
-              <w:spacing w:before="0" w:after="0" w:line="252" w:lineRule="auto"/>
-              <w:jc w:val="left"/>
-            </w:pPr>
-            <w:r>
-              <w:rPr>
-                <w:rFonts w:ascii="Calibri" w:hAnsi="Calibri"/>
-                <w:sz w:val="16"/>
-              </w:rPr>
-            </w:r>
-            <w:r>
-              <w:rPr>
-                <w:rFonts w:ascii="Calibri" w:hAnsi="Calibri"/>
-                <w:b w:val="0"/>
-                <w:color w:val="1A1917"/>
-                <w:sz w:val="16"/>
-              </w:rPr>
-              <w:t>Document updated</w:t>
-            </w:r>
-          </w:p>
-        </w:tc>
-        <w:tc>
-          <w:tcPr>
-            <w:tcW w:type="dxa" w:w="6120"/>
-            <w:vAlign w:val="center"/>
-            <w:shd w:fill="FAFCFF"/>
-          </w:tcPr>
-          <w:p>
-            <w:pPr>
-              <w:spacing w:before="0" w:after="0"/>
-            </w:pPr>
-            <w:r>
-              <w:rPr>
-                <w:rFonts w:ascii="Calibri" w:hAnsi="Calibri"/>
-                <w:sz w:val="16"/>
-              </w:rPr>
-              <w:t>13 September 2026</w:t>
-            </w:r>
-          </w:p>
-        </w:tc>
-      </w:tr>
-    </w:tbl>
-    <w:p>
-      <w:pPr>
-        <w:spacing w:after="20"/>
-      </w:pPr>
-    </w:p>
-    <w:p>
-      <w:pPr>
-        <w:spacing w:before="200"/>
-        <w:jc w:val="center"/>
-      </w:pPr>
-      <w:r>
-        <w:rPr>
-          <w:rFonts w:ascii="Calibri" w:hAnsi="Calibri"/>
-          <w:b/>
-          <w:color w:val="6F685F"/>
-          <w:sz w:val="19"/>
-        </w:rPr>
-        <w:t>CODE · METHODS · EVIDENCE · RESPONSIBLE USE</w:t>
+        <w:t>Deven Sachin Gaikwad</w:t>
+        <w:br/>
+        <w:t>26 September 2026</w:t>
       </w:r>
     </w:p>
     <w:p>
@@ -614,90 +67,51 @@
     <w:p>
       <w:pPr>
         <w:pStyle w:val="Heading1"/>
-        <w:keepNext/>
       </w:pPr>
       <w:r>
-        <w:t>Table of Contents</w:t>
+        <w:t>Document control</w:t>
       </w:r>
     </w:p>
     <w:tbl>
       <w:tblPr>
         <w:tblStyle w:val="TableGrid"/>
-        <w:tblW w:type="dxa" w:w="9360"/>
-        <w:jc w:val="left"/>
-        <w:tblLayout w:type="fixed"/>
+        <w:tblW w:type="auto" w:w="0"/>
         <w:tblLook w:firstColumn="1" w:firstRow="1" w:lastColumn="0" w:lastRow="0" w:noHBand="0" w:noVBand="1" w:val="04A0"/>
-        <w:tblInd w:type="dxa" w:w="120"/>
-        <w:tblCellMar>
-          <w:top w:w="80" w:type="dxa"/>
-          <w:left w:w="120" w:type="dxa"/>
-          <w:bottom w:w="80" w:type="dxa"/>
-          <w:right w:w="120" w:type="dxa"/>
-        </w:tblCellMar>
       </w:tblPr>
       <w:tblGrid>
-        <w:gridCol w:w="8208"/>
-        <w:gridCol w:w="1152"/>
+        <w:gridCol w:w="5040"/>
+        <w:gridCol w:w="5040"/>
       </w:tblGrid>
       <w:tr>
-        <w:trPr>
-          <w:tblHeader w:val="true"/>
-        </w:trPr>
         <w:tc>
           <w:tcPr>
-            <w:tcW w:type="dxa" w:w="8208"/>
-            <w:vAlign w:val="center"/>
-            <w:shd w:fill="E8EEE8"/>
+            <w:tcW w:type="dxa" w:w="5040"/>
+            <w:shd w:fill="EAE4D8"/>
           </w:tcPr>
           <w:p>
-            <w:pPr>
-              <w:spacing w:before="0" w:after="0" w:line="252" w:lineRule="auto"/>
-              <w:jc w:val="center"/>
-            </w:pPr>
             <w:r>
               <w:rPr>
                 <w:rFonts w:ascii="Calibri" w:hAnsi="Calibri"/>
                 <w:b/>
-                <w:sz w:val="16"/>
+                <w:sz w:val="17"/>
               </w:rPr>
-            </w:r>
-            <w:r>
-              <w:rPr>
-                <w:rFonts w:ascii="Calibri" w:hAnsi="Calibri"/>
-                <w:b/>
-                <w:color w:val="2A241F"/>
-                <w:sz w:val="16"/>
-              </w:rPr>
-              <w:t>Section</w:t>
+              <w:t>Field</w:t>
             </w:r>
           </w:p>
         </w:tc>
         <w:tc>
           <w:tcPr>
-            <w:tcW w:type="dxa" w:w="1152"/>
-            <w:vAlign w:val="center"/>
-            <w:shd w:fill="E8EEE8"/>
+            <w:tcW w:type="dxa" w:w="5040"/>
+            <w:shd w:fill="EAE4D8"/>
           </w:tcPr>
           <w:p>
-            <w:pPr>
-              <w:spacing w:before="0" w:after="0" w:line="252" w:lineRule="auto"/>
-              <w:jc w:val="center"/>
-            </w:pPr>
             <w:r>
               <w:rPr>
                 <w:rFonts w:ascii="Calibri" w:hAnsi="Calibri"/>
                 <w:b/>
-                <w:sz w:val="16"/>
+                <w:sz w:val="17"/>
               </w:rPr>
-            </w:r>
-            <w:r>
-              <w:rPr>
-                <w:rFonts w:ascii="Calibri" w:hAnsi="Calibri"/>
-                <w:b/>
-                <w:color w:val="2A241F"/>
-                <w:sz w:val="16"/>
-              </w:rPr>
-              <w:t>Rendered page</w:t>
+              <w:t>Value</w:t>
             </w:r>
           </w:p>
         </w:tc>
@@ -705,46 +119,29 @@
       <w:tr>
         <w:tc>
           <w:tcPr>
-            <w:tcW w:type="dxa" w:w="8208"/>
-            <w:vAlign w:val="center"/>
+            <w:tcW w:type="dxa" w:w="5040"/>
           </w:tcPr>
           <w:p>
-            <w:pPr>
-              <w:spacing w:before="0" w:after="0" w:line="252" w:lineRule="auto"/>
-              <w:jc w:val="left"/>
-            </w:pPr>
             <w:r>
               <w:rPr>
                 <w:rFonts w:ascii="Calibri" w:hAnsi="Calibri"/>
-                <w:sz w:val="16"/>
+                <w:sz w:val="17"/>
               </w:rPr>
-            </w:r>
-            <w:r>
-              <w:rPr>
-                <w:rFonts w:ascii="Calibri" w:hAnsi="Calibri"/>
-                <w:b w:val="0"/>
-                <w:color w:val="1A1917"/>
-                <w:sz w:val="16"/>
-              </w:rPr>
-              <w:t>1-3. Prerequisites, Python and VS Code</w:t>
+              <w:t>Project</w:t>
             </w:r>
           </w:p>
         </w:tc>
         <w:tc>
           <w:tcPr>
-            <w:tcW w:type="dxa" w:w="1152"/>
-            <w:vAlign w:val="center"/>
+            <w:tcW w:type="dxa" w:w="5040"/>
           </w:tcPr>
           <w:p>
-            <w:pPr>
-              <w:spacing w:before="0" w:after="0"/>
-            </w:pPr>
             <w:r>
               <w:rPr>
                 <w:rFonts w:ascii="Calibri" w:hAnsi="Calibri"/>
-                <w:sz w:val="16"/>
+                <w:sz w:val="17"/>
               </w:rPr>
-              <w:t>3</w:t>
+              <w:t>NewsLens AI</w:t>
             </w:r>
           </w:p>
         </w:tc>
@@ -752,48 +149,29 @@
       <w:tr>
         <w:tc>
           <w:tcPr>
-            <w:tcW w:type="dxa" w:w="8208"/>
-            <w:vAlign w:val="center"/>
-            <w:shd w:fill="FAFCFF"/>
+            <w:tcW w:type="dxa" w:w="5040"/>
           </w:tcPr>
           <w:p>
-            <w:pPr>
-              <w:spacing w:before="0" w:after="0" w:line="252" w:lineRule="auto"/>
-              <w:jc w:val="left"/>
-            </w:pPr>
             <w:r>
               <w:rPr>
                 <w:rFonts w:ascii="Calibri" w:hAnsi="Calibri"/>
-                <w:sz w:val="16"/>
+                <w:sz w:val="17"/>
               </w:rPr>
-            </w:r>
-            <w:r>
-              <w:rPr>
-                <w:rFonts w:ascii="Calibri" w:hAnsi="Calibri"/>
-                <w:b w:val="0"/>
-                <w:color w:val="1A1917"/>
-                <w:sz w:val="16"/>
-              </w:rPr>
-              <w:t>4-6. Extract, virtual environment and interpreter</w:t>
+              <w:t>Phase</w:t>
             </w:r>
           </w:p>
         </w:tc>
         <w:tc>
           <w:tcPr>
-            <w:tcW w:type="dxa" w:w="1152"/>
-            <w:vAlign w:val="center"/>
-            <w:shd w:fill="FAFCFF"/>
+            <w:tcW w:type="dxa" w:w="5040"/>
           </w:tcPr>
           <w:p>
-            <w:pPr>
-              <w:spacing w:before="0" w:after="0"/>
-            </w:pPr>
             <w:r>
               <w:rPr>
                 <w:rFonts w:ascii="Calibri" w:hAnsi="Calibri"/>
-                <w:sz w:val="16"/>
+                <w:sz w:val="17"/>
               </w:rPr>
-              <w:t>4</w:t>
+              <w:t>5S — synthetic dataset, model and deployment</w:t>
             </w:r>
           </w:p>
         </w:tc>
@@ -801,46 +179,29 @@
       <w:tr>
         <w:tc>
           <w:tcPr>
-            <w:tcW w:type="dxa" w:w="8208"/>
-            <w:vAlign w:val="center"/>
+            <w:tcW w:type="dxa" w:w="5040"/>
           </w:tcPr>
           <w:p>
-            <w:pPr>
-              <w:spacing w:before="0" w:after="0" w:line="252" w:lineRule="auto"/>
-              <w:jc w:val="left"/>
-            </w:pPr>
             <w:r>
               <w:rPr>
                 <w:rFonts w:ascii="Calibri" w:hAnsi="Calibri"/>
-                <w:sz w:val="16"/>
+                <w:sz w:val="17"/>
               </w:rPr>
-            </w:r>
-            <w:r>
-              <w:rPr>
-                <w:rFonts w:ascii="Calibri" w:hAnsi="Calibri"/>
-                <w:b w:val="0"/>
-                <w:color w:val="1A1917"/>
-                <w:sz w:val="16"/>
-              </w:rPr>
-              <w:t>7-9. Dependencies and Streamlit startup</w:t>
+              <w:t>Author</w:t>
             </w:r>
           </w:p>
         </w:tc>
         <w:tc>
           <w:tcPr>
-            <w:tcW w:type="dxa" w:w="1152"/>
-            <w:vAlign w:val="center"/>
+            <w:tcW w:type="dxa" w:w="5040"/>
           </w:tcPr>
           <w:p>
-            <w:pPr>
-              <w:spacing w:before="0" w:after="0"/>
-            </w:pPr>
             <w:r>
               <w:rPr>
                 <w:rFonts w:ascii="Calibri" w:hAnsi="Calibri"/>
-                <w:sz w:val="16"/>
+                <w:sz w:val="17"/>
               </w:rPr>
-              <w:t>5</w:t>
+              <w:t>Deven Sachin Gaikwad</w:t>
             </w:r>
           </w:p>
         </w:tc>
@@ -848,48 +209,200 @@
       <w:tr>
         <w:tc>
           <w:tcPr>
-            <w:tcW w:type="dxa" w:w="8208"/>
-            <w:vAlign w:val="center"/>
-            <w:shd w:fill="FAFCFF"/>
+            <w:tcW w:type="dxa" w:w="5040"/>
           </w:tcPr>
           <w:p>
-            <w:pPr>
-              <w:spacing w:before="0" w:after="0" w:line="252" w:lineRule="auto"/>
-              <w:jc w:val="left"/>
-            </w:pPr>
             <w:r>
               <w:rPr>
                 <w:rFonts w:ascii="Calibri" w:hAnsi="Calibri"/>
-                <w:sz w:val="16"/>
+                <w:sz w:val="17"/>
               </w:rPr>
-            </w:r>
-            <w:r>
-              <w:rPr>
-                <w:rFonts w:ascii="Calibri" w:hAnsi="Calibri"/>
-                <w:b w:val="0"/>
-                <w:color w:val="1A1917"/>
-                <w:sz w:val="16"/>
-              </w:rPr>
-              <w:t>10. First sample analysis</w:t>
+              <w:t>Status</w:t>
             </w:r>
           </w:p>
         </w:tc>
         <w:tc>
           <w:tcPr>
-            <w:tcW w:type="dxa" w:w="1152"/>
-            <w:vAlign w:val="center"/>
-            <w:shd w:fill="FAFCFF"/>
+            <w:tcW w:type="dxa" w:w="5040"/>
           </w:tcPr>
           <w:p>
-            <w:pPr>
-              <w:spacing w:before="0" w:after="0"/>
-            </w:pPr>
             <w:r>
               <w:rPr>
                 <w:rFonts w:ascii="Calibri" w:hAnsi="Calibri"/>
-                <w:sz w:val="16"/>
+                <w:sz w:val="17"/>
               </w:rPr>
-              <w:t>6</w:t>
+              <w:t>PR B evidence package; external deployment values recorded after protected merge</w:t>
+            </w:r>
+          </w:p>
+        </w:tc>
+      </w:tr>
+    </w:tbl>
+    <w:p/>
+    <w:p>
+      <w:pPr>
+        <w:pStyle w:val="Heading1"/>
+      </w:pPr>
+      <w:r>
+        <w:t>NewsLens AI</w:t>
+      </w:r>
+    </w:p>
+    <w:p>
+      <w:r>
+        <w:t xml:space="preserve">NewsLens AI is a noncommercial student and placement-portfolio demonstration built by </w:t>
+      </w:r>
+      <w:r>
+        <w:rPr>
+          <w:b/>
+        </w:rPr>
+        <w:t>Deven Sachin Gaikwad</w:t>
+      </w:r>
+      <w:r>
+        <w:t>. It combines deterministic extractive summarisation with an explainable classifier trained exclusively on an independently created synthetic benchmark.</w:t>
+      </w:r>
+    </w:p>
+    <w:p>
+      <w:r>
+        <w:t xml:space="preserve">The classifier has a deliberately narrow purpose: compare the visible </w:t>
+      </w:r>
+      <w:r>
+        <w:rPr>
+          <w:rFonts w:ascii="Consolas" w:hAnsi="Consolas"/>
+          <w:sz w:val="17"/>
+        </w:rPr>
+        <w:t>Reference note</w:t>
+      </w:r>
+      <w:r>
+        <w:t xml:space="preserve"> and </w:t>
+      </w:r>
+      <w:r>
+        <w:rPr>
+          <w:rFonts w:ascii="Consolas" w:hAnsi="Consolas"/>
+          <w:sz w:val="17"/>
+        </w:rPr>
+        <w:t>Article account</w:t>
+      </w:r>
+      <w:r>
+        <w:t xml:space="preserve"> fields in the supported fictional format and indicate whether their ledgers are consistent or contradicting. It is </w:t>
+      </w:r>
+      <w:r>
+        <w:rPr>
+          <w:b/>
+        </w:rPr>
+        <w:t>not</w:t>
+      </w:r>
+      <w:r>
+        <w:t xml:space="preserve"> a general fake-news detector and does not establish real-world truth.</w:t>
+      </w:r>
+    </w:p>
+    <w:p>
+      <w:pPr>
+        <w:pStyle w:val="Heading2"/>
+      </w:pPr>
+      <w:r>
+        <w:t>What is public</w:t>
+      </w:r>
+    </w:p>
+    <w:p>
+      <w:pPr>
+        <w:pStyle w:val="ListBullet"/>
+      </w:pPr>
+      <w:r>
+        <w:t>24,000 original synthetic articles representing 12,000 fictional paired events.</w:t>
+      </w:r>
+    </w:p>
+    <w:p>
+      <w:pPr>
+        <w:pStyle w:val="ListBullet"/>
+      </w:pPr>
+      <w:r>
+        <w:t>Deterministic generator, manifest, audit evidence, and reproducibility tests.</w:t>
+      </w:r>
+    </w:p>
+    <w:p>
+      <w:pPr>
+        <w:pStyle w:val="ListBullet"/>
+      </w:pPr>
+      <w:r>
+        <w:t>TF-IDF bigram + Logistic Regression public model.</w:t>
+      </w:r>
+    </w:p>
+    <w:p>
+      <w:pPr>
+        <w:pStyle w:val="ListBullet"/>
+      </w:pPr>
+      <w:r>
+        <w:t>Platt calibration cryptographically bound to the exact model SHA-256.</w:t>
+      </w:r>
+    </w:p>
+    <w:p>
+      <w:pPr>
+        <w:pStyle w:val="ListBullet"/>
+      </w:pPr>
+      <w:r>
+        <w:t>Group-safe training, validation, calibration, abstention-policy, and locked-test partitions.</w:t>
+      </w:r>
+    </w:p>
+    <w:p>
+      <w:pPr>
+        <w:pStyle w:val="ListBullet"/>
+      </w:pPr>
+      <w:r>
+        <w:t>Streamlit interface with summarisation, classification, abstention, explanations, exports, session-local review, and aggregate monitoring.</w:t>
+      </w:r>
+    </w:p>
+    <w:p>
+      <w:r>
+        <w:t>No ISOT row, copied phrase, close paraphrase, transformation, translation, summary, reconstruction, private ISOT model, private calibration artifact, or external copyrighted training dataset is included.</w:t>
+      </w:r>
+    </w:p>
+    <w:p>
+      <w:pPr>
+        <w:pStyle w:val="Heading2"/>
+      </w:pPr>
+      <w:r>
+        <w:t>Measured evidence</w:t>
+      </w:r>
+    </w:p>
+    <w:tbl>
+      <w:tblPr>
+        <w:tblStyle w:val="TableGrid"/>
+        <w:tblW w:type="auto" w:w="0"/>
+        <w:tblLook w:firstColumn="1" w:firstRow="1" w:lastColumn="0" w:lastRow="0" w:noHBand="0" w:noVBand="1" w:val="04A0"/>
+      </w:tblPr>
+      <w:tblGrid>
+        <w:gridCol w:w="5040"/>
+        <w:gridCol w:w="5040"/>
+      </w:tblGrid>
+      <w:tr>
+        <w:tc>
+          <w:tcPr>
+            <w:tcW w:type="dxa" w:w="5040"/>
+            <w:shd w:fill="EAE4D8"/>
+          </w:tcPr>
+          <w:p>
+            <w:r>
+              <w:rPr>
+                <w:rFonts w:ascii="Calibri" w:hAnsi="Calibri"/>
+                <w:b/>
+                <w:sz w:val="17"/>
+              </w:rPr>
+              <w:t>Measure</w:t>
+            </w:r>
+          </w:p>
+        </w:tc>
+        <w:tc>
+          <w:tcPr>
+            <w:tcW w:type="dxa" w:w="5040"/>
+            <w:shd w:fill="EAE4D8"/>
+          </w:tcPr>
+          <w:p>
+            <w:r>
+              <w:rPr>
+                <w:rFonts w:ascii="Calibri" w:hAnsi="Calibri"/>
+                <w:b/>
+                <w:sz w:val="17"/>
+              </w:rPr>
+              <w:t>Result</w:t>
             </w:r>
           </w:p>
         </w:tc>
@@ -897,46 +410,29 @@
       <w:tr>
         <w:tc>
           <w:tcPr>
-            <w:tcW w:type="dxa" w:w="8208"/>
-            <w:vAlign w:val="center"/>
+            <w:tcW w:type="dxa" w:w="5040"/>
           </w:tcPr>
           <w:p>
-            <w:pPr>
-              <w:spacing w:before="0" w:after="0" w:line="252" w:lineRule="auto"/>
-              <w:jc w:val="left"/>
-            </w:pPr>
             <w:r>
               <w:rPr>
                 <w:rFonts w:ascii="Calibri" w:hAnsi="Calibri"/>
-                <w:sz w:val="16"/>
+                <w:sz w:val="17"/>
               </w:rPr>
-            </w:r>
-            <w:r>
-              <w:rPr>
-                <w:rFonts w:ascii="Calibri" w:hAnsi="Calibri"/>
-                <w:b w:val="0"/>
-                <w:color w:val="1A1917"/>
-                <w:sz w:val="16"/>
-              </w:rPr>
-              <w:t>11-15. Operations, datasets and retraining</w:t>
+              <w:t>Locked final-test rows</w:t>
             </w:r>
           </w:p>
         </w:tc>
         <w:tc>
           <w:tcPr>
-            <w:tcW w:type="dxa" w:w="1152"/>
-            <w:vAlign w:val="center"/>
+            <w:tcW w:type="dxa" w:w="5040"/>
           </w:tcPr>
           <w:p>
-            <w:pPr>
-              <w:spacing w:before="0" w:after="0"/>
-            </w:pPr>
             <w:r>
               <w:rPr>
                 <w:rFonts w:ascii="Calibri" w:hAnsi="Calibri"/>
-                <w:sz w:val="16"/>
+                <w:sz w:val="17"/>
               </w:rPr>
-              <w:t>10</w:t>
+              <w:t>1,200</w:t>
             </w:r>
           </w:p>
         </w:tc>
@@ -944,48 +440,29 @@
       <w:tr>
         <w:tc>
           <w:tcPr>
-            <w:tcW w:type="dxa" w:w="8208"/>
-            <w:vAlign w:val="center"/>
-            <w:shd w:fill="FAFCFF"/>
+            <w:tcW w:type="dxa" w:w="5040"/>
           </w:tcPr>
           <w:p>
-            <w:pPr>
-              <w:spacing w:before="0" w:after="0" w:line="252" w:lineRule="auto"/>
-              <w:jc w:val="left"/>
-            </w:pPr>
             <w:r>
               <w:rPr>
                 <w:rFonts w:ascii="Calibri" w:hAnsi="Calibri"/>
-                <w:sz w:val="16"/>
+                <w:sz w:val="17"/>
               </w:rPr>
-            </w:r>
-            <w:r>
-              <w:rPr>
-                <w:rFonts w:ascii="Calibri" w:hAnsi="Calibri"/>
-                <w:b w:val="0"/>
-                <w:color w:val="1A1917"/>
-                <w:sz w:val="16"/>
-              </w:rPr>
-              <w:t>16-17. Tests and public deployment</w:t>
+              <w:t>Accuracy / balanced accuracy / macro F1</w:t>
             </w:r>
           </w:p>
         </w:tc>
         <w:tc>
           <w:tcPr>
-            <w:tcW w:type="dxa" w:w="1152"/>
-            <w:vAlign w:val="center"/>
-            <w:shd w:fill="FAFCFF"/>
+            <w:tcW w:type="dxa" w:w="5040"/>
           </w:tcPr>
           <w:p>
-            <w:pPr>
-              <w:spacing w:before="0" w:after="0"/>
-            </w:pPr>
             <w:r>
               <w:rPr>
                 <w:rFonts w:ascii="Calibri" w:hAnsi="Calibri"/>
-                <w:sz w:val="16"/>
+                <w:sz w:val="17"/>
               </w:rPr>
-              <w:t>12</w:t>
+              <w:t>1.000 / 1.000 / 1.000</w:t>
             </w:r>
           </w:p>
         </w:tc>
@@ -993,46 +470,29 @@
       <w:tr>
         <w:tc>
           <w:tcPr>
-            <w:tcW w:type="dxa" w:w="8208"/>
-            <w:vAlign w:val="center"/>
+            <w:tcW w:type="dxa" w:w="5040"/>
           </w:tcPr>
           <w:p>
-            <w:pPr>
-              <w:spacing w:before="0" w:after="0" w:line="252" w:lineRule="auto"/>
-              <w:jc w:val="left"/>
-            </w:pPr>
             <w:r>
               <w:rPr>
                 <w:rFonts w:ascii="Calibri" w:hAnsi="Calibri"/>
-                <w:sz w:val="16"/>
+                <w:sz w:val="17"/>
               </w:rPr>
-            </w:r>
-            <w:r>
-              <w:rPr>
-                <w:rFonts w:ascii="Calibri" w:hAnsi="Calibri"/>
-                <w:b w:val="0"/>
-                <w:color w:val="1A1917"/>
-                <w:sz w:val="16"/>
-              </w:rPr>
-              <w:t>18. Troubleshooting</w:t>
+              <w:t>Confusion matrix</w:t>
             </w:r>
           </w:p>
         </w:tc>
         <w:tc>
           <w:tcPr>
-            <w:tcW w:type="dxa" w:w="1152"/>
-            <w:vAlign w:val="center"/>
+            <w:tcW w:type="dxa" w:w="5040"/>
           </w:tcPr>
           <w:p>
-            <w:pPr>
-              <w:spacing w:before="0" w:after="0"/>
-            </w:pPr>
             <w:r>
               <w:rPr>
                 <w:rFonts w:ascii="Calibri" w:hAnsi="Calibri"/>
-                <w:sz w:val="16"/>
+                <w:sz w:val="17"/>
               </w:rPr>
-              <w:t>12</w:t>
+              <w:t>`[[600, 0], [0, 600]]`</w:t>
             </w:r>
           </w:p>
         </w:tc>
@@ -1040,120 +500,384 @@
       <w:tr>
         <w:tc>
           <w:tcPr>
-            <w:tcW w:type="dxa" w:w="8208"/>
-            <w:vAlign w:val="center"/>
-            <w:shd w:fill="FAFCFF"/>
+            <w:tcW w:type="dxa" w:w="5040"/>
           </w:tcPr>
           <w:p>
-            <w:pPr>
-              <w:spacing w:before="0" w:after="0" w:line="252" w:lineRule="auto"/>
-              <w:jc w:val="left"/>
-            </w:pPr>
             <w:r>
               <w:rPr>
                 <w:rFonts w:ascii="Calibri" w:hAnsi="Calibri"/>
-                <w:sz w:val="16"/>
+                <w:sz w:val="17"/>
               </w:rPr>
-            </w:r>
-            <w:r>
-              <w:rPr>
-                <w:rFonts w:ascii="Calibri" w:hAnsi="Calibri"/>
-                <w:b w:val="0"/>
-                <w:color w:val="1A1917"/>
-                <w:sz w:val="16"/>
-              </w:rPr>
-              <w:t>19-20. Demo checklist and commands</w:t>
+              <w:t>Platt Brier score</w:t>
             </w:r>
           </w:p>
         </w:tc>
         <w:tc>
           <w:tcPr>
-            <w:tcW w:type="dxa" w:w="1152"/>
-            <w:vAlign w:val="center"/>
-            <w:shd w:fill="FAFCFF"/>
+            <w:tcW w:type="dxa" w:w="5040"/>
           </w:tcPr>
           <w:p>
-            <w:pPr>
-              <w:spacing w:before="0" w:after="0"/>
-            </w:pPr>
             <w:r>
               <w:rPr>
                 <w:rFonts w:ascii="Calibri" w:hAnsi="Calibri"/>
-                <w:sz w:val="16"/>
+                <w:sz w:val="17"/>
               </w:rPr>
-              <w:t>14</w:t>
+              <w:t>0.000001497</w:t>
+            </w:r>
+          </w:p>
+        </w:tc>
+      </w:tr>
+      <w:tr>
+        <w:tc>
+          <w:tcPr>
+            <w:tcW w:type="dxa" w:w="5040"/>
+          </w:tcPr>
+          <w:p>
+            <w:r>
+              <w:rPr>
+                <w:rFonts w:ascii="Calibri" w:hAnsi="Calibri"/>
+                <w:sz w:val="17"/>
+              </w:rPr>
+              <w:t>Expected calibration error</w:t>
+            </w:r>
+          </w:p>
+        </w:tc>
+        <w:tc>
+          <w:tcPr>
+            <w:tcW w:type="dxa" w:w="5040"/>
+          </w:tcPr>
+          <w:p>
+            <w:r>
+              <w:rPr>
+                <w:rFonts w:ascii="Calibri" w:hAnsi="Calibri"/>
+                <w:sz w:val="17"/>
+              </w:rPr>
+              <w:t>0.000742</w:t>
+            </w:r>
+          </w:p>
+        </w:tc>
+      </w:tr>
+      <w:tr>
+        <w:tc>
+          <w:tcPr>
+            <w:tcW w:type="dxa" w:w="5040"/>
+          </w:tcPr>
+          <w:p>
+            <w:r>
+              <w:rPr>
+                <w:rFonts w:ascii="Calibri" w:hAnsi="Calibri"/>
+                <w:sz w:val="17"/>
+              </w:rPr>
+              <w:t>Counterfactual account-swap flip rate</w:t>
+            </w:r>
+          </w:p>
+        </w:tc>
+        <w:tc>
+          <w:tcPr>
+            <w:tcW w:type="dxa" w:w="5040"/>
+          </w:tcPr>
+          <w:p>
+            <w:r>
+              <w:rPr>
+                <w:rFonts w:ascii="Calibri" w:hAnsi="Calibri"/>
+                <w:sz w:val="17"/>
+              </w:rPr>
+              <w:t>100%</w:t>
+            </w:r>
+          </w:p>
+        </w:tc>
+      </w:tr>
+      <w:tr>
+        <w:tc>
+          <w:tcPr>
+            <w:tcW w:type="dxa" w:w="5040"/>
+          </w:tcPr>
+          <w:p>
+            <w:r>
+              <w:rPr>
+                <w:rFonts w:ascii="Calibri" w:hAnsi="Calibri"/>
+                <w:sz w:val="17"/>
+              </w:rPr>
+              <w:t>Surface-text-only balanced accuracy</w:t>
+            </w:r>
+          </w:p>
+        </w:tc>
+        <w:tc>
+          <w:tcPr>
+            <w:tcW w:type="dxa" w:w="5040"/>
+          </w:tcPr>
+          <w:p>
+            <w:r>
+              <w:rPr>
+                <w:rFonts w:ascii="Calibri" w:hAnsi="Calibri"/>
+                <w:sz w:val="17"/>
+              </w:rPr>
+              <w:t>0.500</w:t>
+            </w:r>
+          </w:p>
+        </w:tc>
+      </w:tr>
+      <w:tr>
+        <w:tc>
+          <w:tcPr>
+            <w:tcW w:type="dxa" w:w="5040"/>
+          </w:tcPr>
+          <w:p>
+            <w:r>
+              <w:rPr>
+                <w:rFonts w:ascii="Calibri" w:hAnsi="Calibri"/>
+                <w:sz w:val="17"/>
+              </w:rPr>
+              <w:t>Fact-block ablation balanced accuracy</w:t>
+            </w:r>
+          </w:p>
+        </w:tc>
+        <w:tc>
+          <w:tcPr>
+            <w:tcW w:type="dxa" w:w="5040"/>
+          </w:tcPr>
+          <w:p>
+            <w:r>
+              <w:rPr>
+                <w:rFonts w:ascii="Calibri" w:hAnsi="Calibri"/>
+                <w:sz w:val="17"/>
+              </w:rPr>
+              <w:t>0.498</w:t>
+            </w:r>
+          </w:p>
+        </w:tc>
+      </w:tr>
+      <w:tr>
+        <w:tc>
+          <w:tcPr>
+            <w:tcW w:type="dxa" w:w="5040"/>
+          </w:tcPr>
+          <w:p>
+            <w:r>
+              <w:rPr>
+                <w:rFonts w:ascii="Calibri" w:hAnsi="Calibri"/>
+                <w:sz w:val="17"/>
+              </w:rPr>
+              <w:t>Metadata-only balanced accuracy</w:t>
+            </w:r>
+          </w:p>
+        </w:tc>
+        <w:tc>
+          <w:tcPr>
+            <w:tcW w:type="dxa" w:w="5040"/>
+          </w:tcPr>
+          <w:p>
+            <w:r>
+              <w:rPr>
+                <w:rFonts w:ascii="Calibri" w:hAnsi="Calibri"/>
+                <w:sz w:val="17"/>
+              </w:rPr>
+              <w:t>0.521</w:t>
             </w:r>
           </w:p>
         </w:tc>
       </w:tr>
     </w:tbl>
+    <w:p/>
     <w:p>
-      <w:pPr>
-        <w:spacing w:after="20"/>
-      </w:pPr>
+      <w:r>
+        <w:t>Perfect in-distribution performance reflects a structured synthetic comparison task; it must not be interpreted as unrestricted news-veracity performance.</w:t>
+      </w:r>
     </w:p>
     <w:p>
       <w:pPr>
-        <w:spacing w:before="80"/>
+        <w:pStyle w:val="Heading2"/>
       </w:pPr>
       <w:r>
-        <w:rPr>
-          <w:rFonts w:ascii="Calibri" w:hAnsi="Calibri"/>
-          <w:i/>
-          <w:color w:val="6F685F"/>
-          <w:sz w:val="17"/>
-        </w:rPr>
-        <w:t>Page references match the packaged render; headings remain Word-native for navigation and future TOC updates.</w:t>
+        <w:t>Run locally</w:t>
       </w:r>
     </w:p>
     <w:p>
       <w:r>
-        <w:br w:type="page"/>
+        <w:t>Python 3.12 is the deployment target.</w:t>
       </w:r>
     </w:p>
     <w:p>
       <w:pPr>
-        <w:spacing w:before="80" w:after="140" w:line="259" w:lineRule="auto"/>
-        <w:ind w:left="173" w:right="173"/>
-        <w:shd w:fill="E8EEE8"/>
-        <w:pBdr>
-          <w:left w:val="single" w:sz="20" w:space="8" w:color="496454"/>
-          <w:top w:val="single" w:sz="4" w:space="5" w:color="D6CEC2"/>
-          <w:bottom w:val="single" w:sz="4" w:space="5" w:color="D6CEC2"/>
-          <w:right w:val="single" w:sz="4" w:space="5" w:color="D6CEC2"/>
-        </w:pBdr>
+        <w:ind w:left="360"/>
+        <w:shd w:fill="F0EEE9"/>
       </w:pPr>
       <w:r>
         <w:rPr>
-          <w:rFonts w:ascii="Calibri" w:hAnsi="Calibri"/>
-          <w:b/>
-          <w:color w:val="496454"/>
-          <w:sz w:val="19"/>
+          <w:rFonts w:ascii="Consolas" w:hAnsi="Consolas"/>
+          <w:sz w:val="16"/>
         </w:rPr>
-        <w:t xml:space="preserve">Recommended path: </w:t>
-      </w:r>
-      <w:r>
-        <w:rPr>
-          <w:rFonts w:ascii="Calibri" w:hAnsi="Calibri"/>
-          <w:color w:val="1A1917"/>
-          <w:sz w:val="19"/>
-        </w:rPr>
-        <w:t>Use the tested Python 3.12 runtime and requirements-lite.txt first. It runs the complete extractive summary, saved classifier, explanations, session-private history and exports without PyTorch.</w:t>
-      </w:r>
-    </w:p>
-    <w:p>
-      <w:pPr/>
-      <w:r>
-        <w:t>Maintenance reconciliation, 13 September 2026. Public validation: 144 tests pass; four private-model tests are deselected. The Next.js presentation build, CI, PR dependency review and both CodeQL analyses pass; CodeQL uses Action v4. This does not prove zero historical security alerts. Streamlit is the ML runtime; neither app is deployed. Hosting requires a resolved Streamlit URL and confirmed model-redistribution rights. August benchmarks and private-artifact/browser evidence remain historical and unchanged.</w:t>
+        <w:t>python -m venv .venv</w:t>
       </w:r>
     </w:p>
     <w:p>
       <w:pPr>
-        <w:pStyle w:val="Heading1"/>
-        <w:keepNext/>
+        <w:ind w:left="360"/>
+        <w:shd w:fill="F0EEE9"/>
       </w:pPr>
       <w:r>
-        <w:t>1. What you need</w:t>
+        <w:rPr>
+          <w:rFonts w:ascii="Consolas" w:hAnsi="Consolas"/>
+          <w:sz w:val="16"/>
+        </w:rPr>
+        <w:t>source .venv/bin/activate</w:t>
+      </w:r>
+    </w:p>
+    <w:p>
+      <w:pPr>
+        <w:ind w:left="360"/>
+        <w:shd w:fill="F0EEE9"/>
+      </w:pPr>
+      <w:r>
+        <w:rPr>
+          <w:rFonts w:ascii="Consolas" w:hAnsi="Consolas"/>
+          <w:sz w:val="16"/>
+        </w:rPr>
+        <w:t>python -m pip install -r requirements-lite.txt</w:t>
+      </w:r>
+    </w:p>
+    <w:p>
+      <w:pPr>
+        <w:ind w:left="360"/>
+        <w:shd w:fill="F0EEE9"/>
+      </w:pPr>
+      <w:r>
+        <w:rPr>
+          <w:rFonts w:ascii="Consolas" w:hAnsi="Consolas"/>
+          <w:sz w:val="16"/>
+        </w:rPr>
+        <w:t>python -m streamlit run app.py</w:t>
+      </w:r>
+    </w:p>
+    <w:p>
+      <w:r>
+        <w:t xml:space="preserve">On Windows PowerShell, activate with </w:t>
+      </w:r>
+      <w:r>
+        <w:rPr>
+          <w:rFonts w:ascii="Consolas" w:hAnsi="Consolas"/>
+          <w:sz w:val="17"/>
+        </w:rPr>
+        <w:t>.venv\Scripts\Activate.ps1</w:t>
+      </w:r>
+      <w:r>
+        <w:t>.</w:t>
+      </w:r>
+    </w:p>
+    <w:p>
+      <w:r>
+        <w:t xml:space="preserve">No API key or secret is required. The packaged model and calibration are loaded from </w:t>
+      </w:r>
+      <w:r>
+        <w:rPr>
+          <w:rFonts w:ascii="Consolas" w:hAnsi="Consolas"/>
+          <w:sz w:val="17"/>
+        </w:rPr>
+        <w:t>models/</w:t>
+      </w:r>
+      <w:r>
+        <w:t xml:space="preserve"> without runtime training.</w:t>
+      </w:r>
+    </w:p>
+    <w:p>
+      <w:pPr>
+        <w:pStyle w:val="Heading2"/>
+      </w:pPr>
+      <w:r>
+        <w:t>Reproduce the model package</w:t>
+      </w:r>
+    </w:p>
+    <w:p>
+      <w:r>
+        <w:t>The authoritative dataset archive is already versioned. The following command verifies its identity, trains on the authored training split, selects only on model validation, fits calibration, selects the abstention policy, and evaluates the locked final test once:</w:t>
+      </w:r>
+    </w:p>
+    <w:p>
+      <w:pPr>
+        <w:ind w:left="360"/>
+        <w:shd w:fill="F0EEE9"/>
+      </w:pPr>
+      <w:r>
+        <w:rPr>
+          <w:rFonts w:ascii="Consolas" w:hAnsi="Consolas"/>
+          <w:sz w:val="16"/>
+        </w:rPr>
+        <w:t>python training/train_synthetic_model.py</w:t>
+      </w:r>
+    </w:p>
+    <w:p>
+      <w:r>
+        <w:t xml:space="preserve">The accepted public artifacts are described in </w:t>
+      </w:r>
+      <w:r>
+        <w:rPr>
+          <w:rFonts w:ascii="Consolas" w:hAnsi="Consolas"/>
+          <w:sz w:val="17"/>
+        </w:rPr>
+        <w:t>models/public_artifact_manifest.json</w:t>
+      </w:r>
+      <w:r>
+        <w:t>. Re-running training in a materially different dependency environment can change serialized bytes; publication uses the recorded artifacts and hashes.</w:t>
+      </w:r>
+    </w:p>
+    <w:p>
+      <w:pPr>
+        <w:pStyle w:val="Heading2"/>
+      </w:pPr>
+      <w:r>
+        <w:t>Validate</w:t>
+      </w:r>
+    </w:p>
+    <w:p>
+      <w:pPr>
+        <w:ind w:left="360"/>
+        <w:shd w:fill="F0EEE9"/>
+      </w:pPr>
+      <w:r>
+        <w:rPr>
+          <w:rFonts w:ascii="Consolas" w:hAnsi="Consolas"/>
+          <w:sz w:val="16"/>
+        </w:rPr>
+        <w:t>python -m compileall -q app.py pages src ui tests scripts training synthetic_benchmark</w:t>
+      </w:r>
+    </w:p>
+    <w:p>
+      <w:pPr>
+        <w:ind w:left="360"/>
+        <w:shd w:fill="F0EEE9"/>
+      </w:pPr>
+      <w:r>
+        <w:rPr>
+          <w:rFonts w:ascii="Consolas" w:hAnsi="Consolas"/>
+          <w:sz w:val="16"/>
+        </w:rPr>
+        <w:t>python -m pytest -q --strict-markers</w:t>
+      </w:r>
+    </w:p>
+    <w:p>
+      <w:pPr>
+        <w:ind w:left="360"/>
+        <w:shd w:fill="F0EEE9"/>
+      </w:pPr>
+      <w:r>
+        <w:rPr>
+          <w:rFonts w:ascii="Consolas" w:hAnsi="Consolas"/>
+          <w:sz w:val="16"/>
+        </w:rPr>
+        <w:t>python scripts/audit_public_release.py --allow-publication-gates</w:t>
+      </w:r>
+    </w:p>
+    <w:p>
+      <w:r>
+        <w:t>The release scan verifies the dataset ZIP, public model, calibration binding, legal package, secrets, private artifact exclusions, navigation, and local links.</w:t>
+      </w:r>
+    </w:p>
+    <w:p>
+      <w:pPr>
+        <w:pStyle w:val="Heading2"/>
+      </w:pPr>
+      <w:r>
+        <w:t>Responsible use</w:t>
       </w:r>
     </w:p>
     <w:p>
@@ -1161,10 +885,16 @@
         <w:pStyle w:val="ListBullet"/>
       </w:pPr>
       <w:r>
+        <w:t xml:space="preserve">Inputs lacking both supported fact blocks are routed to </w:t>
+      </w:r>
+      <w:r>
         <w:rPr>
-          <w:rFonts w:ascii="Calibri" w:hAnsi="Calibri"/>
+          <w:b/>
         </w:rPr>
-        <w:t>A 64-bit Windows 10/11 computer (Linux/macOS also work).</w:t>
+        <w:t>Editorial review required</w:t>
+      </w:r>
+      <w:r>
+        <w:t>.</w:t>
       </w:r>
     </w:p>
     <w:p>
@@ -1172,10 +902,7 @@
         <w:pStyle w:val="ListBullet"/>
       </w:pPr>
       <w:r>
-        <w:rPr>
-          <w:rFonts w:ascii="Calibri" w:hAnsi="Calibri"/>
-        </w:rPr>
-        <w:t>At least 4 GB RAM for lightweight mode; 8 GB or more for DistilBART.</w:t>
+        <w:t>Confidence measures agreement with synthetic benchmark labels, not factual truth.</w:t>
       </w:r>
     </w:p>
     <w:p>
@@ -1183,10 +910,7 @@
         <w:pStyle w:val="ListBullet"/>
       </w:pPr>
       <w:r>
-        <w:rPr>
-          <w:rFonts w:ascii="Calibri" w:hAnsi="Calibri"/>
-        </w:rPr>
-        <w:t>About 1 GB free space for lightweight mode; several GB for datasets and transformer caches.</w:t>
+        <w:t>The app does not expose raw training rows.</w:t>
       </w:r>
     </w:p>
     <w:p>
@@ -1194,10 +918,7 @@
         <w:pStyle w:val="ListBullet"/>
       </w:pPr>
       <w:r>
-        <w:rPr>
-          <w:rFonts w:ascii="Calibri" w:hAnsi="Calibri"/>
-        </w:rPr>
-        <w:t>Internet for installation/downloads. Core analysis is local after installation.</w:t>
+        <w:t>Public history is isolated to a visitor session; full article text is not persisted.</w:t>
       </w:r>
     </w:p>
     <w:p>
@@ -1205,19 +926,196 @@
         <w:pStyle w:val="ListBullet"/>
       </w:pPr>
       <w:r>
+        <w:t>Human verification against independent primary sources remains necessary.</w:t>
+      </w:r>
+    </w:p>
+    <w:p>
+      <w:r>
+        <w:t xml:space="preserve">See </w:t>
+      </w:r>
+      <w:r>
         <w:rPr>
-          <w:rFonts w:ascii="Calibri" w:hAnsi="Calibri"/>
+          <w:rFonts w:ascii="Consolas" w:hAnsi="Consolas"/>
+          <w:sz w:val="17"/>
         </w:rPr>
-        <w:t>The core workflow requires no paid API; hosting, network, compute and third-party terms may still carry costs.</w:t>
+        <w:t>docs/DATASET_CARD.md</w:t>
+      </w:r>
+      <w:r>
+        <w:t xml:space="preserve">, </w:t>
+      </w:r>
+      <w:r>
+        <w:rPr>
+          <w:rFonts w:ascii="Consolas" w:hAnsi="Consolas"/>
+          <w:sz w:val="17"/>
+        </w:rPr>
+        <w:t>docs/MODEL_CARD.md</w:t>
+      </w:r>
+      <w:r>
+        <w:t xml:space="preserve">, </w:t>
+      </w:r>
+      <w:r>
+        <w:rPr>
+          <w:rFonts w:ascii="Consolas" w:hAnsi="Consolas"/>
+          <w:sz w:val="17"/>
+        </w:rPr>
+        <w:t>docs/TESTING.md</w:t>
+      </w:r>
+      <w:r>
+        <w:t xml:space="preserve">, and </w:t>
+      </w:r>
+      <w:r>
+        <w:rPr>
+          <w:rFonts w:ascii="Consolas" w:hAnsi="Consolas"/>
+          <w:sz w:val="17"/>
+        </w:rPr>
+        <w:t>docs/DEPLOYMENT.md</w:t>
+      </w:r>
+      <w:r>
+        <w:t xml:space="preserve"> for the full evidence trail.</w:t>
+      </w:r>
+    </w:p>
+    <w:p>
+      <w:r>
+        <w:t>© 2026 Deven Sachin Gaikwad. All Rights Reserved. The synthetic dataset has the separate license described in its dataset card.</w:t>
       </w:r>
     </w:p>
     <w:p>
       <w:pPr>
+        <w:sectPr>
+          <w:headerReference w:type="default" r:id="rId9"/>
+          <w:footerReference w:type="default" r:id="rId10"/>
+          <w:pgSz w:w="12240" w:h="15840"/>
+          <w:pgMar w:top="979" w:right="1037" w:bottom="936" w:left="1123" w:header="720" w:footer="720" w:gutter="0"/>
+          <w:cols w:space="720"/>
+          <w:docGrid w:linePitch="360"/>
+        </w:sectPr>
+      </w:pPr>
+    </w:p>
+    <w:p>
+      <w:pPr>
         <w:pStyle w:val="Heading1"/>
-        <w:keepNext/>
       </w:pPr>
       <w:r>
-        <w:t>2. Install Python</w:t>
+        <w:t>Streamlit Community Cloud Deployment</w:t>
+      </w:r>
+    </w:p>
+    <w:p>
+      <w:pPr>
+        <w:pStyle w:val="Heading2"/>
+      </w:pPr>
+      <w:r>
+        <w:t>Required configuration</w:t>
+      </w:r>
+    </w:p>
+    <w:p>
+      <w:pPr>
+        <w:pStyle w:val="ListBullet"/>
+      </w:pPr>
+      <w:r>
+        <w:t xml:space="preserve">Workspace: </w:t>
+      </w:r>
+      <w:r>
+        <w:rPr>
+          <w:rFonts w:ascii="Consolas" w:hAnsi="Consolas"/>
+          <w:sz w:val="17"/>
+        </w:rPr>
+        <w:t>devengaikwad</w:t>
+      </w:r>
+      <w:r/>
+    </w:p>
+    <w:p>
+      <w:pPr>
+        <w:pStyle w:val="ListBullet"/>
+      </w:pPr>
+      <w:r>
+        <w:t xml:space="preserve">Repository: </w:t>
+      </w:r>
+      <w:r>
+        <w:rPr>
+          <w:rFonts w:ascii="Consolas" w:hAnsi="Consolas"/>
+          <w:sz w:val="17"/>
+        </w:rPr>
+        <w:t>DevenGaikwad/NewsLens-AI</w:t>
+      </w:r>
+      <w:r/>
+    </w:p>
+    <w:p>
+      <w:pPr>
+        <w:pStyle w:val="ListBullet"/>
+      </w:pPr>
+      <w:r>
+        <w:t xml:space="preserve">Branch: </w:t>
+      </w:r>
+      <w:r>
+        <w:rPr>
+          <w:rFonts w:ascii="Consolas" w:hAnsi="Consolas"/>
+          <w:sz w:val="17"/>
+        </w:rPr>
+        <w:t>main</w:t>
+      </w:r>
+      <w:r/>
+    </w:p>
+    <w:p>
+      <w:pPr>
+        <w:pStyle w:val="ListBullet"/>
+      </w:pPr>
+      <w:r>
+        <w:t xml:space="preserve">Entry point: </w:t>
+      </w:r>
+      <w:r>
+        <w:rPr>
+          <w:rFonts w:ascii="Consolas" w:hAnsi="Consolas"/>
+          <w:sz w:val="17"/>
+        </w:rPr>
+        <w:t>app.py</w:t>
+      </w:r>
+      <w:r/>
+    </w:p>
+    <w:p>
+      <w:pPr>
+        <w:pStyle w:val="ListBullet"/>
+      </w:pPr>
+      <w:r>
+        <w:t>Python: 3.12</w:t>
+      </w:r>
+    </w:p>
+    <w:p>
+      <w:pPr>
+        <w:pStyle w:val="ListBullet"/>
+      </w:pPr>
+      <w:r>
+        <w:t>Secrets: empty</w:t>
+      </w:r>
+    </w:p>
+    <w:p>
+      <w:pPr>
+        <w:pStyle w:val="ListBullet"/>
+      </w:pPr>
+      <w:r>
+        <w:t>Plan: free / Community Cloud</w:t>
+      </w:r>
+    </w:p>
+    <w:p>
+      <w:r>
+        <w:t xml:space="preserve">The repository includes the public synthetic model and bound calibration, so deployment does not download a checkpoint or retrain. </w:t>
+      </w:r>
+      <w:r>
+        <w:rPr>
+          <w:rFonts w:ascii="Consolas" w:hAnsi="Consolas"/>
+          <w:sz w:val="17"/>
+        </w:rPr>
+        <w:t>requirements.txt</w:t>
+      </w:r>
+      <w:r>
+        <w:t xml:space="preserve"> delegates to the lightweight pinned runtime requirements and contains no external transformer stack.</w:t>
+      </w:r>
+    </w:p>
+    <w:p>
+      <w:pPr>
+        <w:pStyle w:val="Heading2"/>
+      </w:pPr>
+      <w:r>
+        <w:t>Procedure</w:t>
       </w:r>
     </w:p>
     <w:p>
@@ -1225,10 +1123,7 @@
         <w:pStyle w:val="ListNumber"/>
       </w:pPr>
       <w:r>
-        <w:rPr>
-          <w:rFonts w:ascii="Calibri" w:hAnsi="Calibri"/>
-        </w:rPr>
-        <w:t>Visit https://www.python.org/downloads/ and choose Python 3.12.x for Windows.</w:t>
+        <w:t>Confirm PR B is merged and exact-new-main checks pass.</w:t>
       </w:r>
     </w:p>
     <w:p>
@@ -1236,10 +1131,7 @@
         <w:pStyle w:val="ListNumber"/>
       </w:pPr>
       <w:r>
-        <w:rPr>
-          <w:rFonts w:ascii="Calibri" w:hAnsi="Calibri"/>
-        </w:rPr>
-        <w:t>Run the installer and tick 'Add python.exe to PATH'.</w:t>
+        <w:t>In Streamlit Community Cloud, create or update the app with the values above.</w:t>
       </w:r>
     </w:p>
     <w:p>
@@ -1247,10 +1139,7 @@
         <w:pStyle w:val="ListNumber"/>
       </w:pPr>
       <w:r>
-        <w:rPr>
-          <w:rFonts w:ascii="Calibri" w:hAnsi="Calibri"/>
-        </w:rPr>
-        <w:t>Choose Install Now.</w:t>
+        <w:t>Wait for dependency installation and startup to finish; inspect logs for model or calibration errors.</w:t>
       </w:r>
     </w:p>
     <w:p>
@@ -1258,50 +1147,17 @@
         <w:pStyle w:val="ListNumber"/>
       </w:pPr>
       <w:r>
-        <w:rPr>
-          <w:rFonts w:ascii="Calibri" w:hAnsi="Calibri"/>
-        </w:rPr>
-        <w:t>Open Command Prompt and run the verification command below.</w:t>
+        <w:t xml:space="preserve">Record the exact deployed main commit and final </w:t>
       </w:r>
-    </w:p>
-    <w:p>
-      <w:pPr>
-        <w:pStyle w:val="CodeBlock"/>
-        <w:keepLines/>
-        <w:shd w:fill="EEF3F8"/>
-      </w:pPr>
       <w:r>
         <w:rPr>
           <w:rFonts w:ascii="Consolas" w:hAnsi="Consolas"/>
-          <w:color w:val="2A241F"/>
           <w:sz w:val="17"/>
         </w:rPr>
-        <w:t>py -3.12 --version</w:t>
+        <w:t>https://…streamlit.app</w:t>
       </w:r>
-    </w:p>
-    <w:p>
-      <w:pPr>
-        <w:spacing w:before="80" w:after="140" w:line="259" w:lineRule="auto"/>
-        <w:ind w:left="173" w:right="173"/>
-        <w:shd w:fill="EEF5FF"/>
-        <w:pBdr>
-          <w:left w:val="single" w:sz="20" w:space="8" w:color="6D5947"/>
-          <w:top w:val="single" w:sz="4" w:space="5" w:color="D6CEC2"/>
-          <w:bottom w:val="single" w:sz="4" w:space="5" w:color="D6CEC2"/>
-          <w:right w:val="single" w:sz="4" w:space="5" w:color="D6CEC2"/>
-        </w:pBdr>
-      </w:pPr>
       <w:r>
-        <w:t>Expected: Python reports 3.12.x. Do not use a Microsoft Store alias if VS Code points to a different interpreter.</w:t>
-      </w:r>
-    </w:p>
-    <w:p>
-      <w:pPr>
-        <w:pStyle w:val="Heading1"/>
-        <w:keepNext/>
-      </w:pPr>
-      <w:r>
-        <w:t>3. Install VS Code and the Python extension</w:t>
+        <w:t xml:space="preserve"> URL.</w:t>
       </w:r>
     </w:p>
     <w:p>
@@ -1309,10 +1165,7 @@
         <w:pStyle w:val="ListNumber"/>
       </w:pPr>
       <w:r>
-        <w:rPr>
-          <w:rFonts w:ascii="Calibri" w:hAnsi="Calibri"/>
-        </w:rPr>
-        <w:t>Download Visual Studio Code from https://code.visualstudio.com/.</w:t>
+        <w:t>Test News Desk navigation, consistent, contradicting, and abstention samples, extractive summary, explanations, JSON/PDF/CSV exports, invalid input, session isolation, desktop/mobile layout, and public access.</w:t>
       </w:r>
     </w:p>
     <w:p>
@@ -1320,1405 +1173,56 @@
         <w:pStyle w:val="ListNumber"/>
       </w:pPr>
       <w:r>
-        <w:rPr>
-          <w:rFonts w:ascii="Calibri" w:hAnsi="Calibri"/>
-        </w:rPr>
-        <w:t>Install and open VS Code.</w:t>
-      </w:r>
-    </w:p>
-    <w:p>
-      <w:pPr>
-        <w:pStyle w:val="ListNumber"/>
-      </w:pPr>
-      <w:r>
-        <w:rPr>
-          <w:rFonts w:ascii="Calibri" w:hAnsi="Calibri"/>
-        </w:rPr>
-        <w:t>Open Extensions (Ctrl+Shift+X).</w:t>
-      </w:r>
-    </w:p>
-    <w:p>
-      <w:pPr>
-        <w:pStyle w:val="ListNumber"/>
-      </w:pPr>
-      <w:r>
-        <w:rPr>
-          <w:rFonts w:ascii="Calibri" w:hAnsi="Calibri"/>
-        </w:rPr>
-        <w:t>Install the Microsoft 'Python' extension.</w:t>
-      </w:r>
-    </w:p>
-    <w:p>
-      <w:pPr>
-        <w:pStyle w:val="ListNumber"/>
-      </w:pPr>
-      <w:r>
-        <w:rPr>
-          <w:rFonts w:ascii="Calibri" w:hAnsi="Calibri"/>
-        </w:rPr>
-        <w:t>Optionally install Jupyter to open the packaged notebooks.</w:t>
+        <w:t>Confirm the UI does not expose the dataset ZIP or raw training rows.</w:t>
       </w:r>
     </w:p>
     <w:p>
       <w:r>
-        <w:br w:type="page"/>
-      </w:r>
-    </w:p>
-    <w:p>
-      <w:pPr>
-        <w:pStyle w:val="Heading1"/>
-        <w:keepNext/>
-      </w:pPr>
-      <w:r>
-        <w:t>4. Extract and open the project</w:t>
-      </w:r>
-    </w:p>
-    <w:p>
-      <w:pPr>
-        <w:pStyle w:val="ListNumber"/>
-      </w:pPr>
-      <w:r>
-        <w:rPr>
-          <w:rFonts w:ascii="Calibri" w:hAnsi="Calibri"/>
-        </w:rPr>
-        <w:t>Clone the public NewsLens-AI repository or download its source archive.</w:t>
-      </w:r>
-    </w:p>
-    <w:p>
-      <w:pPr>
-        <w:pStyle w:val="ListNumber"/>
-      </w:pPr>
-      <w:r>
-        <w:rPr>
-          <w:rFonts w:ascii="Calibri" w:hAnsi="Calibri"/>
-        </w:rPr>
-        <w:t>Extract it to a short path such as C:\Projects when using a ZIP.</w:t>
-      </w:r>
-    </w:p>
-    <w:p>
-      <w:pPr>
-        <w:pStyle w:val="ListNumber"/>
-      </w:pPr>
-      <w:r>
-        <w:rPr>
-          <w:rFonts w:ascii="Calibri" w:hAnsi="Calibri"/>
-        </w:rPr>
-        <w:t>In VS Code select File &gt; Open Folder.</w:t>
-      </w:r>
-    </w:p>
-    <w:p>
-      <w:pPr>
-        <w:pStyle w:val="ListNumber"/>
-      </w:pPr>
-      <w:r>
-        <w:rPr>
-          <w:rFonts w:ascii="Calibri" w:hAnsi="Calibri"/>
-        </w:rPr>
-        <w:t>Open the NewsLens-AI folder that directly contains app.py.</w:t>
-      </w:r>
-    </w:p>
-    <w:p>
-      <w:pPr>
-        <w:pStyle w:val="ListNumber"/>
-      </w:pPr>
-      <w:r>
-        <w:rPr>
-          <w:rFonts w:ascii="Calibri" w:hAnsi="Calibri"/>
-        </w:rPr>
-        <w:t>Choose Terminal &gt; New Terminal.</w:t>
-      </w:r>
-    </w:p>
-    <w:p>
-      <w:pPr>
-        <w:spacing w:before="80" w:after="140" w:line="259" w:lineRule="auto"/>
-        <w:ind w:left="173" w:right="173"/>
-        <w:shd w:fill="F3EBDD"/>
-        <w:pBdr>
-          <w:left w:val="single" w:sz="20" w:space="8" w:color="8A693D"/>
-          <w:top w:val="single" w:sz="4" w:space="5" w:color="D6CEC2"/>
-          <w:bottom w:val="single" w:sz="4" w:space="5" w:color="D6CEC2"/>
-          <w:right w:val="single" w:sz="4" w:space="5" w:color="D6CEC2"/>
-        </w:pBdr>
-      </w:pPr>
-      <w:r>
-        <w:rPr>
-          <w:rFonts w:ascii="Calibri" w:hAnsi="Calibri"/>
-          <w:b/>
-          <w:color w:val="8A693D"/>
-          <w:sz w:val="19"/>
-        </w:rPr>
-        <w:t xml:space="preserve">Common folder mistake: </w:t>
-      </w:r>
-      <w:r>
-        <w:rPr>
-          <w:rFonts w:ascii="Calibri" w:hAnsi="Calibri"/>
-          <w:color w:val="1A1917"/>
-          <w:sz w:val="19"/>
-        </w:rPr>
-        <w:t>If the terminal cannot find app.py or requirements-lite.txt, you opened the parent extraction folder. Open the folder containing those files.</w:t>
-      </w:r>
-    </w:p>
-    <w:p>
-      <w:pPr>
-        <w:pStyle w:val="Heading1"/>
-        <w:keepNext/>
-      </w:pPr>
-      <w:r>
-        <w:t>5. Create and activate a virtual environment</w:t>
-      </w:r>
-    </w:p>
-    <w:p>
-      <w:pPr>
-        <w:pStyle w:val="CodeBlock"/>
-        <w:keepLines/>
-        <w:shd w:fill="EEF3F8"/>
-      </w:pPr>
-      <w:r>
-        <w:rPr>
-          <w:rFonts w:ascii="Consolas" w:hAnsi="Consolas"/>
-          <w:color w:val="2A241F"/>
-          <w:sz w:val="17"/>
-        </w:rPr>
-        <w:t>py -3.12 -m venv .venv</w:t>
+        <w:t>Vercel is not required and must not be created or modified for this deployment.</w:t>
       </w:r>
     </w:p>
     <w:p>
       <w:pPr>
         <w:pStyle w:val="Heading2"/>
-        <w:keepNext/>
       </w:pPr>
       <w:r>
-        <w:t>5.1 Windows PowerShell</w:t>
+        <w:t>Failure behavior</w:t>
+      </w:r>
+    </w:p>
+    <w:p>
+      <w:r>
+        <w:t>Missing model files raise an actionable startup error. A calibration/model hash mismatch fails closed and forces review rather than reporting unverified confidence. Inputs outside the paired-ledger format abstain.</w:t>
       </w:r>
     </w:p>
     <w:p>
       <w:pPr>
-        <w:pStyle w:val="CodeBlock"/>
-        <w:keepLines/>
-        <w:shd w:fill="EEF3F8"/>
+        <w:sectPr>
+          <w:pgSz w:w="12240" w:h="15840"/>
+          <w:pgMar w:top="979" w:right="1037" w:bottom="936" w:left="1123" w:header="720" w:footer="720" w:gutter="0"/>
+          <w:cols w:space="720"/>
+          <w:docGrid w:linePitch="360"/>
+        </w:sectPr>
+      </w:pPr>
+    </w:p>
+    <w:p>
+      <w:pPr>
+        <w:pStyle w:val="Heading1"/>
       </w:pPr>
       <w:r>
-        <w:rPr>
-          <w:rFonts w:ascii="Consolas" w:hAnsi="Consolas"/>
-          <w:color w:val="2A241F"/>
-          <w:sz w:val="17"/>
-        </w:rPr>
-        <w:t>.venv\Scripts\Activate.ps1</w:t>
+        <w:t>Phase 5S Deployment Checkpoint</w:t>
+      </w:r>
+    </w:p>
+    <w:p>
+      <w:r>
+        <w:t>Updated: 26 September 2026</w:t>
       </w:r>
     </w:p>
     <w:p>
       <w:pPr>
         <w:pStyle w:val="Heading2"/>
-        <w:keepNext/>
       </w:pPr>
       <w:r>
-        <w:t>5.2 Windows Command Prompt</w:t>
-      </w:r>
-    </w:p>
-    <w:p>
-      <w:pPr>
-        <w:pStyle w:val="CodeBlock"/>
-        <w:keepLines/>
-        <w:shd w:fill="EEF3F8"/>
-      </w:pPr>
-      <w:r>
-        <w:rPr>
-          <w:rFonts w:ascii="Consolas" w:hAnsi="Consolas"/>
-          <w:color w:val="2A241F"/>
-          <w:sz w:val="17"/>
-        </w:rPr>
-        <w:t>.venv\Scripts\activate.bat</w:t>
-      </w:r>
-    </w:p>
-    <w:p>
-      <w:pPr>
-        <w:pStyle w:val="Heading2"/>
-        <w:keepNext/>
-      </w:pPr>
-      <w:r>
-        <w:t>5.3 Linux or macOS</w:t>
-      </w:r>
-    </w:p>
-    <w:p>
-      <w:pPr>
-        <w:pStyle w:val="CodeBlock"/>
-        <w:keepLines/>
-        <w:shd w:fill="EEF3F8"/>
-      </w:pPr>
-      <w:r>
-        <w:t>python3.12 -m venv .venv</w:t>
-        <w:br/>
-        <w:t>source .venv/bin/activate</w:t>
-      </w:r>
-    </w:p>
-    <w:p>
-      <w:r>
-        <w:rPr>
-          <w:rFonts w:ascii="Calibri" w:hAnsi="Calibri"/>
-        </w:rPr>
-        <w:t>A successful activation normally shows (.venv) at the left of the terminal prompt.</w:t>
-      </w:r>
-    </w:p>
-    <w:p>
-      <w:pPr>
-        <w:pStyle w:val="Heading1"/>
-        <w:keepNext/>
-      </w:pPr>
-      <w:r>
-        <w:t>6. Select the VS Code interpreter</w:t>
-      </w:r>
-    </w:p>
-    <w:p>
-      <w:pPr>
-        <w:pStyle w:val="ListNumber"/>
-      </w:pPr>
-      <w:r>
-        <w:rPr>
-          <w:rFonts w:ascii="Calibri" w:hAnsi="Calibri"/>
-        </w:rPr>
-        <w:t>Press Ctrl+Shift+P.</w:t>
-      </w:r>
-    </w:p>
-    <w:p>
-      <w:pPr>
-        <w:pStyle w:val="ListNumber"/>
-      </w:pPr>
-      <w:r>
-        <w:rPr>
-          <w:rFonts w:ascii="Calibri" w:hAnsi="Calibri"/>
-        </w:rPr>
-        <w:t>Run 'Python: Select Interpreter'.</w:t>
-      </w:r>
-    </w:p>
-    <w:p>
-      <w:pPr>
-        <w:pStyle w:val="ListNumber"/>
-      </w:pPr>
-      <w:r>
-        <w:rPr>
-          <w:rFonts w:ascii="Calibri" w:hAnsi="Calibri"/>
-        </w:rPr>
-        <w:t>Choose the interpreter inside .venv.</w:t>
-      </w:r>
-    </w:p>
-    <w:p>
-      <w:pPr>
-        <w:pStyle w:val="ListNumber"/>
-      </w:pPr>
-      <w:r>
-        <w:rPr>
-          <w:rFonts w:ascii="Calibri" w:hAnsi="Calibri"/>
-        </w:rPr>
-        <w:t>Open a new terminal and confirm the path.</w:t>
-      </w:r>
-    </w:p>
-    <w:p>
-      <w:pPr>
-        <w:pStyle w:val="CodeBlock"/>
-        <w:keepLines/>
-        <w:shd w:fill="EEF3F8"/>
-      </w:pPr>
-      <w:r>
-        <w:rPr>
-          <w:rFonts w:ascii="Consolas" w:hAnsi="Consolas"/>
-          <w:color w:val="2A241F"/>
-          <w:sz w:val="17"/>
-        </w:rPr>
-        <w:t>python --version</w:t>
-        <w:br/>
-        <w:t>python -c "import sys; print(sys.executable)"</w:t>
-      </w:r>
-    </w:p>
-    <w:p>
-      <w:r>
-        <w:br w:type="page"/>
-      </w:r>
-    </w:p>
-    <w:p>
-      <w:pPr>
-        <w:pStyle w:val="Heading1"/>
-        <w:keepNext/>
-      </w:pPr>
-      <w:r>
-        <w:t>7. Upgrade pip and install dependencies</w:t>
-      </w:r>
-    </w:p>
-    <w:p>
-      <w:pPr>
-        <w:pStyle w:val="CodeBlock"/>
-        <w:keepLines/>
-        <w:shd w:fill="EEF3F8"/>
-      </w:pPr>
-      <w:r>
-        <w:rPr>
-          <w:rFonts w:ascii="Consolas" w:hAnsi="Consolas"/>
-          <w:color w:val="2A241F"/>
-          <w:sz w:val="17"/>
-        </w:rPr>
-        <w:t>python -m pip install --upgrade pip</w:t>
-        <w:br/>
-        <w:t>pip install -r requirements-lite.txt</w:t>
-      </w:r>
-    </w:p>
-    <w:p>
-      <w:r>
-        <w:rPr>
-          <w:rFonts w:ascii="Calibri" w:hAnsi="Calibri"/>
-        </w:rPr>
-        <w:t>The lightweight file installs Streamlit, pandas, NumPy, scikit-learn, Joblib, Plotly, Matplotlib, Seaborn, URL/PDF libraries, ReportLab and pytest. It excludes PyTorch and Transformers.</w:t>
-      </w:r>
-    </w:p>
-    <w:p>
-      <w:pPr>
-        <w:pStyle w:val="Heading1"/>
-        <w:keepNext/>
-      </w:pPr>
-      <w:r>
-        <w:t>8. Optional abstractive dependencies</w:t>
-      </w:r>
-    </w:p>
-    <w:p>
-      <w:pPr>
-        <w:pStyle w:val="CodeBlock"/>
-        <w:keepLines/>
-        <w:shd w:fill="EEF3F8"/>
-      </w:pPr>
-      <w:r>
-        <w:rPr>
-          <w:rFonts w:ascii="Consolas" w:hAnsi="Consolas"/>
-          <w:color w:val="2A241F"/>
-          <w:sz w:val="17"/>
-        </w:rPr>
-        <w:t>pip install -r requirements.txt</w:t>
-      </w:r>
-    </w:p>
-    <w:p>
-      <w:pPr>
-        <w:spacing w:before="80" w:after="140" w:line="259" w:lineRule="auto"/>
-        <w:ind w:left="173" w:right="173"/>
-        <w:shd w:fill="EDE6DD"/>
-        <w:pBdr>
-          <w:left w:val="single" w:sz="20" w:space="8" w:color="806A5A"/>
-          <w:top w:val="single" w:sz="4" w:space="5" w:color="D6CEC2"/>
-          <w:bottom w:val="single" w:sz="4" w:space="5" w:color="D6CEC2"/>
-          <w:right w:val="single" w:sz="4" w:space="5" w:color="D6CEC2"/>
-        </w:pBdr>
-      </w:pPr>
-      <w:r>
-        <w:rPr>
-          <w:rFonts w:ascii="Calibri" w:hAnsi="Calibri"/>
-          <w:b/>
-          <w:color w:val="806A5A"/>
-          <w:sz w:val="19"/>
-        </w:rPr>
-        <w:t xml:space="preserve">First-use download: </w:t>
-      </w:r>
-      <w:r>
-        <w:rPr>
-          <w:rFonts w:ascii="Calibri" w:hAnsi="Calibri"/>
-          <w:color w:val="1A1917"/>
-          <w:sz w:val="19"/>
-        </w:rPr>
-        <w:t>Selecting Abstractive - DistilBART downloads sshleifer/distilbart-cnn-6-6. Keep Extractive selected if the download, disk, RAM or CPU time is unsuitable.</w:t>
-      </w:r>
-    </w:p>
-    <w:p>
-      <w:pPr>
-        <w:pStyle w:val="Heading1"/>
-        <w:keepNext/>
-      </w:pPr>
-      <w:r>
-        <w:t>9. Start Streamlit</w:t>
-      </w:r>
-    </w:p>
-    <w:p>
-      <w:pPr>
-        <w:pStyle w:val="CodeBlock"/>
-        <w:keepLines/>
-        <w:shd w:fill="EEF3F8"/>
-      </w:pPr>
-      <w:r>
-        <w:rPr>
-          <w:rFonts w:ascii="Consolas" w:hAnsi="Consolas"/>
-          <w:color w:val="2A241F"/>
-          <w:sz w:val="17"/>
-        </w:rPr>
-        <w:t>streamlit run app.py</w:t>
-      </w:r>
-    </w:p>
-    <w:p>
-      <w:r>
-        <w:rPr>
-          <w:rFonts w:ascii="Calibri" w:hAnsi="Calibri"/>
-        </w:rPr>
-        <w:t>If the `streamlit` command is not recognised, run the module form below. Both commands start the same application.</w:t>
-      </w:r>
-    </w:p>
-    <w:p>
-      <w:pPr>
-        <w:pStyle w:val="CodeBlock"/>
-        <w:keepLines/>
-        <w:shd w:fill="EEF3F8"/>
-      </w:pPr>
-      <w:r>
-        <w:rPr>
-          <w:rFonts w:ascii="Consolas" w:hAnsi="Consolas"/>
-          <w:color w:val="2A241F"/>
-          <w:sz w:val="17"/>
-        </w:rPr>
-        <w:t>python -m streamlit run app.py</w:t>
-      </w:r>
-    </w:p>
-    <w:p>
-      <w:r>
-        <w:rPr>
-          <w:rFonts w:ascii="Calibri" w:hAnsi="Calibri"/>
-        </w:rPr>
-        <w:t>Open http://localhost:8501 if the browser does not open automatically. Keep the terminal running while using the application.</w:t>
-      </w:r>
-    </w:p>
-    <w:p>
-      <w:pPr>
-        <w:keepNext/>
-        <w:pageBreakBefore/>
-        <w:spacing w:after="40"/>
-        <w:jc w:val="center"/>
-      </w:pPr>
-      <w:r>
-        <w:drawing>
-          <wp:inline xmlns:a="http://schemas.openxmlformats.org/drawingml/2006/main" xmlns:pic="http://schemas.openxmlformats.org/drawingml/2006/picture">
-            <wp:extent cx="5669280" cy="3543300"/>
-            <wp:docPr id="33" name="Picture 33" descr="Figure S.1. News Desk." title="Figure S.1. News Desk."/>
-            <wp:cNvGraphicFramePr>
-              <a:graphicFrameLocks noChangeAspect="1"/>
-            </wp:cNvGraphicFramePr>
-            <a:graphic>
-              <a:graphicData uri="http://schemas.openxmlformats.org/drawingml/2006/picture">
-                <pic:pic>
-                  <pic:nvPicPr>
-                    <pic:cNvPr id="0" name="01_home.png"/>
-                    <pic:cNvPicPr/>
-                  </pic:nvPicPr>
-                  <pic:blipFill>
-                    <a:blip r:embed="rId14"/>
-                    <a:stretch>
-                      <a:fillRect/>
-                    </a:stretch>
-                  </pic:blipFill>
-                  <pic:spPr>
-                    <a:xfrm>
-                      <a:off x="0" y="0"/>
-                      <a:ext cx="5669280" cy="3543300"/>
-                    </a:xfrm>
-                    <a:prstGeom prst="rect"/>
-                  </pic:spPr>
-                </pic:pic>
-              </a:graphicData>
-            </a:graphic>
-          </wp:inline>
-        </w:drawing>
-      </w:r>
-    </w:p>
-    <w:p>
-      <w:pPr>
-        <w:pStyle w:val="Caption"/>
-        <w:keepNext w:val="0"/>
-      </w:pPr>
-      <w:r>
-        <w:rPr>
-          <w:rFonts w:ascii="Calibri" w:hAnsi="Calibri"/>
-          <w:i/>
-          <w:color w:val="6F685F"/>
-          <w:sz w:val="18"/>
-        </w:rPr>
-        <w:t>Figure S.1. News Desk.</w:t>
-      </w:r>
-    </w:p>
-    <w:p>
-      <w:r>
-        <w:rPr>
-          <w:rFonts w:ascii="Calibri" w:hAnsi="Calibri"/>
-        </w:rPr>
-        <w:t>The landing view presents the masthead, exact project boundary, primary/archive actions, original local artwork and technical information strip.</w:t>
-      </w:r>
-    </w:p>
-    <w:p>
-      <w:pPr>
-        <w:pStyle w:val="Heading1"/>
-        <w:keepNext/>
-      </w:pPr>
-      <w:r>
-        <w:t>10. Analyse the first sample article</w:t>
-      </w:r>
-    </w:p>
-    <w:p>
-      <w:pPr>
-        <w:pStyle w:val="ListNumber"/>
-      </w:pPr>
-      <w:r>
-        <w:rPr>
-          <w:rFonts w:ascii="Calibri" w:hAnsi="Calibri"/>
-        </w:rPr>
-        <w:t>Select Analyse Article in the top navigation.</w:t>
-      </w:r>
-    </w:p>
-    <w:p>
-      <w:pPr>
-        <w:pStyle w:val="ListNumber"/>
-      </w:pPr>
-      <w:r>
-        <w:rPr>
-          <w:rFonts w:ascii="Calibri" w:hAnsi="Calibri"/>
-        </w:rPr>
-        <w:t>Keep Paste text selected.</w:t>
-      </w:r>
-    </w:p>
-    <w:p>
-      <w:pPr>
-        <w:pStyle w:val="ListNumber"/>
-      </w:pPr>
-      <w:r>
-        <w:rPr>
-          <w:rFonts w:ascii="Calibri" w:hAnsi="Calibri"/>
-        </w:rPr>
-        <w:t>Select Load packaged sample or paste one of the files from data/sample.</w:t>
-      </w:r>
-    </w:p>
-    <w:p>
-      <w:pPr>
-        <w:pStyle w:val="ListNumber"/>
-      </w:pPr>
-      <w:r>
-        <w:rPr>
-          <w:rFonts w:ascii="Calibri" w:hAnsi="Calibri"/>
-        </w:rPr>
-        <w:t>Choose Extractive - TF-IDF centroid and Short.</w:t>
-      </w:r>
-    </w:p>
-    <w:p>
-      <w:pPr>
-        <w:pStyle w:val="ListNumber"/>
-      </w:pPr>
-      <w:r>
-        <w:rPr>
-          <w:rFonts w:ascii="Calibri" w:hAnsi="Calibri"/>
-        </w:rPr>
-        <w:t>Select Analyse Article.</w:t>
-      </w:r>
-    </w:p>
-    <w:p>
-      <w:pPr>
-        <w:pStyle w:val="ListNumber"/>
-      </w:pPr>
-      <w:r>
-        <w:rPr>
-          <w:rFonts w:ascii="Calibri" w:hAnsi="Calibri"/>
-        </w:rPr>
-        <w:t>Read the summary and credibility verdict together.</w:t>
-      </w:r>
-    </w:p>
-    <w:p>
-      <w:pPr>
-        <w:pStyle w:val="ListNumber"/>
-      </w:pPr>
-      <w:r>
-        <w:rPr>
-          <w:rFonts w:ascii="Calibri" w:hAnsi="Calibri"/>
-        </w:rPr>
-        <w:t>Inspect local terms and the disclaimer.</w:t>
-      </w:r>
-    </w:p>
-    <w:p>
-      <w:pPr>
-        <w:pStyle w:val="ListNumber"/>
-      </w:pPr>
-      <w:r>
-        <w:rPr>
-          <w:rFonts w:ascii="Calibri" w:hAnsi="Calibri"/>
-        </w:rPr>
-        <w:t>Download JSON or PDF, then open Editorial Archive.</w:t>
-      </w:r>
-    </w:p>
-    <w:p>
-      <w:pPr>
-        <w:keepNext/>
-        <w:pageBreakBefore/>
-        <w:spacing w:after="40"/>
-        <w:jc w:val="center"/>
-      </w:pPr>
-      <w:r>
-        <w:drawing>
-          <wp:inline xmlns:a="http://schemas.openxmlformats.org/drawingml/2006/main" xmlns:pic="http://schemas.openxmlformats.org/drawingml/2006/picture">
-            <wp:extent cx="5669280" cy="3937000"/>
-            <wp:docPr id="34" name="Picture 34" descr="Figure S.2. Populated article input." title="Figure S.2. Populated article input."/>
-            <wp:cNvGraphicFramePr>
-              <a:graphicFrameLocks noChangeAspect="1"/>
-            </wp:cNvGraphicFramePr>
-            <a:graphic>
-              <a:graphicData uri="http://schemas.openxmlformats.org/drawingml/2006/picture">
-                <pic:pic>
-                  <pic:nvPicPr>
-                    <pic:cNvPr id="0" name="image.png"/>
-                    <pic:cNvPicPr/>
-                  </pic:nvPicPr>
-                  <pic:blipFill>
-                    <a:blip r:embed="rId11"/>
-                    <a:stretch>
-                      <a:fillRect/>
-                    </a:stretch>
-                  </pic:blipFill>
-                  <pic:spPr>
-                    <a:xfrm>
-                      <a:off x="0" y="0"/>
-                      <a:ext cx="5669280" cy="3937000"/>
-                    </a:xfrm>
-                    <a:prstGeom prst="rect"/>
-                  </pic:spPr>
-                </pic:pic>
-              </a:graphicData>
-            </a:graphic>
-          </wp:inline>
-        </w:drawing>
-      </w:r>
-    </w:p>
-    <w:p>
-      <w:pPr>
-        <w:pStyle w:val="Caption"/>
-        <w:keepNext w:val="0"/>
-      </w:pPr>
-      <w:r>
-        <w:rPr>
-          <w:rFonts w:ascii="Calibri" w:hAnsi="Calibri"/>
-          <w:i/>
-          <w:color w:val="6F685F"/>
-          <w:sz w:val="18"/>
-        </w:rPr>
-        <w:t>Figure S.2. Populated article input.</w:t>
-      </w:r>
-    </w:p>
-    <w:p>
-      <w:r>
-        <w:rPr>
-          <w:rFonts w:ascii="Calibri" w:hAnsi="Calibri"/>
-        </w:rPr>
-        <w:t>Input method, article fields and summary controls share one responsive editorial workspace.</w:t>
-      </w:r>
-    </w:p>
-    <w:p>
-      <w:pPr>
-        <w:keepNext/>
-        <w:pageBreakBefore/>
-        <w:spacing w:after="40"/>
-        <w:jc w:val="center"/>
-      </w:pPr>
-      <w:r>
-        <w:drawing>
-          <wp:inline xmlns:a="http://schemas.openxmlformats.org/drawingml/2006/main" xmlns:pic="http://schemas.openxmlformats.org/drawingml/2006/picture">
-            <wp:extent cx="5669280" cy="3661410"/>
-            <wp:docPr id="35" name="Picture 35" descr="Figure S.3. Analysis result." title="Figure S.3. Analysis result."/>
-            <wp:cNvGraphicFramePr>
-              <a:graphicFrameLocks noChangeAspect="1"/>
-            </wp:cNvGraphicFramePr>
-            <a:graphic>
-              <a:graphicData uri="http://schemas.openxmlformats.org/drawingml/2006/picture">
-                <pic:pic>
-                  <pic:nvPicPr>
-                    <pic:cNvPr id="0" name="03_summary_and_risk_results.png"/>
-                    <pic:cNvPicPr/>
-                  </pic:nvPicPr>
-                  <pic:blipFill>
-                    <a:blip r:embed="rId19"/>
-                    <a:stretch>
-                      <a:fillRect/>
-                    </a:stretch>
-                  </pic:blipFill>
-                  <pic:spPr>
-                    <a:xfrm>
-                      <a:off x="0" y="0"/>
-                      <a:ext cx="5669280" cy="3661410"/>
-                    </a:xfrm>
-                    <a:prstGeom prst="rect"/>
-                  </pic:spPr>
-                </pic:pic>
-              </a:graphicData>
-            </a:graphic>
-          </wp:inline>
-        </w:drawing>
-      </w:r>
-    </w:p>
-    <w:p>
-      <w:pPr>
-        <w:pStyle w:val="Caption"/>
-        <w:keepNext w:val="0"/>
-      </w:pPr>
-      <w:r>
-        <w:rPr>
-          <w:rFonts w:ascii="Calibri" w:hAnsi="Calibri"/>
-          <w:i/>
-          <w:color w:val="6F685F"/>
-          <w:sz w:val="18"/>
-        </w:rPr>
-        <w:t>Figure S.3. Analysis result.</w:t>
-      </w:r>
-    </w:p>
-    <w:p>
-      <w:r>
-        <w:rPr>
-          <w:rFonts w:ascii="Calibri" w:hAnsi="Calibri"/>
-        </w:rPr>
-        <w:t>Word counts, compression, executive summary, textual verdict, probability/confidence and responsible interpretation are presented as one editorial report.</w:t>
-      </w:r>
-    </w:p>
-    <w:p>
-      <w:pPr>
-        <w:keepNext/>
-        <w:pageBreakBefore/>
-        <w:spacing w:after="40"/>
-        <w:jc w:val="center"/>
-      </w:pPr>
-      <w:r>
-        <w:drawing>
-          <wp:inline xmlns:a="http://schemas.openxmlformats.org/drawingml/2006/main" xmlns:pic="http://schemas.openxmlformats.org/drawingml/2006/picture">
-            <wp:extent cx="5669280" cy="3700780"/>
-            <wp:docPr id="36" name="Picture 36" descr="Figure S.4. Explanation and exports." title="Figure S.4. Explanation and exports."/>
-            <wp:cNvGraphicFramePr>
-              <a:graphicFrameLocks noChangeAspect="1"/>
-            </wp:cNvGraphicFramePr>
-            <a:graphic>
-              <a:graphicData uri="http://schemas.openxmlformats.org/drawingml/2006/picture">
-                <pic:pic>
-                  <pic:nvPicPr>
-                    <pic:cNvPr id="0" name="04_explainability_and_downloads.png"/>
-                    <pic:cNvPicPr/>
-                  </pic:nvPicPr>
-                  <pic:blipFill>
-                    <a:blip r:embed="rId12"/>
-                    <a:stretch>
-                      <a:fillRect/>
-                    </a:stretch>
-                  </pic:blipFill>
-                  <pic:spPr>
-                    <a:xfrm>
-                      <a:off x="0" y="0"/>
-                      <a:ext cx="5669280" cy="3700780"/>
-                    </a:xfrm>
-                    <a:prstGeom prst="rect"/>
-                  </pic:spPr>
-                </pic:pic>
-              </a:graphicData>
-            </a:graphic>
-          </wp:inline>
-        </w:drawing>
-      </w:r>
-    </w:p>
-    <w:p>
-      <w:pPr>
-        <w:pStyle w:val="Caption"/>
-        <w:keepNext w:val="0"/>
-      </w:pPr>
-      <w:r>
-        <w:rPr>
-          <w:rFonts w:ascii="Calibri" w:hAnsi="Calibri"/>
-          <w:i/>
-          <w:color w:val="6F685F"/>
-          <w:sz w:val="18"/>
-        </w:rPr>
-        <w:t>Figure S.4. Explanation and exports.</w:t>
-      </w:r>
-    </w:p>
-    <w:p>
-      <w:r>
-        <w:rPr>
-          <w:rFonts w:ascii="Calibri" w:hAnsi="Calibri"/>
-        </w:rPr>
-        <w:t>Muted green and oxblood bars oppose/support the misleading class; they are model correlations, not factual evidence.</w:t>
-      </w:r>
-    </w:p>
-    <w:p>
-      <w:r>
-        <w:br w:type="page"/>
-      </w:r>
-    </w:p>
-    <w:p>
-      <w:pPr>
-        <w:pStyle w:val="Heading1"/>
-        <w:keepNext/>
-      </w:pPr>
-      <w:r>
-        <w:t>11. Stop, restart and change the port</w:t>
-      </w:r>
-    </w:p>
-    <w:p>
-      <w:r>
-        <w:rPr>
-          <w:rFonts w:ascii="Calibri" w:hAnsi="Calibri"/>
-        </w:rPr>
-        <w:t>Press Ctrl+C in the Streamlit terminal to stop the server. Restart with the same run command after reactivating .venv. If port 8501 is busy, choose another port.</w:t>
-      </w:r>
-    </w:p>
-    <w:p>
-      <w:pPr>
-        <w:pStyle w:val="CodeBlock"/>
-        <w:keepLines/>
-        <w:shd w:fill="EEF3F8"/>
-      </w:pPr>
-      <w:r>
-        <w:rPr>
-          <w:rFonts w:ascii="Consolas" w:hAnsi="Consolas"/>
-          <w:color w:val="2A241F"/>
-          <w:sz w:val="17"/>
-        </w:rPr>
-        <w:t>python -m streamlit run app.py --server.port 8502</w:t>
-      </w:r>
-    </w:p>
-    <w:p>
-      <w:pPr>
-        <w:pStyle w:val="Heading1"/>
-        <w:keepNext/>
-      </w:pPr>
-      <w:r>
-        <w:t>12. Dataset download and placement</w:t>
-      </w:r>
-    </w:p>
-    <w:p>
-      <w:r>
-        <w:t>The private/local application runs with the packaged Joblib and its hash-matched private confidence_calibration.json. Runtime never retrains. Raw datasets are needed only for authorised offline reproduction and must remain Git-ignored/private.</w:t>
-      </w:r>
-    </w:p>
-    <w:p>
-      <w:pPr>
-        <w:pStyle w:val="CodeBlock"/>
-        <w:keepLines/>
-        <w:shd w:fill="EEF3F8"/>
-      </w:pPr>
-      <w:r>
-        <w:rPr>
-          <w:rFonts w:ascii="Consolas" w:hAnsi="Consolas"/>
-          <w:color w:val="2A241F"/>
-          <w:sz w:val="17"/>
-        </w:rPr>
-        <w:t>python training/download_data.py --dataset all</w:t>
-      </w:r>
-    </w:p>
-    <w:p>
-      <w:r>
-        <w:rPr>
-          <w:rFonts w:ascii="Calibri" w:hAnsi="Calibri"/>
-        </w:rPr>
-        <w:t>The script places True.csv, Fake.csv and xsum-test.parquet in data/raw. Manual users may place files there with the exact names. Dataset sources and redistribution cautions are documented in docs/DATASET_CARD.md.</w:t>
-      </w:r>
-    </w:p>
-    <w:p>
-      <w:pPr>
-        <w:pStyle w:val="Heading1"/>
-        <w:keepNext/>
-      </w:pPr>
-      <w:r>
-        <w:t>13. Optional offline training and controlled benchmark reproduction</w:t>
-      </w:r>
-    </w:p>
-    <w:p>
-      <w:pPr>
-        <w:pStyle w:val="CodeBlock"/>
-        <w:keepLines/>
-        <w:shd w:fill="EEF3F8"/>
-      </w:pPr>
-      <w:r>
-        <w:t># Offline development only; never called by Streamlit</w:t>
-        <w:br/>
-        <w:t>python training/train_fake_news_models.py</w:t>
-        <w:br/>
-        <w:t># Controlled evidence run; CSVs stay outside the public repository</w:t>
-        <w:br/>
-        <w:t>python training/benchmark_models.py --raw-dir /absolute/private/isot-directory</w:t>
-      </w:r>
-    </w:p>
-    <w:p>
-      <w:r>
-        <w:t>The original training command remains an offline research tool. The controlled benchmark first verifies the accepted production-model SHA-256 and 4,800-row reproduction evidence, then screens near-duplicates, preserves 19,200 training rows, uses 1,199 calibration and 1,200 policy rows, and reports once on a 2,399-row final test. It does not overwrite or retrain the packaged production model.</w:t>
-      </w:r>
-    </w:p>
-    <w:p>
-      <w:pPr>
-        <w:pStyle w:val="Heading1"/>
-        <w:keepNext/>
-      </w:pPr>
-      <w:r>
-        <w:t>14. Evaluate summarization</w:t>
-      </w:r>
-    </w:p>
-    <w:p>
-      <w:pPr>
-        <w:pStyle w:val="CodeBlock"/>
-        <w:keepLines/>
-        <w:shd w:fill="EEF3F8"/>
-      </w:pPr>
-      <w:r>
-        <w:rPr>
-          <w:rFonts w:ascii="Consolas" w:hAnsi="Consolas"/>
-          <w:color w:val="2A241F"/>
-          <w:sz w:val="17"/>
-        </w:rPr>
-        <w:t>python training/evaluate_summarizer.py --sample-size 150 --seed 42</w:t>
-      </w:r>
-    </w:p>
-    <w:p>
-      <w:r>
-        <w:rPr>
-          <w:rFonts w:ascii="Calibri" w:hAnsi="Calibri"/>
-        </w:rPr>
-        <w:t>This regenerates ROUGE-1/2/L, compression and latency on a fixed XSum test sample. Do not compare a different sample size without stating the change.</w:t>
-      </w:r>
-    </w:p>
-    <w:p>
-      <w:pPr>
-        <w:pStyle w:val="Heading1"/>
-        <w:keepNext/>
-      </w:pPr>
-      <w:r>
-        <w:t>15. Optional offline retraining with newly licensed data</w:t>
-      </w:r>
-    </w:p>
-    <w:p>
-      <w:pPr>
-        <w:pStyle w:val="ListNumber"/>
-      </w:pPr>
-      <w:r>
-        <w:rPr>
-          <w:rFonts w:ascii="Calibri" w:hAnsi="Calibri"/>
-        </w:rPr>
-        <w:t>Back up models/fake_news_pipeline.joblib and model_metadata.json.</w:t>
-      </w:r>
-    </w:p>
-    <w:p>
-      <w:pPr>
-        <w:pStyle w:val="ListNumber"/>
-      </w:pPr>
-      <w:r>
-        <w:rPr>
-          <w:rFonts w:ascii="Calibri" w:hAnsi="Calibri"/>
-        </w:rPr>
-        <w:t>Map new trustworthy labels to 0 reliable and 1 misleading.</w:t>
-      </w:r>
-    </w:p>
-    <w:p>
-      <w:pPr>
-        <w:pStyle w:val="ListNumber"/>
-      </w:pPr>
-      <w:r>
-        <w:rPr>
-          <w:rFonts w:ascii="Calibri" w:hAnsi="Calibri"/>
-        </w:rPr>
-        <w:t>Audit licence, duplicates, sources, topics, dates and annotation rules.</w:t>
-      </w:r>
-    </w:p>
-    <w:p>
-      <w:pPr>
-        <w:pStyle w:val="ListNumber"/>
-      </w:pPr>
-      <w:r>
-        <w:rPr>
-          <w:rFonts w:ascii="Calibri" w:hAnsi="Calibri"/>
-        </w:rPr>
-        <w:t>Modify preparation only if the new schema is documented.</w:t>
-      </w:r>
-    </w:p>
-    <w:p>
-      <w:pPr>
-        <w:pStyle w:val="ListNumber"/>
-      </w:pPr>
-      <w:r>
-        <w:rPr>
-          <w:rFonts w:ascii="Calibri" w:hAnsi="Calibri"/>
-        </w:rPr>
-        <w:t>Use group/time-aware validation where metadata permits.</w:t>
-      </w:r>
-    </w:p>
-    <w:p>
-      <w:pPr>
-        <w:pStyle w:val="ListNumber"/>
-      </w:pPr>
-      <w:r>
-        <w:rPr>
-          <w:rFonts w:ascii="Calibri" w:hAnsi="Calibri"/>
-        </w:rPr>
-        <w:t>Run tests and inspect new error analysis before replacing the packaged model.</w:t>
-      </w:r>
-    </w:p>
-    <w:p>
-      <w:r>
-        <w:br w:type="page"/>
-      </w:r>
-    </w:p>
-    <w:p>
-      <w:pPr>
-        <w:pStyle w:val="Heading1"/>
-        <w:keepNext/>
-      </w:pPr>
-      <w:r>
-        <w:t>16. Run automated tests</w:t>
-      </w:r>
-    </w:p>
-    <w:p>
-      <w:pPr>
-        <w:pStyle w:val="CodeBlock"/>
-        <w:keepLines/>
-        <w:shd w:fill="EEF3F8"/>
-      </w:pPr>
-      <w:r>
-        <w:rPr>
-          <w:rFonts w:ascii="Consolas" w:hAnsi="Consolas"/>
-          <w:color w:val="2A241F"/>
-          <w:sz w:val="17"/>
-        </w:rPr>
-        <w:t>python -m pytest -q -m "not private_model"</w:t>
-      </w:r>
-    </w:p>
-    <w:p>
-      <w:pPr>
-        <w:spacing w:before="80" w:after="140" w:line="259" w:lineRule="auto"/>
-        <w:ind w:left="173" w:right="173"/>
-        <w:shd w:fill="E8EEE8"/>
-        <w:pBdr>
-          <w:left w:val="single" w:sz="20" w:space="8" w:color="496454"/>
-          <w:top w:val="single" w:sz="4" w:space="5" w:color="D6CEC2"/>
-          <w:bottom w:val="single" w:sz="4" w:space="5" w:color="D6CEC2"/>
-          <w:right w:val="single" w:sz="4" w:space="5" w:color="D6CEC2"/>
-        </w:pBdr>
-      </w:pPr>
-      <w:r>
-        <w:t>Current public validation passes 144 tests with exactly four private-model tests deselected. The production presentation build, CI, pull-request dependency review and both CodeQL language analyses pass; CodeQL now uses Action v4. These checks do not establish zero open historical security alerts. The original 56-check private release and its five-width browser audit remain historical evidence. Public CI cannot reproduce private-runtime browser checks without the excluded artifacts.</w:t>
-      </w:r>
-    </w:p>
-    <w:p>
-      <w:pPr>
-        <w:pStyle w:val="Heading1"/>
-        <w:keepNext/>
-      </w:pPr>
-      <w:r>
-        <w:t>17. Target public deployment (currently blocked)</w:t>
-      </w:r>
-    </w:p>
-    <w:p>
-      <w:r>
-        <w:t>https://github.com/DevenGaikwad/NewsLens-AI is the canonical active public repository. The future Streamlit Community Cloud configuration is branch main, entrypoint app.py and root requirements.txt; Vercel uses web/ and exposes only NEXT_PUBLIC_STREAMLIT_APP_URL. The session history default is temporary visitor-isolated SQLite. No live deployment is claimed, and functional hosting must not proceed until a legally redistributable public model and complete rights chain are verified.</w:t>
-      </w:r>
-    </w:p>
-    <w:p>
-      <w:pPr>
-        <w:pStyle w:val="CodeBlock"/>
-        <w:keepLines/>
-        <w:shd w:fill="EEF3F8"/>
-      </w:pPr>
-      <w:r>
-        <w:rPr>
-          <w:rFonts w:ascii="Consolas" w:hAnsi="Consolas"/>
-          <w:color w:val="2A241F"/>
-          <w:sz w:val="17"/>
-        </w:rPr>
-        <w:t># Local verification before either deployment</w:t>
-        <w:br/>
-        <w:t>python -m pytest -q -m "not private_model"</w:t>
-        <w:br/>
-        <w:t>python -m streamlit run app.py</w:t>
-        <w:br/>
-        <w:br/>
-        <w:t># Vercel presentation shell</w:t>
-        <w:br/>
-        <w:t>cd web</w:t>
-        <w:br/>
-        <w:t>npm install</w:t>
-        <w:br/>
-        <w:t>npm run build</w:t>
-      </w:r>
-    </w:p>
-    <w:p>
-      <w:pPr>
-        <w:spacing w:before="80" w:after="140" w:line="259" w:lineRule="auto"/>
-        <w:ind w:left="173" w:right="173"/>
-        <w:shd w:fill="F3EBDD"/>
-        <w:pBdr>
-          <w:left w:val="single" w:sz="20" w:space="8" w:color="8A693D"/>
-          <w:top w:val="single" w:sz="4" w:space="5" w:color="D6CEC2"/>
-          <w:bottom w:val="single" w:sz="4" w:space="5" w:color="D6CEC2"/>
-          <w:right w:val="single" w:sz="4" w:space="5" w:color="D6CEC2"/>
-        </w:pBdr>
-      </w:pPr>
-      <w:r>
-        <w:t>Public-artifact and deployment gate: do not publish secrets, visitor data, generated databases, raw datasets, the private Joblib or confidence_calibration.json. The public repository excludes those artifacts and cannot currently run classification; do not retrain, mock or replace the model to bypass this gate. The sanitized source is published; final security sign-off still requires fresh restricted evidence, and functional hosting must remain blocked until a legally redistributable public model and complete rights chain are verified.</w:t>
-      </w:r>
-    </w:p>
-    <w:p>
-      <w:pPr>
-        <w:pStyle w:val="Heading1"/>
-        <w:keepNext/>
-      </w:pPr>
-      <w:r>
-        <w:t>18. Troubleshooting</w:t>
-      </w:r>
-    </w:p>
-    <w:p>
-      <w:pPr>
-        <w:pStyle w:val="Heading2"/>
-        <w:keepNext/>
-      </w:pPr>
-      <w:r>
-        <w:t>'streamlit' is not recognized</w:t>
-      </w:r>
-    </w:p>
-    <w:p>
-      <w:r>
-        <w:rPr>
-          <w:rFonts w:ascii="Calibri" w:hAnsi="Calibri"/>
-        </w:rPr>
-        <w:t>Activate .venv, then use `python -m streamlit run app.py`.</w:t>
-      </w:r>
-    </w:p>
-    <w:p>
-      <w:pPr>
-        <w:pStyle w:val="Heading2"/>
-        <w:keepNext/>
-      </w:pPr>
-      <w:r>
-        <w:t>ModuleNotFoundError</w:t>
-      </w:r>
-    </w:p>
-    <w:p>
-      <w:r>
-        <w:rPr>
-          <w:rFonts w:ascii="Calibri" w:hAnsi="Calibri"/>
-        </w:rPr>
-        <w:t>Confirm the selected interpreter is .venv and rerun pip install -r requirements-lite.txt.</w:t>
-      </w:r>
-    </w:p>
-    <w:p>
-      <w:pPr>
-        <w:pStyle w:val="Heading2"/>
-        <w:keepNext/>
-      </w:pPr>
-      <w:r>
-        <w:t>Wrong Python interpreter</w:t>
-      </w:r>
-    </w:p>
-    <w:p>
-      <w:r>
-        <w:rPr>
-          <w:rFonts w:ascii="Calibri" w:hAnsi="Calibri"/>
-        </w:rPr>
-        <w:t>Ctrl+Shift+P &gt; Python: Select Interpreter &gt; choose .venv.</w:t>
-      </w:r>
-    </w:p>
-    <w:p>
-      <w:pPr>
-        <w:pStyle w:val="Heading2"/>
-        <w:keepNext/>
-      </w:pPr>
-      <w:r>
-        <w:t>PowerShell execution policy</w:t>
-      </w:r>
-    </w:p>
-    <w:p>
-      <w:r>
-        <w:rPr>
-          <w:rFonts w:ascii="Calibri" w:hAnsi="Calibri"/>
-        </w:rPr>
-        <w:t>Use Command Prompt activation, or run `Set-ExecutionPolicy -Scope Process Bypass` only for the current window if institutional policy permits.</w:t>
-      </w:r>
-    </w:p>
-    <w:p>
-      <w:pPr>
-        <w:pStyle w:val="Heading2"/>
-        <w:keepNext/>
-      </w:pPr>
-      <w:r>
-        <w:t>Torch installation problem</w:t>
-      </w:r>
-    </w:p>
-    <w:p>
-      <w:r>
-        <w:rPr>
-          <w:rFonts w:ascii="Calibri" w:hAnsi="Calibri"/>
-        </w:rPr>
-        <w:t>Use requirements-lite.txt. Install the optional full file later; consult the official PyTorch selector for your CPU/OS.</w:t>
-      </w:r>
-    </w:p>
-    <w:p>
-      <w:pPr>
-        <w:pStyle w:val="Heading2"/>
-        <w:keepNext/>
-      </w:pPr>
-      <w:r>
-        <w:t>Transformer download problem</w:t>
-      </w:r>
-    </w:p>
-    <w:p>
-      <w:r>
-        <w:rPr>
-          <w:rFonts w:ascii="Calibri" w:hAnsi="Calibri"/>
-        </w:rPr>
-        <w:t>Check internet/disk, retry later, set HF_HOME to a writable folder, or use extractive mode.</w:t>
-      </w:r>
-    </w:p>
-    <w:p>
-      <w:pPr>
-        <w:pStyle w:val="Heading2"/>
-        <w:keepNext/>
-      </w:pPr>
-      <w:r>
-        <w:t>NLTK resource error</w:t>
-      </w:r>
-    </w:p>
-    <w:p>
-      <w:r>
-        <w:rPr>
-          <w:rFonts w:ascii="Calibri" w:hAnsi="Calibri"/>
-        </w:rPr>
-        <w:t>This project does not require downloaded NLTK tokenizers; ensure you are running the packaged code, not a tutorial copy.</w:t>
-      </w:r>
-    </w:p>
-    <w:p>
-      <w:pPr>
-        <w:pStyle w:val="Heading2"/>
-        <w:keepNext/>
-      </w:pPr>
-      <w:r>
-        <w:t>Missing dataset</w:t>
-      </w:r>
-    </w:p>
-    <w:p>
-      <w:r>
-        <w:rPr>
-          <w:rFonts w:ascii="Calibri" w:hAnsi="Calibri"/>
-        </w:rPr>
-        <w:t>Run training/download_data.py or place exact filenames under data/raw.</w:t>
-      </w:r>
-    </w:p>
-    <w:p>
-      <w:pPr>
-        <w:pStyle w:val="Heading2"/>
-        <w:keepNext/>
-      </w:pPr>
-      <w:r>
-        <w:t>Joblib model not found</w:t>
-      </w:r>
-    </w:p>
-    <w:p>
-      <w:r>
-        <w:rPr>
-          <w:rFonts w:ascii="Calibri" w:hAnsi="Calibri"/>
-        </w:rPr>
-        <w:t>Use only the owner-approved local model and its matching calibration. The public copy intentionally excludes both; do not retrain to bypass the deployment gate.</w:t>
-      </w:r>
-    </w:p>
-    <w:p>
-      <w:pPr>
-        <w:pStyle w:val="Heading2"/>
-        <w:keepNext/>
-      </w:pPr>
-      <w:r>
-        <w:t>Port already in use</w:t>
-      </w:r>
-    </w:p>
-    <w:p>
-      <w:r>
-        <w:rPr>
-          <w:rFonts w:ascii="Calibri" w:hAnsi="Calibri"/>
-        </w:rPr>
-        <w:t>Use --server.port 8502 or stop the old terminal with Ctrl+C.</w:t>
-      </w:r>
-    </w:p>
-    <w:p>
-      <w:pPr>
-        <w:pStyle w:val="Heading2"/>
-        <w:keepNext/>
-      </w:pPr>
-      <w:r>
-        <w:t>URL extraction failure</w:t>
-      </w:r>
-    </w:p>
-    <w:p>
-      <w:r>
-        <w:rPr>
-          <w:rFonts w:ascii="Calibri" w:hAnsi="Calibri"/>
-        </w:rPr>
-        <w:t>The site may be paywalled or blocking bots. Paste the article text directly.</w:t>
-      </w:r>
-    </w:p>
-    <w:p>
-      <w:pPr>
-        <w:pStyle w:val="Heading2"/>
-        <w:keepNext/>
-      </w:pPr>
-      <w:r>
-        <w:t>Browser does not open</w:t>
-      </w:r>
-    </w:p>
-    <w:p>
-      <w:r>
-        <w:rPr>
-          <w:rFonts w:ascii="Calibri" w:hAnsi="Calibri"/>
-        </w:rPr>
-        <w:t>Visit http://localhost:8501 manually.</w:t>
-      </w:r>
-    </w:p>
-    <w:p>
-      <w:pPr>
-        <w:pStyle w:val="Heading2"/>
-        <w:keepNext/>
-      </w:pPr>
-      <w:r>
-        <w:t>Blank Streamlit page</w:t>
-      </w:r>
-    </w:p>
-    <w:p>
-      <w:r>
-        <w:rPr>
-          <w:rFonts w:ascii="Calibri" w:hAnsi="Calibri"/>
-        </w:rPr>
-        <w:t>Hard refresh, inspect the terminal error, confirm project root, and clear only browser cache/session if needed.</w:t>
-      </w:r>
-    </w:p>
-    <w:p>
-      <w:pPr>
-        <w:pStyle w:val="Heading2"/>
-        <w:keepNext/>
-      </w:pPr>
-      <w:r>
-        <w:t>Windows path problem</w:t>
-      </w:r>
-    </w:p>
-    <w:p>
-      <w:r>
-        <w:rPr>
-          <w:rFonts w:ascii="Calibri" w:hAnsi="Calibri"/>
-        </w:rPr>
-        <w:t>Extract to a short local path without OneDrive permission conflicts; do not run directly inside the ZIP.</w:t>
-      </w:r>
-    </w:p>
-    <w:p>
-      <w:pPr>
-        <w:pStyle w:val="Heading2"/>
-        <w:keepNext/>
-      </w:pPr>
-      <w:r>
-        <w:t>PDF has no text</w:t>
-      </w:r>
-    </w:p>
-    <w:p>
-      <w:r>
-        <w:rPr>
-          <w:rFonts w:ascii="Calibri" w:hAnsi="Calibri"/>
-        </w:rPr>
-        <w:t>The PDF is scanned. Apply OCR outside the app, then upload a text-based PDF or TXT.</w:t>
-      </w:r>
-    </w:p>
-    <w:p>
-      <w:pPr>
-        <w:pStyle w:val="Heading1"/>
-        <w:keepNext/>
-      </w:pPr>
-      <w:r>
-        <w:t>19. Beginner demonstration checklist</w:t>
+        <w:t>Completed</w:t>
       </w:r>
     </w:p>
     <w:p>
@@ -2726,10 +1230,7 @@
         <w:pStyle w:val="ListBullet"/>
       </w:pPr>
       <w:r>
-        <w:rPr>
-          <w:rFonts w:ascii="Calibri" w:hAnsi="Calibri"/>
-        </w:rPr>
-        <w:t>News Desk loads without a red error.</w:t>
+        <w:t>Authoritative archive independently verified at the exact path, size, SHA-256, and Git blob.</w:t>
       </w:r>
     </w:p>
     <w:p>
@@ -2737,10 +1238,7 @@
         <w:pStyle w:val="ListBullet"/>
       </w:pPr>
       <w:r>
-        <w:rPr>
-          <w:rFonts w:ascii="Calibri" w:hAnsi="Calibri"/>
-        </w:rPr>
-        <w:t>All six top-navigation destinations open.</w:t>
+        <w:t>PR A merged through protected GitHub rules as PR #44.</w:t>
       </w:r>
     </w:p>
     <w:p>
@@ -2748,10 +1246,17 @@
         <w:pStyle w:val="ListBullet"/>
       </w:pPr>
       <w:r>
+        <w:t xml:space="preserve">PR A squash merge: </w:t>
+      </w:r>
+      <w:r>
         <w:rPr>
-          <w:rFonts w:ascii="Calibri" w:hAnsi="Calibri"/>
+          <w:rFonts w:ascii="Consolas" w:hAnsi="Consolas"/>
+          <w:sz w:val="17"/>
         </w:rPr>
-        <w:t>Desktop and mobile layouts avoid horizontal clipping.</w:t>
+        <w:t>d3e77e6610c4a9c83d9137ca672a9aad4278285f</w:t>
+      </w:r>
+      <w:r>
+        <w:t>.</w:t>
       </w:r>
     </w:p>
     <w:p>
@@ -2759,10 +1264,17 @@
         <w:pStyle w:val="ListBullet"/>
       </w:pPr>
       <w:r>
+        <w:t xml:space="preserve">PR A merged tree: </w:t>
+      </w:r>
+      <w:r>
         <w:rPr>
-          <w:rFonts w:ascii="Calibri" w:hAnsi="Calibri"/>
+          <w:rFonts w:ascii="Consolas" w:hAnsi="Consolas"/>
+          <w:sz w:val="17"/>
         </w:rPr>
-        <w:t>Reliable, misleading and uncertain synthetic samples run.</w:t>
+        <w:t>520bad55ea12f1a8e48ad2e533af26312c62933d</w:t>
+      </w:r>
+      <w:r>
+        <w:t>.</w:t>
       </w:r>
     </w:p>
     <w:p>
@@ -2770,10 +1282,7 @@
         <w:pStyle w:val="ListBullet"/>
       </w:pPr>
       <w:r>
-        <w:rPr>
-          <w:rFonts w:ascii="Calibri" w:hAnsi="Calibri"/>
-        </w:rPr>
-        <w:t>Extractive summary changes with Short/Medium/Detailed.</w:t>
+        <w:t>Synthetic-only model training, bounded selection, calibration, locked evaluation, counterfactual test, shortcut baselines, artifact packaging, and runtime integration completed locally.</w:t>
       </w:r>
     </w:p>
     <w:p>
@@ -2781,7 +1290,17 @@
         <w:pStyle w:val="ListBullet"/>
       </w:pPr>
       <w:r>
-        <w:t>Calibrated probabilities sum to approximately 100%, and the three exact outcome states are reachable.</w:t>
+        <w:t xml:space="preserve">Model SHA-256: </w:t>
+      </w:r>
+      <w:r>
+        <w:rPr>
+          <w:rFonts w:ascii="Consolas" w:hAnsi="Consolas"/>
+          <w:sz w:val="17"/>
+        </w:rPr>
+        <w:t>c1ad8c044cd95bc7bf25a94716010ddbe21fbae2ec92a0c1cefb01f5c3c979c6</w:t>
+      </w:r>
+      <w:r>
+        <w:t>.</w:t>
       </w:r>
     </w:p>
     <w:p>
@@ -2789,10 +1308,25 @@
         <w:pStyle w:val="ListBullet"/>
       </w:pPr>
       <w:r>
+        <w:t xml:space="preserve">Calibration SHA-256: </w:t>
+      </w:r>
+      <w:r>
         <w:rPr>
-          <w:rFonts w:ascii="Calibri" w:hAnsi="Calibri"/>
+          <w:rFonts w:ascii="Consolas" w:hAnsi="Consolas"/>
+          <w:sz w:val="17"/>
         </w:rPr>
-        <w:t>The disclaimer is visible.</w:t>
+        <w:t>adcf03a860ef8fb41058b3a4dcc80351dbd02e05f81e0fc1e7f971624af6ab77</w:t>
+      </w:r>
+      <w:r>
+        <w:t>.</w:t>
+      </w:r>
+    </w:p>
+    <w:p>
+      <w:pPr>
+        <w:pStyle w:val="Heading2"/>
+      </w:pPr>
+      <w:r>
+        <w:t>Pending at this checkpoint</w:t>
       </w:r>
     </w:p>
     <w:p>
@@ -2800,10 +1334,7 @@
         <w:pStyle w:val="ListBullet"/>
       </w:pPr>
       <w:r>
-        <w:rPr>
-          <w:rFonts w:ascii="Calibri" w:hAnsi="Calibri"/>
-        </w:rPr>
-        <w:t>JSON and PDF downloads open.</w:t>
+        <w:t>Complete local validation after documentation reconciliation.</w:t>
       </w:r>
     </w:p>
     <w:p>
@@ -2811,10 +1342,7 @@
         <w:pStyle w:val="ListBullet"/>
       </w:pPr>
       <w:r>
-        <w:rPr>
-          <w:rFonts w:ascii="Calibri" w:hAnsi="Calibri"/>
-        </w:rPr>
-        <w:t>Editorial Archive shows one row per unique article.</w:t>
+        <w:t>Open, validate, and protected-merge PR B.</w:t>
       </w:r>
     </w:p>
     <w:p>
@@ -2822,10 +1350,7 @@
         <w:pStyle w:val="ListBullet"/>
       </w:pPr>
       <w:r>
-        <w:rPr>
-          <w:rFonts w:ascii="Calibri" w:hAnsi="Calibri"/>
-        </w:rPr>
-        <w:t>Model Accountability and Dataset Analysis use real saved charts.</w:t>
+        <w:t>Verify exact-new-main CI and CodeQL.</w:t>
       </w:r>
     </w:p>
     <w:p>
@@ -2833,52 +1358,439 @@
         <w:pStyle w:val="ListBullet"/>
       </w:pPr>
       <w:r>
-        <w:t>python -m pytest -q -m "not private_model" passes 144 public tests; exactly four private-model tests are deselected.</w:t>
+        <w:t xml:space="preserve">Deploy main to authenticated Streamlit Community Cloud workspace </w:t>
+      </w:r>
+      <w:r>
+        <w:rPr>
+          <w:rFonts w:ascii="Consolas" w:hAnsi="Consolas"/>
+          <w:sz w:val="17"/>
+        </w:rPr>
+        <w:t>devengaikwad</w:t>
+      </w:r>
+      <w:r>
+        <w:t>.</w:t>
       </w:r>
     </w:p>
     <w:p>
       <w:pPr>
-        <w:pStyle w:val="Heading1"/>
-        <w:keepNext/>
+        <w:pStyle w:val="ListBullet"/>
       </w:pPr>
       <w:r>
-        <w:t>20. Exact quick-reference commands</w:t>
+        <w:t>Record the final public URL, deployed commit, and browser smoke-test evidence.</w:t>
+      </w:r>
+    </w:p>
+    <w:p>
+      <w:r>
+        <w:t>No PR B remote mutation had occurred when this checkpoint was written. Six retained Dependabot PRs and the historical release tag remain outside scope.</w:t>
       </w:r>
     </w:p>
     <w:p>
       <w:pPr>
-        <w:pStyle w:val="CodeBlock"/>
-        <w:keepLines/>
-        <w:shd w:fill="EEF3F8"/>
+        <w:sectPr>
+          <w:pgSz w:w="12240" w:h="15840"/>
+          <w:pgMar w:top="979" w:right="1037" w:bottom="936" w:left="1123" w:header="720" w:footer="720" w:gutter="0"/>
+          <w:cols w:space="720"/>
+          <w:docGrid w:linePitch="360"/>
+        </w:sectPr>
+      </w:pPr>
+    </w:p>
+    <w:p>
+      <w:pPr>
+        <w:pStyle w:val="Heading1"/>
       </w:pPr>
       <w:r>
-        <w:rPr>
-          <w:rFonts w:ascii="Consolas" w:hAnsi="Consolas"/>
-          <w:color w:val="2A241F"/>
-          <w:sz w:val="17"/>
-        </w:rPr>
-        <w:t>py -3.12 -m venv .venv</w:t>
-        <w:br/>
-        <w:t>.venv\Scripts\activate</w:t>
-        <w:br/>
-        <w:t>python -m pip install --upgrade pip</w:t>
-        <w:br/>
-        <w:t>pip install -r requirements-lite.txt</w:t>
-        <w:br/>
-        <w:t>python -m pytest -q -m "not private_model"</w:t>
-        <w:br/>
-        <w:t>python -m streamlit run app.py</w:t>
+        <w:t>Deployment Evidence Values</w:t>
+      </w:r>
+    </w:p>
+    <w:p>
+      <w:r>
+        <w:t>This file is updated in place as externally assigned values become available.</w:t>
+      </w:r>
+    </w:p>
+    <w:tbl>
+      <w:tblPr>
+        <w:tblStyle w:val="TableGrid"/>
+        <w:tblW w:type="auto" w:w="0"/>
+        <w:tblLook w:firstColumn="1" w:firstRow="1" w:lastColumn="0" w:lastRow="0" w:noHBand="0" w:noVBand="1" w:val="04A0"/>
+      </w:tblPr>
+      <w:tblGrid>
+        <w:gridCol w:w="5040"/>
+        <w:gridCol w:w="5040"/>
+      </w:tblGrid>
+      <w:tr>
+        <w:tc>
+          <w:tcPr>
+            <w:tcW w:type="dxa" w:w="5040"/>
+            <w:shd w:fill="EAE4D8"/>
+          </w:tcPr>
+          <w:p>
+            <w:r>
+              <w:rPr>
+                <w:rFonts w:ascii="Calibri" w:hAnsi="Calibri"/>
+                <w:b/>
+                <w:sz w:val="17"/>
+              </w:rPr>
+              <w:t>Value</w:t>
+            </w:r>
+          </w:p>
+        </w:tc>
+        <w:tc>
+          <w:tcPr>
+            <w:tcW w:type="dxa" w:w="5040"/>
+            <w:shd w:fill="EAE4D8"/>
+          </w:tcPr>
+          <w:p>
+            <w:r>
+              <w:rPr>
+                <w:rFonts w:ascii="Calibri" w:hAnsi="Calibri"/>
+                <w:b/>
+                <w:sz w:val="17"/>
+              </w:rPr>
+              <w:t>Current status</w:t>
+            </w:r>
+          </w:p>
+        </w:tc>
+      </w:tr>
+      <w:tr>
+        <w:tc>
+          <w:tcPr>
+            <w:tcW w:type="dxa" w:w="5040"/>
+          </w:tcPr>
+          <w:p>
+            <w:r>
+              <w:rPr>
+                <w:rFonts w:ascii="Calibri" w:hAnsi="Calibri"/>
+                <w:sz w:val="17"/>
+              </w:rPr>
+              <w:t>Repository</w:t>
+            </w:r>
+          </w:p>
+        </w:tc>
+        <w:tc>
+          <w:tcPr>
+            <w:tcW w:type="dxa" w:w="5040"/>
+          </w:tcPr>
+          <w:p>
+            <w:r>
+              <w:rPr>
+                <w:rFonts w:ascii="Calibri" w:hAnsi="Calibri"/>
+                <w:sz w:val="17"/>
+              </w:rPr>
+              <w:t>`https://github.com/DevenGaikwad/NewsLens-AI`</w:t>
+            </w:r>
+          </w:p>
+        </w:tc>
+      </w:tr>
+      <w:tr>
+        <w:tc>
+          <w:tcPr>
+            <w:tcW w:type="dxa" w:w="5040"/>
+          </w:tcPr>
+          <w:p>
+            <w:r>
+              <w:rPr>
+                <w:rFonts w:ascii="Calibri" w:hAnsi="Calibri"/>
+                <w:sz w:val="17"/>
+              </w:rPr>
+              <w:t>Dataset PR</w:t>
+            </w:r>
+          </w:p>
+        </w:tc>
+        <w:tc>
+          <w:tcPr>
+            <w:tcW w:type="dxa" w:w="5040"/>
+          </w:tcPr>
+          <w:p>
+            <w:r>
+              <w:rPr>
+                <w:rFonts w:ascii="Calibri" w:hAnsi="Calibri"/>
+                <w:sz w:val="17"/>
+              </w:rPr>
+              <w:t>#44, merged</w:t>
+            </w:r>
+          </w:p>
+        </w:tc>
+      </w:tr>
+      <w:tr>
+        <w:tc>
+          <w:tcPr>
+            <w:tcW w:type="dxa" w:w="5040"/>
+          </w:tcPr>
+          <w:p>
+            <w:r>
+              <w:rPr>
+                <w:rFonts w:ascii="Calibri" w:hAnsi="Calibri"/>
+                <w:sz w:val="17"/>
+              </w:rPr>
+              <w:t>Dataset merge commit</w:t>
+            </w:r>
+          </w:p>
+        </w:tc>
+        <w:tc>
+          <w:tcPr>
+            <w:tcW w:type="dxa" w:w="5040"/>
+          </w:tcPr>
+          <w:p>
+            <w:r>
+              <w:rPr>
+                <w:rFonts w:ascii="Calibri" w:hAnsi="Calibri"/>
+                <w:sz w:val="17"/>
+              </w:rPr>
+              <w:t>`d3e77e6610c4a9c83d9137ca672a9aad4278285f`</w:t>
+            </w:r>
+          </w:p>
+        </w:tc>
+      </w:tr>
+      <w:tr>
+        <w:tc>
+          <w:tcPr>
+            <w:tcW w:type="dxa" w:w="5040"/>
+          </w:tcPr>
+          <w:p>
+            <w:r>
+              <w:rPr>
+                <w:rFonts w:ascii="Calibri" w:hAnsi="Calibri"/>
+                <w:sz w:val="17"/>
+              </w:rPr>
+              <w:t>Model PR</w:t>
+            </w:r>
+          </w:p>
+        </w:tc>
+        <w:tc>
+          <w:tcPr>
+            <w:tcW w:type="dxa" w:w="5040"/>
+          </w:tcPr>
+          <w:p>
+            <w:r>
+              <w:rPr>
+                <w:rFonts w:ascii="Calibri" w:hAnsi="Calibri"/>
+                <w:sz w:val="17"/>
+              </w:rPr>
+              <w:t>Pending protected PR B</w:t>
+            </w:r>
+          </w:p>
+        </w:tc>
+      </w:tr>
+      <w:tr>
+        <w:tc>
+          <w:tcPr>
+            <w:tcW w:type="dxa" w:w="5040"/>
+          </w:tcPr>
+          <w:p>
+            <w:r>
+              <w:rPr>
+                <w:rFonts w:ascii="Calibri" w:hAnsi="Calibri"/>
+                <w:sz w:val="17"/>
+              </w:rPr>
+              <w:t>Model PR validated head</w:t>
+            </w:r>
+          </w:p>
+        </w:tc>
+        <w:tc>
+          <w:tcPr>
+            <w:tcW w:type="dxa" w:w="5040"/>
+          </w:tcPr>
+          <w:p>
+            <w:r>
+              <w:rPr>
+                <w:rFonts w:ascii="Calibri" w:hAnsi="Calibri"/>
+                <w:sz w:val="17"/>
+              </w:rPr>
+              <w:t>Pending</w:t>
+            </w:r>
+          </w:p>
+        </w:tc>
+      </w:tr>
+      <w:tr>
+        <w:tc>
+          <w:tcPr>
+            <w:tcW w:type="dxa" w:w="5040"/>
+          </w:tcPr>
+          <w:p>
+            <w:r>
+              <w:rPr>
+                <w:rFonts w:ascii="Calibri" w:hAnsi="Calibri"/>
+                <w:sz w:val="17"/>
+              </w:rPr>
+              <w:t>Model squash merge</w:t>
+            </w:r>
+          </w:p>
+        </w:tc>
+        <w:tc>
+          <w:tcPr>
+            <w:tcW w:type="dxa" w:w="5040"/>
+          </w:tcPr>
+          <w:p>
+            <w:r>
+              <w:rPr>
+                <w:rFonts w:ascii="Calibri" w:hAnsi="Calibri"/>
+                <w:sz w:val="17"/>
+              </w:rPr>
+              <w:t>Pending</w:t>
+            </w:r>
+          </w:p>
+        </w:tc>
+      </w:tr>
+      <w:tr>
+        <w:tc>
+          <w:tcPr>
+            <w:tcW w:type="dxa" w:w="5040"/>
+          </w:tcPr>
+          <w:p>
+            <w:r>
+              <w:rPr>
+                <w:rFonts w:ascii="Calibri" w:hAnsi="Calibri"/>
+                <w:sz w:val="17"/>
+              </w:rPr>
+              <w:t>Exact new-main tree</w:t>
+            </w:r>
+          </w:p>
+        </w:tc>
+        <w:tc>
+          <w:tcPr>
+            <w:tcW w:type="dxa" w:w="5040"/>
+          </w:tcPr>
+          <w:p>
+            <w:r>
+              <w:rPr>
+                <w:rFonts w:ascii="Calibri" w:hAnsi="Calibri"/>
+                <w:sz w:val="17"/>
+              </w:rPr>
+              <w:t>Pending</w:t>
+            </w:r>
+          </w:p>
+        </w:tc>
+      </w:tr>
+      <w:tr>
+        <w:tc>
+          <w:tcPr>
+            <w:tcW w:type="dxa" w:w="5040"/>
+          </w:tcPr>
+          <w:p>
+            <w:r>
+              <w:rPr>
+                <w:rFonts w:ascii="Calibri" w:hAnsi="Calibri"/>
+                <w:sz w:val="17"/>
+              </w:rPr>
+              <w:t>Streamlit workspace</w:t>
+            </w:r>
+          </w:p>
+        </w:tc>
+        <w:tc>
+          <w:tcPr>
+            <w:tcW w:type="dxa" w:w="5040"/>
+          </w:tcPr>
+          <w:p>
+            <w:r>
+              <w:rPr>
+                <w:rFonts w:ascii="Calibri" w:hAnsi="Calibri"/>
+                <w:sz w:val="17"/>
+              </w:rPr>
+              <w:t>`devengaikwad`</w:t>
+            </w:r>
+          </w:p>
+        </w:tc>
+      </w:tr>
+      <w:tr>
+        <w:tc>
+          <w:tcPr>
+            <w:tcW w:type="dxa" w:w="5040"/>
+          </w:tcPr>
+          <w:p>
+            <w:r>
+              <w:rPr>
+                <w:rFonts w:ascii="Calibri" w:hAnsi="Calibri"/>
+                <w:sz w:val="17"/>
+              </w:rPr>
+              <w:t>Streamlit URL</w:t>
+            </w:r>
+          </w:p>
+        </w:tc>
+        <w:tc>
+          <w:tcPr>
+            <w:tcW w:type="dxa" w:w="5040"/>
+          </w:tcPr>
+          <w:p>
+            <w:r>
+              <w:rPr>
+                <w:rFonts w:ascii="Calibri" w:hAnsi="Calibri"/>
+                <w:sz w:val="17"/>
+              </w:rPr>
+              <w:t>Pending deployment</w:t>
+            </w:r>
+          </w:p>
+        </w:tc>
+      </w:tr>
+      <w:tr>
+        <w:tc>
+          <w:tcPr>
+            <w:tcW w:type="dxa" w:w="5040"/>
+          </w:tcPr>
+          <w:p>
+            <w:r>
+              <w:rPr>
+                <w:rFonts w:ascii="Calibri" w:hAnsi="Calibri"/>
+                <w:sz w:val="17"/>
+              </w:rPr>
+              <w:t>Deployed main commit</w:t>
+            </w:r>
+          </w:p>
+        </w:tc>
+        <w:tc>
+          <w:tcPr>
+            <w:tcW w:type="dxa" w:w="5040"/>
+          </w:tcPr>
+          <w:p>
+            <w:r>
+              <w:rPr>
+                <w:rFonts w:ascii="Calibri" w:hAnsi="Calibri"/>
+                <w:sz w:val="17"/>
+              </w:rPr>
+              <w:t>Pending deployment</w:t>
+            </w:r>
+          </w:p>
+        </w:tc>
+      </w:tr>
+      <w:tr>
+        <w:tc>
+          <w:tcPr>
+            <w:tcW w:type="dxa" w:w="5040"/>
+          </w:tcPr>
+          <w:p>
+            <w:r>
+              <w:rPr>
+                <w:rFonts w:ascii="Calibri" w:hAnsi="Calibri"/>
+                <w:sz w:val="17"/>
+              </w:rPr>
+              <w:t>Public smoke test</w:t>
+            </w:r>
+          </w:p>
+        </w:tc>
+        <w:tc>
+          <w:tcPr>
+            <w:tcW w:type="dxa" w:w="5040"/>
+          </w:tcPr>
+          <w:p>
+            <w:r>
+              <w:rPr>
+                <w:rFonts w:ascii="Calibri" w:hAnsi="Calibri"/>
+                <w:sz w:val="17"/>
+              </w:rPr>
+              <w:t>Pending deployment</w:t>
+            </w:r>
+          </w:p>
+        </w:tc>
+      </w:tr>
+    </w:tbl>
+    <w:p/>
+    <w:p>
+      <w:r>
+        <w:t>Pending is evidence discipline, not a claim of completion. Vercel is intentionally not part of the deployment plan.</w:t>
       </w:r>
     </w:p>
     <w:sectPr>
-      <w:headerReference w:type="default" r:id="rId9"/>
-      <w:footerReference w:type="default" r:id="rId10"/>
-      <w:headerReference w:type="first" r:id="rId15"/>
-      <w:footerReference w:type="first" r:id="rId16"/>
-      <w:headerReference w:type="even" r:id="rId17"/>
-      <w:footerReference w:type="even" r:id="rId18"/>
       <w:pgSz w:w="12240" w:h="15840"/>
-      <w:pgMar w:top="1440" w:right="1440" w:bottom="1440" w:left="1440" w:header="708" w:footer="708" w:gutter="0"/>
+      <w:pgMar w:top="979" w:right="1037" w:bottom="936" w:left="1123" w:header="720" w:footer="720" w:gutter="0"/>
       <w:cols w:space="720"/>
       <w:docGrid w:linePitch="360"/>
     </w:sectPr>
@@ -2891,69 +1803,21 @@
   <w:p>
     <w:pPr>
       <w:pStyle w:val="Footer"/>
-      <w:spacing w:before="0"/>
       <w:jc w:val="center"/>
     </w:pPr>
-    <w:r/>
     <w:r>
       <w:rPr>
         <w:rFonts w:ascii="Calibri" w:hAnsi="Calibri"/>
-        <w:color w:val="6F685F"/>
+        <w:color w:val="77736C"/>
         <w:sz w:val="16"/>
       </w:rPr>
-      <w:t>NewsLens AI · Designed and developed by Deven Gaikwad</w:t>
-    </w:r>
-    <w:r>
-      <w:rPr>
-        <w:rFonts w:ascii="Calibri" w:hAnsi="Calibri"/>
-        <w:color w:val="6F685F"/>
-        <w:sz w:val="17"/>
-      </w:rPr>
-      <w:br/>
-      <w:t xml:space="preserve">© 2026 Deven Gaikwad. All rights reserved. · Page </w:t>
+      <w:t xml:space="preserve">© 2026 Deven Sachin Gaikwad · Phase 5S · Page </w:t>
     </w:r>
     <w:r>
       <w:fldChar w:fldCharType="begin"/>
       <w:instrText xml:space="preserve">PAGE</w:instrText>
-      <w:fldChar w:fldCharType="separate"/>
-      <w:t>1</w:t>
       <w:fldChar w:fldCharType="end"/>
     </w:r>
-    <w:r>
-      <w:rPr>
-        <w:rFonts w:ascii="Calibri" w:hAnsi="Calibri"/>
-        <w:color w:val="6F685F"/>
-        <w:sz w:val="17"/>
-      </w:rPr>
-      <w:t xml:space="preserve"> of </w:t>
-    </w:r>
-    <w:r>
-      <w:fldChar w:fldCharType="begin"/>
-      <w:instrText xml:space="preserve">NUMPAGES</w:instrText>
-      <w:fldChar w:fldCharType="separate"/>
-      <w:t>1</w:t>
-      <w:fldChar w:fldCharType="end"/>
-    </w:r>
-  </w:p>
-</w:ftr>
-</file>
-
-<file path=word/footer2.xml><?xml version="1.0" encoding="utf-8"?>
-<w:ftr xmlns:m="http://schemas.openxmlformats.org/officeDocument/2006/math" xmlns:mc="http://schemas.openxmlformats.org/markup-compatibility/2006" xmlns:mo="http://schemas.microsoft.com/office/mac/office/2008/main" xmlns:mv="urn:schemas-microsoft-com:mac:vml" xmlns:o="urn:schemas-microsoft-com:office:office" xmlns:r="http://schemas.openxmlformats.org/officeDocument/2006/relationships" xmlns:v="urn:schemas-microsoft-com:vml" xmlns:w10="urn:schemas-microsoft-com:office:word" xmlns:w14="http://schemas.microsoft.com/office/word/2010/wordml" xmlns:w="http://schemas.openxmlformats.org/wordprocessingml/2006/main" xmlns:wne="http://schemas.microsoft.com/office/word/2006/wordml" xmlns:wp14="http://schemas.microsoft.com/office/word/2010/wordprocessingDrawing" xmlns:wp="http://schemas.openxmlformats.org/drawingml/2006/wordprocessingDrawing" xmlns:wpc="http://schemas.microsoft.com/office/word/2010/wordprocessingCanvas" xmlns:wpg="http://schemas.microsoft.com/office/word/2010/wordprocessingGroup" xmlns:wpi="http://schemas.microsoft.com/office/word/2010/wordprocessingInk" xmlns:wps="http://schemas.microsoft.com/office/word/2010/wordprocessingShape" mc:Ignorable="w14 wp14">
-  <w:p>
-    <w:pPr>
-      <w:pStyle w:val="Footer"/>
-    </w:pPr>
-  </w:p>
-</w:ftr>
-</file>
-
-<file path=word/footer3.xml><?xml version="1.0" encoding="utf-8"?>
-<w:ftr xmlns:m="http://schemas.openxmlformats.org/officeDocument/2006/math" xmlns:mc="http://schemas.openxmlformats.org/markup-compatibility/2006" xmlns:mo="http://schemas.microsoft.com/office/mac/office/2008/main" xmlns:mv="urn:schemas-microsoft-com:mac:vml" xmlns:o="urn:schemas-microsoft-com:office:office" xmlns:r="http://schemas.openxmlformats.org/officeDocument/2006/relationships" xmlns:v="urn:schemas-microsoft-com:vml" xmlns:w10="urn:schemas-microsoft-com:office:word" xmlns:w14="http://schemas.microsoft.com/office/word/2010/wordml" xmlns:w="http://schemas.openxmlformats.org/wordprocessingml/2006/main" xmlns:wne="http://schemas.microsoft.com/office/word/2006/wordml" xmlns:wp14="http://schemas.microsoft.com/office/word/2010/wordprocessingDrawing" xmlns:wp="http://schemas.openxmlformats.org/drawingml/2006/wordprocessingDrawing" xmlns:wpc="http://schemas.microsoft.com/office/word/2010/wordprocessingCanvas" xmlns:wpg="http://schemas.microsoft.com/office/word/2010/wordprocessingGroup" xmlns:wpi="http://schemas.microsoft.com/office/word/2010/wordprocessingInk" xmlns:wps="http://schemas.microsoft.com/office/word/2010/wordprocessingShape" mc:Ignorable="w14 wp14">
-  <w:p>
-    <w:pPr>
-      <w:pStyle w:val="Footer"/>
-    </w:pPr>
   </w:p>
 </w:ftr>
 </file>
@@ -2963,53 +1827,17 @@
   <w:p>
     <w:pPr>
       <w:pStyle w:val="Header"/>
-      <w:tabs>
-        <w:tab w:pos="9360" w:val="right"/>
-      </w:tabs>
-      <w:spacing w:after="0"/>
-      <w:jc w:val="left"/>
-    </w:pPr>
-    <w:r/>
+      <w:jc w:val="right"/>
+    </w:pPr>
     <w:r>
       <w:rPr>
         <w:rFonts w:ascii="Calibri" w:hAnsi="Calibri"/>
         <w:b/>
-        <w:color w:val="6F685F"/>
-        <w:sz w:val="17"/>
-      </w:rPr>
-      <w:t>NewsLens AI · Setup and Run Guide</w:t>
+        <w:color w:val="77736C"/>
+        <w:sz w:val="16"/>
+      </w:rPr>
+      <w:t>NEWSLENS AI  |  NEWSLENS AI SETUP AND RUN GUIDE</w:t>
     </w:r>
-    <w:r>
-      <w:tab/>
-    </w:r>
-    <w:r>
-      <w:rPr>
-        <w:rFonts w:ascii="Calibri" w:hAnsi="Calibri"/>
-        <w:color w:val="496454"/>
-        <w:sz w:val="17"/>
-      </w:rPr>
-      <w:t>DEVEN GAIKWAD · PROPRIETARY DOCUMENTATION</w:t>
-    </w:r>
-  </w:p>
-</w:hdr>
-</file>
-
-<file path=word/header2.xml><?xml version="1.0" encoding="utf-8"?>
-<w:hdr xmlns:m="http://schemas.openxmlformats.org/officeDocument/2006/math" xmlns:mc="http://schemas.openxmlformats.org/markup-compatibility/2006" xmlns:mo="http://schemas.microsoft.com/office/mac/office/2008/main" xmlns:mv="urn:schemas-microsoft-com:mac:vml" xmlns:o="urn:schemas-microsoft-com:office:office" xmlns:r="http://schemas.openxmlformats.org/officeDocument/2006/relationships" xmlns:v="urn:schemas-microsoft-com:vml" xmlns:w10="urn:schemas-microsoft-com:office:word" xmlns:w14="http://schemas.microsoft.com/office/word/2010/wordml" xmlns:w="http://schemas.openxmlformats.org/wordprocessingml/2006/main" xmlns:wne="http://schemas.microsoft.com/office/word/2006/wordml" xmlns:wp14="http://schemas.microsoft.com/office/word/2010/wordprocessingDrawing" xmlns:wp="http://schemas.openxmlformats.org/drawingml/2006/wordprocessingDrawing" xmlns:wpc="http://schemas.microsoft.com/office/word/2010/wordprocessingCanvas" xmlns:wpg="http://schemas.microsoft.com/office/word/2010/wordprocessingGroup" xmlns:wpi="http://schemas.microsoft.com/office/word/2010/wordprocessingInk" xmlns:wps="http://schemas.microsoft.com/office/word/2010/wordprocessingShape" mc:Ignorable="w14 wp14">
-  <w:p>
-    <w:pPr>
-      <w:pStyle w:val="Header"/>
-    </w:pPr>
-  </w:p>
-</w:hdr>
-</file>
-
-<file path=word/header3.xml><?xml version="1.0" encoding="utf-8"?>
-<w:hdr xmlns:m="http://schemas.openxmlformats.org/officeDocument/2006/math" xmlns:mc="http://schemas.openxmlformats.org/markup-compatibility/2006" xmlns:mo="http://schemas.microsoft.com/office/mac/office/2008/main" xmlns:mv="urn:schemas-microsoft-com:mac:vml" xmlns:o="urn:schemas-microsoft-com:office:office" xmlns:r="http://schemas.openxmlformats.org/officeDocument/2006/relationships" xmlns:v="urn:schemas-microsoft-com:vml" xmlns:w10="urn:schemas-microsoft-com:office:word" xmlns:w14="http://schemas.microsoft.com/office/word/2010/wordml" xmlns:w="http://schemas.openxmlformats.org/wordprocessingml/2006/main" xmlns:wne="http://schemas.microsoft.com/office/word/2006/wordml" xmlns:wp14="http://schemas.microsoft.com/office/word/2010/wordprocessingDrawing" xmlns:wp="http://schemas.openxmlformats.org/drawingml/2006/wordprocessingDrawing" xmlns:wpc="http://schemas.microsoft.com/office/word/2010/wordprocessingCanvas" xmlns:wpg="http://schemas.microsoft.com/office/word/2010/wordprocessingGroup" xmlns:wpi="http://schemas.microsoft.com/office/word/2010/wordprocessingInk" xmlns:wps="http://schemas.microsoft.com/office/word/2010/wordprocessingShape" mc:Ignorable="w14 wp14">
-  <w:p>
-    <w:pPr>
-      <w:pStyle w:val="Header"/>
-    </w:pPr>
   </w:p>
 </w:hdr>
 </file>
@@ -3378,13 +2206,12 @@
     <w:qFormat/>
     <w:rsid w:val="00FC693F"/>
     <w:pPr>
-      <w:spacing w:before="0" w:after="120" w:line="300" w:lineRule="auto"/>
-      <w:jc w:val="left"/>
+      <w:spacing w:after="100" w:line="259" w:lineRule="auto"/>
     </w:pPr>
     <w:rPr>
       <w:rFonts w:ascii="Calibri" w:hAnsi="Calibri"/>
       <w:color w:val="1A1917"/>
-      <w:sz w:val="22"/>
+      <w:sz w:val="20"/>
     </w:rPr>
   </w:style>
   <w:style w:type="paragraph" w:styleId="Header">
@@ -3442,7 +2269,7 @@
     <w:pPr>
       <w:keepNext/>
       <w:keepLines/>
-      <w:spacing w:before="360" w:after="200"/>
+      <w:spacing w:before="280" w:after="120"/>
       <w:outlineLvl w:val="0"/>
     </w:pPr>
     <w:rPr>
@@ -3450,7 +2277,7 @@
       <w:b/>
       <w:bCs/>
       <w:color w:val="6D5947"/>
-      <w:sz w:val="32"/>
+      <w:sz w:val="36"/>
       <w:szCs w:val="28"/>
     </w:rPr>
   </w:style>
@@ -3466,15 +2293,15 @@
     <w:pPr>
       <w:keepNext/>
       <w:keepLines/>
-      <w:spacing w:before="280" w:after="140"/>
+      <w:spacing w:before="200" w:after="0"/>
       <w:outlineLvl w:val="1"/>
     </w:pPr>
     <w:rPr>
       <w:rFonts w:asciiTheme="majorHAnsi" w:eastAsiaTheme="majorEastAsia" w:hAnsiTheme="majorHAnsi" w:cstheme="majorBidi" w:ascii="Calibri" w:hAnsi="Calibri"/>
       <w:b/>
       <w:bCs/>
-      <w:color w:val="6D5947"/>
-      <w:sz w:val="26"/>
+      <w:color w:val="496454"/>
+      <w:sz w:val="28"/>
       <w:szCs w:val="26"/>
     </w:rPr>
   </w:style>
@@ -3490,15 +2317,15 @@
     <w:pPr>
       <w:keepNext/>
       <w:keepLines/>
-      <w:spacing w:before="200" w:after="100"/>
+      <w:spacing w:before="200" w:after="0"/>
       <w:outlineLvl w:val="2"/>
     </w:pPr>
     <w:rPr>
       <w:rFonts w:asciiTheme="majorHAnsi" w:eastAsiaTheme="majorEastAsia" w:hAnsiTheme="majorHAnsi" w:cstheme="majorBidi" w:ascii="Calibri" w:hAnsi="Calibri"/>
       <w:b/>
       <w:bCs/>
-      <w:color w:val="1F4D78"/>
-      <w:sz w:val="24"/>
+      <w:color w:val="6D5947"/>
+      <w:sz w:val="22"/>
     </w:rPr>
   </w:style>
   <w:style w:type="paragraph" w:styleId="Heading4">
@@ -3736,11 +2563,12 @@
       <w:contextualSpacing/>
     </w:pPr>
     <w:rPr>
-      <w:rFonts w:asciiTheme="majorHAnsi" w:eastAsiaTheme="majorEastAsia" w:hAnsiTheme="majorHAnsi" w:cstheme="majorBidi"/>
-      <w:color w:val="17365D" w:themeColor="text2" w:themeShade="BF"/>
+      <w:rFonts w:asciiTheme="majorHAnsi" w:eastAsiaTheme="majorEastAsia" w:hAnsiTheme="majorHAnsi" w:cstheme="majorBidi" w:ascii="Calibri" w:hAnsi="Calibri"/>
+      <w:b/>
+      <w:color w:val="6D5947"/>
       <w:spacing w:val="5"/>
       <w:kern w:val="28"/>
-      <w:sz w:val="52"/>
+      <w:sz w:val="56"/>
       <w:szCs w:val="52"/>
     </w:rPr>
   </w:style>
@@ -3914,14 +2742,8 @@
       <w:numPr>
         <w:numId w:val="1"/>
       </w:numPr>
-      <w:spacing w:after="80" w:line="300" w:lineRule="auto"/>
-      <w:ind w:left="540" w:hanging="271"/>
       <w:contextualSpacing/>
     </w:pPr>
-    <w:rPr>
-      <w:rFonts w:ascii="Calibri" w:hAnsi="Calibri"/>
-      <w:sz w:val="22"/>
-    </w:rPr>
   </w:style>
   <w:style w:type="paragraph" w:styleId="ListBullet2">
     <w:name w:val="List Bullet 2"/>
@@ -3959,14 +2781,8 @@
       <w:numPr>
         <w:numId w:val="5"/>
       </w:numPr>
-      <w:spacing w:after="80" w:line="300" w:lineRule="auto"/>
-      <w:ind w:left="540" w:hanging="271"/>
       <w:contextualSpacing/>
     </w:pPr>
-    <w:rPr>
-      <w:rFonts w:ascii="Calibri" w:hAnsi="Calibri"/>
-      <w:sz w:val="22"/>
-    </w:rPr>
   </w:style>
   <w:style w:type="paragraph" w:styleId="ListNumber2">
     <w:name w:val="List Number 2"/>
@@ -4187,15 +3003,12 @@
     <w:qFormat/>
     <w:rsid w:val="00FC693F"/>
     <w:pPr>
-      <w:spacing w:line="240" w:lineRule="auto" w:before="80" w:after="160"/>
-      <w:jc w:val="center"/>
+      <w:spacing w:line="240" w:lineRule="auto"/>
     </w:pPr>
     <w:rPr>
-      <w:rFonts w:ascii="Calibri" w:hAnsi="Calibri"/>
       <w:b/>
       <w:bCs/>
-      <w:i/>
-      <w:color w:val="6F685F"/>
+      <w:color w:val="4F81BD" w:themeColor="accent1"/>
       <w:sz w:val="18"/>
       <w:szCs w:val="18"/>
     </w:rPr>
@@ -15084,18 +13897,6 @@
         <w:shd w:val="clear" w:color="auto" w:fill="FBCAA2" w:themeFill="accent6" w:themeFillTint="7F"/>
       </w:tcPr>
     </w:tblStylePr>
-  </w:style>
-  <w:style w:type="paragraph" w:customStyle="1" w:styleId="CodeBlock">
-    <w:name w:val="Code Block"/>
-    <w:pPr>
-      <w:spacing w:before="80" w:after="140" w:line="240" w:lineRule="auto"/>
-      <w:ind w:left="259" w:right="259"/>
-    </w:pPr>
-    <w:rPr>
-      <w:rFonts w:ascii="Consolas" w:hAnsi="Consolas"/>
-      <w:color w:val="2A241F"/>
-      <w:sz w:val="17"/>
-    </w:rPr>
   </w:style>
 </w:styles>
 </file>

</xml_diff>